<commit_message>
Add METI press release details to reference list
Co-Authored-By: Claude Opus 5.5 <noreply@anthropic.com>
Claude-Session: https://claude.ai/code/session_01D75XZCNXPUXwLshn5jBJpA
</commit_message>
<xml_diff>
--- a/thesis/修士論文_第1章_第2章_目次・参考文献付き.docx
+++ b/thesis/修士論文_第1章_第2章_目次・参考文献付き.docx
@@ -8272,7 +8272,7 @@
           <w:b w:val="0"/>
           <w:sz w:val="24"/>
         </w:rPr>
-        <w:t>経済産業省（2025）『令和6年度 電子商取引に関する市場調査 報告書』。</w:t>
+        <w:t>経済産業省（2025）「令和6年度 電子商取引に関する市場調査の結果を取りまとめました」ニュースリリース，2025年8月26日，https://www.meti.go.jp/press/2025/08/20250826005/20250826005.html（2026年10月18日閲覧）。</w:t>
       </w:r>
       <w:r>
         <w:rPr>
@@ -8281,7 +8281,7 @@
           <w:sz w:val="24"/>
           <w:highlight w:val="yellow"/>
         </w:rPr>
-        <w:t>【要確認：正式名称・URL・閲覧日】</w:t>
+        <w:t>【要確認：リリースのタイトル表記】</w:t>
       </w:r>
     </w:p>
     <w:p>

</xml_diff>

<commit_message>
Fix METI press release title in reference list
Co-Authored-By: Claude Opus 5.5 <noreply@anthropic.com>
Claude-Session: https://claude.ai/code/session_01D75XZCNXPUXwLshn5jBJpA
</commit_message>
<xml_diff>
--- a/thesis/修士論文_第1章_第2章_目次・参考文献付き.docx
+++ b/thesis/修士論文_第1章_第2章_目次・参考文献付き.docx
@@ -8272,16 +8272,7 @@
           <w:b w:val="0"/>
           <w:sz w:val="24"/>
         </w:rPr>
-        <w:t>経済産業省（2025）「令和6年度 電子商取引に関する市場調査の結果を取りまとめました」ニュースリリース，2025年8月26日，https://www.meti.go.jp/press/2025/08/20250826005/20250826005.html（2026年10月18日閲覧）。</w:t>
-      </w:r>
-      <w:r>
-        <w:rPr>
-          <w:rFonts w:ascii="Century" w:hAnsi="Century" w:eastAsia="ＭＳ 明朝"/>
-          <w:b w:val="0"/>
-          <w:sz w:val="24"/>
-          <w:highlight w:val="yellow"/>
-        </w:rPr>
-        <w:t>【要確認：リリースのタイトル表記】</w:t>
+        <w:t>経済産業省（2025）「令和6年度電子商取引に関する市場調査の結果を取りまとめました」ニュースリリース，2025年8月26日，https://www.meti.go.jp/press/2025/08/20250826005/20250826005.html（2026年10月18日閲覧）。</w:t>
       </w:r>
     </w:p>
     <w:p>

</xml_diff>

<commit_message>
Restore page numbers and remove secondary citations in Chapters 1-2
Co-Authored-By: Claude Opus 5.5 <noreply@anthropic.com>
Claude-Session: https://claude.ai/code/session_01D75XZCNXPUXwLshn5jBJpA
</commit_message>
<xml_diff>
--- a/thesis/修士論文_第1章_第2章_目次・参考文献付き.docx
+++ b/thesis/修士論文_第1章_第2章_目次・参考文献付き.docx
@@ -1165,424 +1165,7 @@
           <w:szCs w:val="28"/>
           <w:lang w:eastAsia="ja-JP"/>
         </w:rPr>
-        <w:t>EC</w:t>
-      </w:r>
-      <w:r>
-        <w:rPr>
-          <w:rFonts w:ascii="Century" w:hAnsi="Century" w:eastAsia="ＭＳ 明朝"/>
-          <w:sz w:val="24"/>
-          <w:szCs w:val="28"/>
-          <w:lang w:eastAsia="ja-JP"/>
-        </w:rPr>
-        <w:t>では、消費者が実店舗に来店して商品を持ち帰る従来の小売業とは異なり、注文を受けた商品を事業者が顧客の手元まで届ける必要がある。そのため、受注から配達までの物流業務を一体的に担うフルフィルメントが、</w:t>
-      </w:r>
-      <w:r>
-        <w:rPr>
-          <w:rFonts w:ascii="Century" w:hAnsi="Century" w:eastAsia="ＭＳ 明朝"/>
-          <w:sz w:val="24"/>
-          <w:szCs w:val="28"/>
-          <w:lang w:eastAsia="ja-JP"/>
-        </w:rPr>
-        <w:t>EC</w:t>
-      </w:r>
-      <w:r>
-        <w:rPr>
-          <w:rFonts w:ascii="Century" w:hAnsi="Century" w:eastAsia="ＭＳ 明朝"/>
-          <w:sz w:val="24"/>
-          <w:szCs w:val="28"/>
-          <w:lang w:eastAsia="ja-JP"/>
-        </w:rPr>
-        <w:t>企業にとって重要なオペレーションとなる。</w:t>
-      </w:r>
-      <w:r>
-        <w:rPr>
-          <w:rFonts w:ascii="Century" w:hAnsi="Century" w:eastAsia="ＭＳ 明朝"/>
-          <w:sz w:val="24"/>
-          <w:szCs w:val="28"/>
-          <w:lang w:eastAsia="ja-JP"/>
-        </w:rPr>
-        <w:t>丁（2023）</w:t>
-      </w:r>
-      <w:r>
-        <w:rPr>
-          <w:rFonts w:ascii="Century" w:hAnsi="Century" w:eastAsia="ＭＳ 明朝"/>
-          <w:sz w:val="24"/>
-          <w:szCs w:val="28"/>
-          <w:lang w:eastAsia="ja-JP"/>
-        </w:rPr>
-      </w:r>
-      <w:r>
-        <w:rPr>
-          <w:rFonts w:ascii="Century" w:hAnsi="Century" w:hint="eastAsia" w:eastAsia="ＭＳ 明朝"/>
-          <w:sz w:val="24"/>
-          <w:szCs w:val="28"/>
-          <w:lang w:eastAsia="ja-JP"/>
-        </w:rPr>
-      </w:r>
-      <w:r>
-        <w:rPr>
-          <w:rFonts w:ascii="Century" w:hAnsi="Century" w:hint="eastAsia" w:eastAsia="ＭＳ 明朝"/>
-          <w:sz w:val="24"/>
-          <w:szCs w:val="28"/>
-          <w:lang w:eastAsia="ja-JP"/>
-        </w:rPr>
-      </w:r>
-      <w:r>
-        <w:rPr>
-          <w:rFonts w:ascii="Century" w:hAnsi="Century" w:eastAsia="ＭＳ 明朝"/>
-          <w:sz w:val="24"/>
-          <w:szCs w:val="28"/>
-          <w:lang w:eastAsia="ja-JP"/>
-        </w:rPr>
-      </w:r>
-      <w:r>
-        <w:rPr>
-          <w:rFonts w:ascii="Century" w:hAnsi="Century" w:eastAsia="ＭＳ 明朝"/>
-          <w:sz w:val="24"/>
-          <w:szCs w:val="28"/>
-          <w:lang w:eastAsia="ja-JP"/>
-        </w:rPr>
-        <w:t>は、</w:t>
-      </w:r>
-      <w:r>
-        <w:rPr>
-          <w:rFonts w:ascii="Century" w:hAnsi="Century" w:eastAsia="ＭＳ 明朝"/>
-          <w:sz w:val="24"/>
-          <w:szCs w:val="28"/>
-          <w:lang w:eastAsia="ja-JP"/>
-        </w:rPr>
-        <w:t xml:space="preserve">EC </w:t>
-      </w:r>
-      <w:r>
-        <w:rPr>
-          <w:rFonts w:ascii="Century" w:hAnsi="Century" w:eastAsia="ＭＳ 明朝"/>
-          <w:sz w:val="24"/>
-          <w:szCs w:val="28"/>
-          <w:lang w:eastAsia="ja-JP"/>
-        </w:rPr>
-        <w:t>におけるフルフィルメントの業務範囲は</w:t>
-      </w:r>
-      <w:r>
-        <w:rPr>
-          <w:rFonts w:hint="eastAsia" w:ascii="Century" w:hAnsi="Century" w:eastAsia="ＭＳ 明朝"/>
-          <w:sz w:val="24"/>
-          <w:szCs w:val="28"/>
-          <w:lang w:eastAsia="ja-JP"/>
-        </w:rPr>
-        <w:t>、</w:t>
-      </w:r>
-      <w:r>
-        <w:rPr>
-          <w:rFonts w:ascii="Century" w:hAnsi="Century" w:eastAsia="ＭＳ 明朝"/>
-          <w:sz w:val="24"/>
-          <w:szCs w:val="28"/>
-          <w:lang w:eastAsia="ja-JP"/>
-        </w:rPr>
-        <w:t>「検品</w:t>
-      </w:r>
-      <w:r>
-        <w:rPr>
-          <w:rFonts w:hint="eastAsia" w:ascii="Century" w:hAnsi="Century" w:eastAsia="ＭＳ 明朝"/>
-          <w:sz w:val="24"/>
-          <w:szCs w:val="28"/>
-          <w:lang w:eastAsia="ja-JP"/>
-        </w:rPr>
-        <w:t>、</w:t>
-      </w:r>
-      <w:r>
-        <w:rPr>
-          <w:rFonts w:ascii="Century" w:hAnsi="Century" w:eastAsia="ＭＳ 明朝"/>
-          <w:sz w:val="24"/>
-          <w:szCs w:val="28"/>
-          <w:lang w:eastAsia="ja-JP"/>
-        </w:rPr>
-        <w:t>在庫管理</w:t>
-      </w:r>
-      <w:r>
-        <w:rPr>
-          <w:rFonts w:hint="eastAsia" w:ascii="Century" w:hAnsi="Century" w:eastAsia="ＭＳ 明朝"/>
-          <w:sz w:val="24"/>
-          <w:szCs w:val="28"/>
-          <w:lang w:eastAsia="ja-JP"/>
-        </w:rPr>
-        <w:t>、</w:t>
-      </w:r>
-      <w:r>
-        <w:rPr>
-          <w:rFonts w:ascii="Century" w:hAnsi="Century" w:eastAsia="ＭＳ 明朝"/>
-          <w:sz w:val="24"/>
-          <w:szCs w:val="28"/>
-          <w:lang w:eastAsia="ja-JP"/>
-        </w:rPr>
-        <w:t>商品保管」などといった</w:t>
-      </w:r>
-      <w:r>
-        <w:rPr>
-          <w:rFonts w:ascii="Century" w:hAnsi="Century" w:eastAsia="ＭＳ 明朝"/>
-          <w:sz w:val="24"/>
-          <w:szCs w:val="28"/>
-          <w:lang w:eastAsia="ja-JP"/>
-        </w:rPr>
-        <w:t xml:space="preserve"> Inbound operations</w:t>
-      </w:r>
-      <w:r>
-        <w:rPr>
-          <w:rFonts w:hint="eastAsia" w:ascii="Century" w:hAnsi="Century" w:eastAsia="ＭＳ 明朝"/>
-          <w:sz w:val="24"/>
-          <w:szCs w:val="28"/>
-          <w:lang w:eastAsia="ja-JP"/>
-        </w:rPr>
-        <w:t>、</w:t>
-      </w:r>
-      <w:r>
-        <w:rPr>
-          <w:rFonts w:ascii="Century" w:hAnsi="Century" w:eastAsia="ＭＳ 明朝"/>
-          <w:sz w:val="24"/>
-          <w:szCs w:val="28"/>
-          <w:lang w:eastAsia="ja-JP"/>
-        </w:rPr>
-        <w:t>および</w:t>
-      </w:r>
-      <w:r>
-        <w:rPr>
-          <w:rFonts w:hint="eastAsia" w:ascii="Century" w:hAnsi="Century" w:eastAsia="ＭＳ 明朝"/>
-          <w:sz w:val="24"/>
-          <w:szCs w:val="28"/>
-          <w:lang w:eastAsia="ja-JP"/>
-        </w:rPr>
-        <w:t>、</w:t>
-      </w:r>
-      <w:r>
-        <w:rPr>
-          <w:rFonts w:ascii="Century" w:hAnsi="Century" w:eastAsia="ＭＳ 明朝"/>
-          <w:sz w:val="24"/>
-          <w:szCs w:val="28"/>
-          <w:lang w:eastAsia="ja-JP"/>
-        </w:rPr>
-        <w:t>「（顧客の注文に対応した）</w:t>
-      </w:r>
-      <w:r>
-        <w:rPr>
-          <w:rFonts w:ascii="Century" w:hAnsi="Century" w:eastAsia="ＭＳ 明朝"/>
-          <w:sz w:val="24"/>
-          <w:szCs w:val="28"/>
-          <w:lang w:eastAsia="ja-JP"/>
-        </w:rPr>
-        <w:t xml:space="preserve"> </w:t>
-      </w:r>
-      <w:r>
-        <w:rPr>
-          <w:rFonts w:ascii="Century" w:hAnsi="Century" w:eastAsia="ＭＳ 明朝"/>
-          <w:sz w:val="24"/>
-          <w:szCs w:val="28"/>
-          <w:lang w:eastAsia="ja-JP"/>
-        </w:rPr>
-        <w:t>商品のピッキング</w:t>
-      </w:r>
-      <w:r>
-        <w:rPr>
-          <w:rFonts w:hint="eastAsia" w:ascii="Century" w:hAnsi="Century" w:eastAsia="ＭＳ 明朝"/>
-          <w:sz w:val="24"/>
-          <w:szCs w:val="28"/>
-          <w:lang w:eastAsia="ja-JP"/>
-        </w:rPr>
-        <w:t>、</w:t>
-      </w:r>
-      <w:r>
-        <w:rPr>
-          <w:rFonts w:ascii="Century" w:hAnsi="Century" w:eastAsia="ＭＳ 明朝"/>
-          <w:sz w:val="24"/>
-          <w:szCs w:val="28"/>
-          <w:lang w:eastAsia="ja-JP"/>
-        </w:rPr>
-        <w:t>梱包</w:t>
-      </w:r>
-      <w:r>
-        <w:rPr>
-          <w:rFonts w:hint="eastAsia" w:ascii="Century" w:hAnsi="Century" w:eastAsia="ＭＳ 明朝"/>
-          <w:sz w:val="24"/>
-          <w:szCs w:val="28"/>
-          <w:lang w:eastAsia="ja-JP"/>
-        </w:rPr>
-        <w:t>、</w:t>
-      </w:r>
-      <w:r>
-        <w:rPr>
-          <w:rFonts w:ascii="Century" w:hAnsi="Century" w:eastAsia="ＭＳ 明朝"/>
-          <w:sz w:val="24"/>
-          <w:szCs w:val="28"/>
-          <w:lang w:eastAsia="ja-JP"/>
-        </w:rPr>
-        <w:t>発送</w:t>
-      </w:r>
-      <w:r>
-        <w:rPr>
-          <w:rFonts w:hint="eastAsia" w:ascii="Century" w:hAnsi="Century" w:eastAsia="ＭＳ 明朝"/>
-          <w:sz w:val="24"/>
-          <w:szCs w:val="28"/>
-          <w:lang w:eastAsia="ja-JP"/>
-        </w:rPr>
-        <w:t>、</w:t>
-      </w:r>
-      <w:r>
-        <w:rPr>
-          <w:rFonts w:ascii="Century" w:hAnsi="Century" w:eastAsia="ＭＳ 明朝"/>
-          <w:sz w:val="24"/>
-          <w:szCs w:val="28"/>
-          <w:lang w:eastAsia="ja-JP"/>
-        </w:rPr>
-        <w:t>配達」などといった</w:t>
-      </w:r>
-      <w:r>
-        <w:rPr>
-          <w:rFonts w:ascii="Century" w:hAnsi="Century" w:eastAsia="ＭＳ 明朝"/>
-          <w:sz w:val="24"/>
-          <w:szCs w:val="28"/>
-          <w:lang w:eastAsia="ja-JP"/>
-        </w:rPr>
-        <w:t xml:space="preserve"> Outbound operations </w:t>
-      </w:r>
-      <w:r>
-        <w:rPr>
-          <w:rFonts w:ascii="Century" w:hAnsi="Century" w:eastAsia="ＭＳ 明朝"/>
-          <w:sz w:val="24"/>
-          <w:szCs w:val="28"/>
-          <w:lang w:eastAsia="ja-JP"/>
-        </w:rPr>
-        <w:t>の</w:t>
-      </w:r>
-      <w:r>
-        <w:rPr>
-          <w:rFonts w:ascii="Century" w:hAnsi="Century" w:eastAsia="ＭＳ 明朝"/>
-          <w:sz w:val="24"/>
-          <w:szCs w:val="28"/>
-          <w:lang w:eastAsia="ja-JP"/>
-        </w:rPr>
-        <w:t xml:space="preserve"> 2 </w:t>
-      </w:r>
-      <w:r>
-        <w:rPr>
-          <w:rFonts w:ascii="Century" w:hAnsi="Century" w:eastAsia="ＭＳ 明朝"/>
-          <w:sz w:val="24"/>
-          <w:szCs w:val="28"/>
-          <w:lang w:eastAsia="ja-JP"/>
-        </w:rPr>
-        <w:t>種類の業務を対象としたサービスである</w:t>
-      </w:r>
-      <w:r>
-        <w:rPr>
-          <w:rFonts w:ascii="Century" w:hAnsi="Century" w:eastAsia="ＭＳ 明朝"/>
-          <w:sz w:val="24"/>
-          <w:szCs w:val="28"/>
-          <w:lang w:eastAsia="ja-JP"/>
-        </w:rPr>
-        <w:t>と整理している。</w:t>
-      </w:r>
-      <w:r>
-        <w:rPr>
-          <w:rFonts w:hint="eastAsia" w:ascii="Century" w:hAnsi="Century" w:eastAsia="ＭＳ 明朝"/>
-          <w:sz w:val="24"/>
-          <w:szCs w:val="28"/>
-          <w:lang w:eastAsia="ja-JP"/>
-        </w:rPr>
-        <w:t>また</w:t>
-      </w:r>
-      <w:r>
-        <w:rPr>
-          <w:rFonts w:ascii="Century" w:hAnsi="Century" w:eastAsia="ＭＳ 明朝"/>
-          <w:sz w:val="24"/>
-          <w:szCs w:val="28"/>
-          <w:lang w:eastAsia="ja-JP"/>
-        </w:rPr>
-        <w:t>丁（2023）</w:t>
-      </w:r>
-      <w:r>
-        <w:rPr>
-          <w:rFonts w:ascii="Century" w:hAnsi="Century" w:eastAsia="ＭＳ 明朝"/>
-          <w:sz w:val="24"/>
-          <w:szCs w:val="28"/>
-          <w:lang w:eastAsia="ja-JP"/>
-        </w:rPr>
-      </w:r>
-      <w:r>
-        <w:rPr>
-          <w:rFonts w:ascii="Century" w:hAnsi="Century" w:hint="eastAsia" w:eastAsia="ＭＳ 明朝"/>
-          <w:sz w:val="24"/>
-          <w:szCs w:val="28"/>
-          <w:lang w:eastAsia="ja-JP"/>
-        </w:rPr>
-      </w:r>
-      <w:r>
-        <w:rPr>
-          <w:rFonts w:ascii="Century" w:hAnsi="Century" w:eastAsia="ＭＳ 明朝"/>
-          <w:sz w:val="24"/>
-          <w:szCs w:val="28"/>
-          <w:lang w:eastAsia="ja-JP"/>
-        </w:rPr>
-        <w:t>は、「フルフィルメントにおける優位性は，</w:t>
-      </w:r>
-      <w:r>
-        <w:rPr>
-          <w:rFonts w:ascii="Century" w:hAnsi="Century" w:eastAsia="ＭＳ 明朝"/>
-          <w:sz w:val="24"/>
-          <w:szCs w:val="28"/>
-          <w:lang w:eastAsia="ja-JP"/>
-        </w:rPr>
-        <w:t xml:space="preserve">EC </w:t>
-      </w:r>
-      <w:r>
-        <w:rPr>
-          <w:rFonts w:ascii="Century" w:hAnsi="Century" w:eastAsia="ＭＳ 明朝"/>
-          <w:sz w:val="24"/>
-          <w:szCs w:val="28"/>
-          <w:lang w:eastAsia="ja-JP"/>
-        </w:rPr>
-        <w:t>における顧客満足に極めて大きな影響を与えると考えられる」と述べている。</w:t>
-      </w:r>
-      <w:r>
-        <w:rPr>
-          <w:rFonts w:ascii="Century" w:hAnsi="Century" w:eastAsia="ＭＳ 明朝"/>
-          <w:sz w:val="24"/>
-          <w:szCs w:val="28"/>
-          <w:lang w:eastAsia="ja-JP"/>
-        </w:rPr>
-        <w:t>そのため、フルフィルメントは</w:t>
-      </w:r>
-      <w:r>
-        <w:rPr>
-          <w:rFonts w:ascii="Century" w:hAnsi="Century" w:eastAsia="ＭＳ 明朝"/>
-          <w:sz w:val="24"/>
-          <w:szCs w:val="28"/>
-          <w:lang w:eastAsia="ja-JP"/>
-        </w:rPr>
-        <w:t>EC</w:t>
-      </w:r>
-      <w:r>
-        <w:rPr>
-          <w:rFonts w:ascii="Century" w:hAnsi="Century" w:hint="eastAsia" w:eastAsia="ＭＳ 明朝"/>
-          <w:sz w:val="24"/>
-          <w:szCs w:val="28"/>
-          <w:lang w:eastAsia="ja-JP"/>
-        </w:rPr>
-        <w:t>事業</w:t>
-      </w:r>
-      <w:r>
-        <w:rPr>
-          <w:rFonts w:ascii="Century" w:hAnsi="Century" w:cs="MS Mincho" w:hint="eastAsia" w:eastAsia="ＭＳ 明朝"/>
-          <w:sz w:val="24"/>
-          <w:szCs w:val="28"/>
-          <w:lang w:eastAsia="ja-JP"/>
-        </w:rPr>
-        <w:t>の成否を左右する重要な要因であると考えられる</w:t>
-      </w:r>
-      <w:r>
-        <w:rPr>
-          <w:rFonts w:ascii="Century" w:hAnsi="Century" w:eastAsia="ＭＳ 明朝"/>
-          <w:sz w:val="24"/>
-          <w:szCs w:val="28"/>
-          <w:lang w:eastAsia="ja-JP"/>
-        </w:rPr>
-        <w:t>。</w:t>
+        <w:t>ECでは、消費者が実店舗に来店して商品を持ち帰る従来の小売業とは異なり、注文を受けた商品を事業者が顧客の手元まで届ける必要がある。そのため、受注から配達までの物流業務を一体的に担うフルフィルメントが、EC企業にとって重要なオペレーションとなる。丁（2023，5頁）は、EC におけるフルフィルメントの業務範囲は、「検品、在庫管理、商品保管」などといった Inbound operations、および、「（顧客の注文に対応した） 商品のピッキング、梱包、発送、配達」などといった Outbound operations の 2 種類の業務を対象としたサービスであると整理している。また丁（2023，2頁）は、「フルフィルメントにおける優位性は，EC における顧客満足に極めて大きな影響を与えると考えられる」と述べている。そのため、フルフィルメントはEC事業の成否を左右する重要な要因であると考えられる。</w:t>
       </w:r>
     </w:p>
     <w:p>
@@ -1641,7 +1224,7 @@
           <w:szCs w:val="28"/>
           <w:lang w:eastAsia="ja-JP"/>
         </w:rPr>
-        <w:t>フルフィルメントの中でも、本研究が注目するのはラストマイル配送である。ECにおけるフルフィルメントは、生産拠点から物流倉庫へ至る「ファーストマイル」、物流拠点間の輸送を担う「ミドルマイル」、顧客へ商品を届ける「ラストマイル」の3段階で構成される（Zamal et al.，2025；丁，2026より引用）。ラストマイル配送の定義は論者によって様々であるが、本研究ではHa et al.（2023）にならい、ラストマイル配送を「最終発送地点から荷受人が受け取る地点までの輸送プロセス」（丁，2026より引用）と捉える。</w:t>
+        <w:t>フルフィルメントの中でも、本研究が注目するのはラストマイル配送である。丁（2026，39頁）によれば、ECにおけるフルフィルメントは、生産拠点から物流倉庫へ至る「ファーストマイル」、物流拠点間の輸送を担う「ミドルマイル」、顧客へ商品を届ける「ラストマイル」の3段階で構成される。ラストマイル配送の定義は論者によって様々であるが、本研究では丁（2026，40頁）にならい、ラストマイル配送を「最終発送地点から荷受人が受け取る地点までの輸送プロセス」と捉える。</w:t>
       </w:r>
     </w:p>
     <w:p>
@@ -1663,128 +1246,7 @@
           <w:szCs w:val="28"/>
           <w:lang w:eastAsia="ja-JP"/>
         </w:rPr>
-        <w:lastRenderedPageBreak/>
-        <w:t>ラストマイル配送は、次の二つの理由から</w:t>
-      </w:r>
-      <w:r>
-        <w:rPr>
-          <w:rFonts w:ascii="Century" w:hAnsi="Century" w:eastAsia="ＭＳ 明朝"/>
-          <w:sz w:val="24"/>
-          <w:szCs w:val="28"/>
-          <w:lang w:eastAsia="ja-JP"/>
-        </w:rPr>
-        <w:t>EC</w:t>
-      </w:r>
-      <w:r>
-        <w:rPr>
-          <w:rFonts w:ascii="Century" w:hAnsi="Century" w:eastAsia="ＭＳ 明朝"/>
-          <w:sz w:val="24"/>
-          <w:szCs w:val="28"/>
-          <w:lang w:eastAsia="ja-JP"/>
-        </w:rPr>
-        <w:t>物流において特に重要な位置を占める。第一に、ラストマイル配送は顧客と直接接する物流工程であり、その品質が顧客の評価に直結する。丁（2023</w:t>
-      </w:r>
-      <w:r>
-        <w:rPr>
-          <w:rFonts w:ascii="Century" w:hAnsi="Century" w:eastAsia="ＭＳ 明朝"/>
-          <w:sz w:val="24"/>
-          <w:szCs w:val="28"/>
-          <w:lang w:eastAsia="ja-JP"/>
-        </w:rPr>
-      </w:r>
-      <w:r>
-        <w:rPr>
-          <w:rFonts w:ascii="Century" w:hAnsi="Century" w:eastAsia="ＭＳ 明朝"/>
-          <w:sz w:val="24"/>
-          <w:szCs w:val="28"/>
-          <w:lang w:eastAsia="ja-JP"/>
-        </w:rPr>
-      </w:r>
-      <w:r>
-        <w:rPr>
-          <w:rFonts w:ascii="Century" w:hAnsi="Century" w:eastAsia="ＭＳ 明朝"/>
-          <w:sz w:val="24"/>
-          <w:szCs w:val="28"/>
-          <w:lang w:eastAsia="ja-JP"/>
-        </w:rPr>
-      </w:r>
-      <w:r>
-        <w:rPr>
-          <w:rFonts w:ascii="Century" w:hAnsi="Century" w:eastAsia="ＭＳ 明朝"/>
-          <w:sz w:val="24"/>
-          <w:szCs w:val="28"/>
-          <w:lang w:eastAsia="ja-JP"/>
-        </w:rPr>
-        <w:t>）は、先行研究のレビューを通じて、「注文の追跡」「適時性／オンタイム配送」「商品の状態／配送品質」など、配送段階に関わるフルフィルメント要素が顧客満足に影響を与えることを示している。また、配達員による対面サービスの品質（</w:t>
-      </w:r>
-      <w:r>
-        <w:rPr>
-          <w:rFonts w:ascii="Century" w:hAnsi="Century" w:eastAsia="ＭＳ 明朝"/>
-          <w:sz w:val="24"/>
-          <w:szCs w:val="28"/>
-          <w:lang w:eastAsia="ja-JP"/>
-        </w:rPr>
-        <w:t>Inoue &amp; Hashimoto，2023</w:t>
-      </w:r>
-      <w:r>
-        <w:rPr>
-          <w:rFonts w:ascii="Century" w:hAnsi="Century" w:eastAsia="ＭＳ 明朝"/>
-          <w:sz w:val="24"/>
-          <w:szCs w:val="28"/>
-          <w:lang w:eastAsia="ja-JP"/>
-        </w:rPr>
-        <w:t>；丁，2026</w:t>
-      </w:r>
-      <w:r>
-        <w:rPr>
-          <w:rFonts w:ascii="Century" w:hAnsi="Century" w:eastAsia="ＭＳ 明朝"/>
-          <w:sz w:val="24"/>
-          <w:szCs w:val="28"/>
-          <w:lang w:eastAsia="ja-JP"/>
-        </w:rPr>
-      </w:r>
-      <w:r>
-        <w:rPr>
-          <w:rFonts w:ascii="Century" w:hAnsi="Century" w:eastAsia="ＭＳ 明朝"/>
-          <w:sz w:val="24"/>
-          <w:szCs w:val="28"/>
-          <w:lang w:eastAsia="ja-JP"/>
-        </w:rPr>
-      </w:r>
-      <w:r>
-        <w:rPr>
-          <w:rFonts w:ascii="Century" w:hAnsi="Century" w:eastAsia="ＭＳ 明朝"/>
-          <w:sz w:val="24"/>
-          <w:szCs w:val="28"/>
-          <w:lang w:eastAsia="ja-JP"/>
-        </w:rPr>
-      </w:r>
-      <w:r>
-        <w:rPr>
-          <w:rFonts w:ascii="Century" w:hAnsi="Century" w:eastAsia="ＭＳ 明朝"/>
-          <w:sz w:val="24"/>
-          <w:szCs w:val="28"/>
-          <w:lang w:eastAsia="ja-JP"/>
-        </w:rPr>
-        <w:t>より引用）や、配送状況の追跡などの配送情報の品質（丁，</w:t>
-      </w:r>
-      <w:r>
-        <w:rPr>
-          <w:rFonts w:ascii="Century" w:hAnsi="Century" w:eastAsia="ＭＳ 明朝"/>
-          <w:sz w:val="24"/>
-          <w:szCs w:val="28"/>
-          <w:lang w:eastAsia="ja-JP"/>
-        </w:rPr>
-        <w:t>2026</w:t>
-      </w:r>
-      <w:r>
-        <w:rPr>
-          <w:rFonts w:ascii="Century" w:hAnsi="Century" w:eastAsia="ＭＳ 明朝"/>
-          <w:sz w:val="24"/>
-          <w:szCs w:val="28"/>
-          <w:lang w:eastAsia="ja-JP"/>
-        </w:rPr>
-        <w:t>）も、顧客満足や再利用意向に影響することが報告されている。</w:t>
+        <w:t>ラストマイル配送は、次の二つの理由からEC物流において特に重要な位置を占める。第一に、ラストマイル配送は顧客と直接接する物流工程であり、その品質が顧客の評価に直結する。丁（2023，8頁）は、先行研究のレビューを通じて、「注文の追跡」「適時性／オンタイム配送」「商品の状態／配送品質」など、配送段階に関わるフルフィルメント要素が顧客満足に影響を与えることを示している。また丁（2026）は、配達員による対面サービスの品質が顧客満足に影響することを示す先行研究を整理したうえで（41頁）、配送状況の追跡などに関わる配送情報の品質が、顧客満足を介して再利用意向に影響することを明らかにしている（39頁，49頁）。</w:t>
       </w:r>
     </w:p>
     <w:p>
@@ -1806,46 +1268,10 @@
           <w:szCs w:val="28"/>
           <w:lang w:eastAsia="ja-JP"/>
         </w:rPr>
-        <w:t>第二に、ラストマイル配送はコストと効率性の面でも大きな課題を抱えている。丁（2026）は、</w:t>
+        <w:t>第二に、ラストマイル配送はコストと効率性の面でも大きな課題を抱えている。丁（2026，39頁）は、ラストマイルがフルフィルメントの中で最もコストが高く非効率な段階であり、環境負荷の問題も深刻であると述べている。また丁（2023，5-6頁）も、ECでは膨大な数の商品を小ロットで「極めて多くの場所」に届けなければならず、ラストマイル問題はまさにこのことを反映していると指摘している。さらに、ECの宅配需要の急増とラストマイルにおけるドライバー不足を背景として、宅配危機が深刻化している（林，2020，9頁）。林（2020，13-14頁）は、ラストマイルは自動化や無人化が困難な最も労働集約的な工程であり、物流革新の大きな障壁となっていると指摘している。</w:t>
       </w:r>
       <w:proofErr w:type="spellStart"/>
-      <w:r>
-        <w:rPr>
-          <w:rFonts w:ascii="Century" w:hAnsi="Century" w:eastAsia="ＭＳ 明朝"/>
-          <w:sz w:val="24"/>
-          <w:szCs w:val="28"/>
-          <w:lang w:eastAsia="ja-JP"/>
-        </w:rPr>
-        <w:t>Gevaers</w:t>
-      </w:r>
       <w:proofErr w:type="spellEnd"/>
-      <w:r>
-        <w:rPr>
-          <w:rFonts w:ascii="Century" w:hAnsi="Century" w:eastAsia="ＭＳ 明朝"/>
-          <w:sz w:val="24"/>
-          <w:szCs w:val="28"/>
-          <w:lang w:eastAsia="ja-JP"/>
-        </w:rPr>
-        <w:t xml:space="preserve"> et al.（2011）を引用し、ラストマイルがフルフィルメントの中で最もコストが高く非効率な段階であり、環境負荷の問題も深刻であると述べている。また丁（2023）も、ECでは膨大な数の商品を小ロットで「極めて多くの場所」に届けなければならず、ラストマイル問題はまさにこのことを反映していると指摘している。</w:t>
-      </w:r>
-      <w:r>
-        <w:rPr>
-          <w:rFonts w:ascii="Century" w:hAnsi="Century" w:eastAsia="ＭＳ 明朝"/>
-          <w:sz w:val="24"/>
-          <w:szCs w:val="28"/>
-          <w:lang w:eastAsia="ja-JP"/>
-        </w:rPr>
-        <w:t>さらに、ECの宅配需要の急増とラストマイルにおけるドライバー不足を背景として、宅配危機が深刻化している（林，2020）。</w:t>
-      </w:r>
-      <w:r>
-        <w:rPr>
-          <w:rFonts w:ascii="Century" w:hAnsi="Century" w:eastAsia="ＭＳ 明朝"/>
-          <w:sz w:val="24"/>
-          <w:szCs w:val="28"/>
-          <w:lang w:eastAsia="ja-JP"/>
-        </w:rPr>
-        <w:t>林（2020）は、ラストマイルは自動化や無人化が困難な最も労働集約的な工程であり、物流革新の大きな障壁となっていると指摘している。</w:t>
-      </w:r>
     </w:p>
     <w:p>
       <w:pPr>
@@ -1915,7 +1341,7 @@
           <w:szCs w:val="28"/>
           <w:lang w:eastAsia="ja-JP"/>
         </w:rPr>
-        <w:t>こうした中で、EC企業であるAmazonは、フルフィルメントセンターを中心とする独自の物流ネットワークを構築するとともに、ラストマイル配送においても宅配便事業者への依存から脱却し、自らコントロールできる配送の拡大を進めてきた（齊藤，2021，2022）。なお、本研究では、宅配便事業者に委託せず、Amazonが配送の担い手を自ら調達・組織化して行う配送を「自社配送」と呼ぶ。ただし、その実際の担い手は主として運送事業者や個人事業主といった外部の事業者であり、Amazonが直接雇用するドライバーによる配送を意味するものではない点に留意が必要である。</w:t>
+        <w:t>こうした中で、EC企業であるAmazonは、フルフィルメントセンターを中心とする独自の物流ネットワークを構築するとともに、ラストマイル配送においても宅配便事業者への依存から脱却し、自らコントロールできる配送の拡大を進めてきた（齊藤，2021，59-60頁；齊藤，2022，44頁）。なお、本研究では、宅配便事業者に委託せず、Amazonが配送の担い手を自ら調達・組織化して行う配送を「自社配送」と呼ぶ。ただし、その実際の担い手は主として運送事業者や個人事業主といった外部の事業者であり、Amazonが直接雇用するドライバーによる配送を意味するものではない点に留意が必要である。</w:t>
       </w:r>
     </w:p>
     <w:p>
@@ -1937,16 +1363,7 @@
           <w:szCs w:val="28"/>
           <w:lang w:eastAsia="ja-JP"/>
         </w:rPr>
-        <w:t>米国のAmazonは、従来、UPSやFedExといった大手宅配便事業者</w:t>
-      </w:r>
-      <w:r>
-        <w:rPr>
-          <w:rFonts w:ascii="Century" w:hAnsi="Century" w:hint="eastAsia" w:eastAsia="ＭＳ 明朝"/>
-          <w:sz w:val="24"/>
-          <w:szCs w:val="28"/>
-          <w:lang w:eastAsia="ja-JP"/>
-        </w:rPr>
-        <w:t>や郵便のUSPSにラストマイル配送を委託してきた。しかし、寡占的な市場構造のもとで大手宅配便事業者は毎年のように運賃の値上げを行い、Amazonの売上高に占める輸送コストの比率は2017年には12.2％に上昇した（齊藤，2021）。さらに2013年のクリスマスシーズンには、急増した貨物にUPSが対応できず大規模な遅配が発生し、顧客の信頼が大きく損なわれた。これを契機として、Amazonは自らコントロールできるラストマイル配送に取り組み始めた（齊藤，2022）。具体的には、2015年に自家用車を保有する個人ドライバーに配送を委託するAmazon Flexを、2018年にはAmazonの貨物を専門に配送する運送会社の起業を支援するデリバリー・サービス・パートナー（DSP）プログラムを開始した（齊藤，2022）。その結果、Amazonが出荷する貨物のうち自社でコントロールする配送の比率は、2016年末の8％から2019年7月には49％に達したとされる（齊藤，2022）。</w:t>
+        <w:t>米国のAmazonは、従来、UPSやFedExといった大手宅配便事業者や郵便のUSPSにラストマイル配送を委託してきた。しかし、寡占的な市場構造のもとで大手宅配便事業者は毎年のように運賃の値上げを行い、Amazonの売上高に占める輸送コストの比率は2017年には12.2％に上昇した（齊藤，2021，53頁）。さらに2013年のクリスマスシーズンには、急増した貨物にUPSが対応できず大規模な遅配が発生し、顧客の信頼が大きく損なわれた。これを契機として、Amazonは自らコントロールできるラストマイル配送に取り組み始めた（齊藤，2022，45-46頁）。具体的には、2015年に自家用車を保有する個人ドライバーに配送を委託するAmazon Flexを、2018年にはAmazonの貨物を専門に配送する運送会社の起業を支援するデリバリー・サービス・パートナー（DSP）プログラムを開始した（齊藤，2022，49頁，53頁）。その結果、Amazonが出荷する貨物のうち自社でコントロールする配送の比率は、2016年末の8％から2019年7月には49％に達したとされる（齊藤，2022，46頁）。</w:t>
       </w:r>
     </w:p>
     <w:p>
@@ -1968,7 +1385,7 @@
           <w:szCs w:val="28"/>
           <w:lang w:eastAsia="ja-JP"/>
         </w:rPr>
-        <w:t>アマゾンジャパンも、ラストマイル配送を基本的にヤマト運輸、日本郵便、佐川急便の大手宅配便事業者に依存してきた（齊藤，2022）。しかし、2013年には佐川急便が採算性の低い大口ネット通販契約を見直し（林，2020）、さらに2017年には、ドライバー不足のもとでヤマト運輸が荷受量の総量規制や一部サービスの停止を行うとともに、アマゾンジャパンに対しても40％の運賃値上げを実施した（齊藤，2022）。いわゆる「宅配クライシス」である。齊藤（2022）は、この宅配クライシスがアマゾンジャパンにとって脱宅配便を進める重要な契機になったと指摘している。実際に、アマゾンジャパンの配送に占める大手宅配便3社の利用率は、2017年4月の94％から2020年9月には41％にまで低下したとされる（齊藤，2022）。</w:t>
+        <w:t>アマゾンジャパンも、ラストマイル配送を基本的にヤマト運輸、日本郵便、佐川急便の大手宅配便事業者に依存してきた（齊藤，2022，56頁）。しかし、2013年には佐川急便が採算性の低い大口ネット通販契約を見直し（林，2020，9-10頁）、さらに2017年には、ドライバー不足のもとでヤマト運輸が荷受量の総量規制や一部サービスの停止を行うとともに、アマゾンジャパンに対しても40％の運賃値上げを実施した（齊藤，2022，56頁）。いわゆる「宅配クライシス」である。齊藤（2022，56頁）は、この宅配クライシスがアマゾンジャパンにとって脱宅配便を進める重要な契機になったと指摘している。実際に、アマゾンジャパンの配送に占める大手宅配便3社の利用率は、2017年4月の94％から2020年9月には41％にまで低下したとされる（齊藤，2022，56-57頁）。</w:t>
       </w:r>
     </w:p>
     <w:p>
@@ -1990,34 +1407,7 @@
           <w:szCs w:val="28"/>
           <w:lang w:eastAsia="ja-JP"/>
         </w:rPr>
-        <w:t>こうした中でアマゾンジャパンは、地域の中堅・中小運送事業者であるデリバリープロバイダ（ADP）への配送委託、貨物軽自動車運送事業の届出を行った個人事業主と直接契約するAmazon Flex、地域の店舗等が空き時間に近隣へ配送するAmazon Hub デリバリーパートナープログラム（AHDP）などを通じて、自らコントロールできる配送を拡大してきた（長谷川，2023；齊藤，2023）。2021年には、アマゾンジャパンが出荷する貨物約7億個のうち、約半数が宅配便以外で配送されていたと推計されている（齊藤，2022）。さらに2023年3月には、運送事業の経験がない人も含めて配送会社の起業を支援する、新たなデリバリーサービスパートナープログラム（以下、日本DSP）</w:t>
-      </w:r>
-      <w:r>
-        <w:rPr>
-          <w:rFonts w:ascii="Century" w:hAnsi="Century" w:hint="eastAsia" w:eastAsia="ＭＳ 明朝"/>
-          <w:sz w:val="24"/>
-          <w:szCs w:val="28"/>
-          <w:lang w:eastAsia="ja-JP"/>
-        </w:rPr>
-      </w:r>
-      <w:r>
-        <w:rPr>
-          <w:rFonts w:ascii="Century" w:hAnsi="Century" w:hint="eastAsia" w:eastAsia="ＭＳ 明朝"/>
-          <w:sz w:val="24"/>
-          <w:szCs w:val="28"/>
-          <w:lang w:eastAsia="ja-JP"/>
-        </w:rPr>
-        <w:t>の運用を開始した（アマ</w:t>
-      </w:r>
-      <w:r>
-        <w:rPr>
-          <w:rFonts w:ascii="Century" w:hAnsi="Century" w:hint="eastAsia" w:eastAsia="ＭＳ 明朝"/>
-          <w:sz w:val="24"/>
-          <w:szCs w:val="28"/>
-          <w:lang w:eastAsia="ja-JP"/>
-        </w:rPr>
-        <w:lastRenderedPageBreak/>
-        <w:t>ゾンジャパン，2023）。</w:t>
+        <w:t>こうした中でアマゾンジャパンは、地域の中堅・中小運送事業者であるデリバリープロバイダ（ADP）への配送委託、貨物軽自動車運送事業の届出を行った個人事業主と直接契約するAmazon Flex、地域の店舗等が空き時間に近隣へ配送するAmazon Hub デリバリーパートナープログラム（AHDP）などを通じて、自らコントロールできる配送を拡大してきた（長谷川，2023，44-49頁；齊藤，2023，37-38頁）。2021年には、アマゾンジャパンが出荷する貨物約7億個のうち、約半数が宅配便以外で配送されていたと推計されている（齊藤，2022，57頁）。さらに2023年3月には、運送事業の経験がない人も含めて配送会社の起業を支援する、新たなデリバリーサービスパートナープログラム（以下、日本DSP）の運用を開始した（アマゾンジャパン，2023）。</w:t>
       </w:r>
     </w:p>
     <w:p>
@@ -2081,85 +1471,7 @@
           <w:szCs w:val="28"/>
           <w:lang w:eastAsia="ja-JP"/>
         </w:rPr>
-        <w:t>1.1.3</w:t>
-      </w:r>
-      <w:r>
-        <w:rPr>
-          <w:rFonts w:ascii="Century" w:hAnsi="Century" w:eastAsia="ＭＳ 明朝"/>
-          <w:sz w:val="24"/>
-          <w:szCs w:val="28"/>
-          <w:lang w:eastAsia="ja-JP"/>
-        </w:rPr>
-        <w:t>で述べたように、日米いずれにおいても、</w:t>
-      </w:r>
-      <w:r>
-        <w:rPr>
-          <w:rFonts w:ascii="Century" w:hAnsi="Century" w:eastAsia="ＭＳ 明朝"/>
-          <w:sz w:val="24"/>
-          <w:szCs w:val="28"/>
-          <w:lang w:eastAsia="ja-JP"/>
-        </w:rPr>
-        <w:t>Amazon</w:t>
-      </w:r>
-      <w:r>
-        <w:rPr>
-          <w:rFonts w:ascii="Century" w:hAnsi="Century" w:eastAsia="ＭＳ 明朝"/>
-          <w:sz w:val="24"/>
-          <w:szCs w:val="28"/>
-          <w:lang w:eastAsia="ja-JP"/>
-        </w:rPr>
-        <w:t>は大手宅配便事業者への依存を減らし、自社配送を拡大してきたという点では共通している。しかし、齊藤（2022</w:t>
-      </w:r>
-      <w:r>
-        <w:rPr>
-          <w:rFonts w:ascii="Century" w:hAnsi="Century" w:eastAsia="ＭＳ 明朝"/>
-          <w:sz w:val="24"/>
-          <w:szCs w:val="28"/>
-          <w:lang w:eastAsia="ja-JP"/>
-        </w:rPr>
-      </w:r>
-      <w:r>
-        <w:rPr>
-          <w:rFonts w:ascii="Century" w:hAnsi="Century" w:eastAsia="ＭＳ 明朝"/>
-          <w:sz w:val="24"/>
-          <w:szCs w:val="28"/>
-          <w:lang w:eastAsia="ja-JP"/>
-        </w:rPr>
-      </w:r>
-      <w:r>
-        <w:rPr>
-          <w:rFonts w:ascii="Century" w:hAnsi="Century" w:eastAsia="ＭＳ 明朝"/>
-          <w:sz w:val="24"/>
-          <w:szCs w:val="28"/>
-          <w:lang w:eastAsia="ja-JP"/>
-        </w:rPr>
-      </w:r>
-      <w:r>
-        <w:rPr>
-          <w:rFonts w:ascii="Century" w:hAnsi="Century" w:eastAsia="ＭＳ 明朝"/>
-          <w:sz w:val="24"/>
-          <w:szCs w:val="28"/>
-          <w:lang w:eastAsia="ja-JP"/>
-        </w:rPr>
-        <w:t>）が指摘するように、日米では</w:t>
-      </w:r>
-      <w:r>
-        <w:rPr>
-          <w:rFonts w:ascii="Century" w:hAnsi="Century" w:eastAsia="ＭＳ 明朝"/>
-          <w:sz w:val="24"/>
-          <w:szCs w:val="28"/>
-          <w:lang w:eastAsia="ja-JP"/>
-        </w:rPr>
-        <w:t>EC</w:t>
-      </w:r>
-      <w:r>
-        <w:rPr>
-          <w:rFonts w:ascii="Century" w:hAnsi="Century" w:eastAsia="ＭＳ 明朝"/>
-          <w:sz w:val="24"/>
-          <w:szCs w:val="28"/>
-          <w:lang w:eastAsia="ja-JP"/>
-        </w:rPr>
-        <w:t>物流を取り巻く仕組みや状況が異なるため、ラストマイル配送への取り組みにもそれぞれ異なる特徴がみられる。</w:t>
+        <w:t>1.1.3で述べたように、日米いずれにおいても、Amazonは大手宅配便事業者への依存を減らし、自社配送を拡大してきたという点では共通している。しかし、齊藤（2022，44頁）が指摘するように、日米ではEC物流を取り巻く仕組みや状況が異なるため、ラストマイル配送への取り組みにもそれぞれ異なる特徴がみられる。</w:t>
       </w:r>
     </w:p>
     <w:p>
@@ -2181,7 +1493,7 @@
           <w:szCs w:val="28"/>
           <w:lang w:eastAsia="ja-JP"/>
         </w:rPr>
-        <w:t>第一に、配送の主な担い手が異なる。米国では、Amazonの貨物を専門に配送する小規模な運送会社をDSPとして新たに起業させ、大規模に組織化してきた。DSPは、Amazonのロゴが入った専用の配送車両を用い、Amazonの制服を着たドライバーが配送を行うフランチャイズ型の仕組みである（齊藤，2022）。これに対して日本では、既存の地域運送事業者であるADPに配送を委託してきたが、実際の配送は、ADPの下請けである協力会社や個人の軽貨物運送事業者によって担われている（齊藤，2022）。</w:t>
+        <w:t>第一に、配送の主な担い手が異なる。米国では、Amazonの貨物を専門に配送する小規模な運送会社をDSPとして新たに起業させ、大規模に組織化してきた。DSPは、Amazonのロゴが入った専用の配送車両を用い、Amazonの制服を着たドライバーが配送を行うフランチャイズ型の仕組みである（齊藤，2022，49-50頁）。これに対して日本では、既存の地域運送事業者であるADPに配送を委託してきたが、実際の配送は、ADPの下請けである協力会社や個人の軽貨物運送事業者によって担われている（齊藤，2022，59-60頁）。</w:t>
       </w:r>
     </w:p>
     <w:p>
@@ -2203,7 +1515,7 @@
           <w:szCs w:val="28"/>
           <w:lang w:eastAsia="ja-JP"/>
         </w:rPr>
-        <w:t>第二に、Amazonによる管理の程度が異なる。米国のAmazonは、独自のアルゴリズムによって配送ルートと配送個数を割り当てるとともに、車載カメラやテレマティクス装置、スマートフォンのアプリを通じてドライバーの運転や配送状況を監視している。さらに、その評価に基づいて運賃を変動させ、評価の低いDSPとは契約を打ち切っている（齊藤，2022）。一方、日本のADPについて齊藤（2022）は、アマゾンジャパンは従来の宅配便事業者と同様に配送業務を委託しているにすぎず、米国のような監視や統制は行っていないとしている。</w:t>
+        <w:t>第二に、Amazonによる管理の程度が異なる。米国のAmazonは、独自のアルゴリズムによって配送ルートと配送個数を割り当てるとともに、車載カメラやテレマティクス装置、スマートフォンのアプリを通じてドライバーの運転や配送状況を監視している。さらに、その評価に基づいて運賃を変動させ、評価の低いDSPとは契約を打ち切っている（齊藤，2022，51-52頁）。一方、日本のADPについて齊藤（2022，65頁）は、アマゾンジャパンは従来の宅配便事業者と同様に配送業務を委託しているにすぎず、米国のような監視や統制は行っていないとしている。</w:t>
       </w:r>
     </w:p>
     <w:p>
@@ -2225,115 +1537,7 @@
           <w:szCs w:val="28"/>
           <w:lang w:eastAsia="ja-JP"/>
         </w:rPr>
-        <w:t>第三に、同じ名称の仕組みであっても、その内容が異なる。</w:t>
-      </w:r>
-      <w:r>
-        <w:rPr>
-          <w:rFonts w:ascii="Century" w:hAnsi="Century" w:eastAsia="ＭＳ 明朝"/>
-          <w:sz w:val="24"/>
-          <w:szCs w:val="28"/>
-          <w:lang w:eastAsia="ja-JP"/>
-        </w:rPr>
-        <w:t>齊藤（2022）は、</w:t>
-      </w:r>
-      <w:r>
-        <w:rPr>
-          <w:rFonts w:ascii="Century" w:hAnsi="Century" w:hint="eastAsia" w:eastAsia="ＭＳ 明朝"/>
-          <w:sz w:val="24"/>
-          <w:szCs w:val="28"/>
-          <w:lang w:eastAsia="ja-JP"/>
-        </w:rPr>
-        <w:t>「アメリカの場合アマゾン</w:t>
-      </w:r>
-      <w:r>
-        <w:rPr>
-          <w:rFonts w:ascii="Century" w:hAnsi="Century" w:cs="微软雅黑" w:hint="eastAsia" w:eastAsia="ＭＳ 明朝"/>
-          <w:sz w:val="24"/>
-          <w:szCs w:val="28"/>
-          <w:lang w:eastAsia="ja-JP"/>
-        </w:rPr>
-        <w:t>・</w:t>
-      </w:r>
-      <w:r>
-        <w:rPr>
-          <w:rFonts w:ascii="Century" w:hAnsi="Century" w:cs="等线" w:hint="eastAsia" w:eastAsia="ＭＳ 明朝"/>
-          <w:sz w:val="24"/>
-          <w:szCs w:val="28"/>
-          <w:lang w:eastAsia="ja-JP"/>
-        </w:rPr>
-        <w:t>フレックスは、自家用車で配送する個人のドライバーを対象</w:t>
-      </w:r>
-      <w:r>
-        <w:rPr>
-          <w:rFonts w:ascii="Century" w:hAnsi="Century" w:hint="eastAsia" w:eastAsia="ＭＳ 明朝"/>
-          <w:sz w:val="24"/>
-          <w:szCs w:val="28"/>
-          <w:lang w:eastAsia="ja-JP"/>
-        </w:rPr>
-        <w:t>にしたものであるが、日本のアマゾン</w:t>
-      </w:r>
-      <w:r>
-        <w:rPr>
-          <w:rFonts w:ascii="Century" w:hAnsi="Century" w:cs="微软雅黑" w:hint="eastAsia" w:eastAsia="ＭＳ 明朝"/>
-          <w:sz w:val="24"/>
-          <w:szCs w:val="28"/>
-          <w:lang w:eastAsia="ja-JP"/>
-        </w:rPr>
-        <w:t>・</w:t>
-      </w:r>
-      <w:r>
-        <w:rPr>
-          <w:rFonts w:ascii="Century" w:hAnsi="Century" w:cs="等线" w:hint="eastAsia" w:eastAsia="ＭＳ 明朝"/>
-          <w:sz w:val="24"/>
-          <w:szCs w:val="28"/>
-          <w:lang w:eastAsia="ja-JP"/>
-        </w:rPr>
-        <w:t>フレックスは軽貨物運送業者に直接ネット通販貨</w:t>
-      </w:r>
-      <w:r>
-        <w:rPr>
-          <w:rFonts w:ascii="Century" w:hAnsi="Century" w:hint="eastAsia" w:eastAsia="ＭＳ 明朝"/>
-          <w:sz w:val="24"/>
-          <w:szCs w:val="28"/>
-          <w:lang w:eastAsia="ja-JP"/>
-        </w:rPr>
-        <w:t>物を運ばせるものである」と述べ</w:t>
-      </w:r>
-      <w:r>
-        <w:rPr>
-          <w:rFonts w:ascii="Century" w:hAnsi="Century" w:hint="eastAsia" w:eastAsia="ＭＳ 明朝"/>
-          <w:sz w:val="24"/>
-          <w:szCs w:val="28"/>
-          <w:lang w:eastAsia="ja-JP"/>
-        </w:rPr>
-        <w:t>てい</w:t>
-      </w:r>
-      <w:r>
-        <w:rPr>
-          <w:rFonts w:ascii="Century" w:hAnsi="Century" w:hint="eastAsia" w:eastAsia="ＭＳ 明朝"/>
-          <w:sz w:val="24"/>
-          <w:szCs w:val="28"/>
-          <w:lang w:eastAsia="ja-JP"/>
-        </w:rPr>
-        <w:t>る。</w:t>
-      </w:r>
-      <w:r>
-        <w:rPr>
-          <w:rFonts w:ascii="Century" w:hAnsi="Century" w:eastAsia="ＭＳ 明朝"/>
-          <w:sz w:val="24"/>
-          <w:szCs w:val="28"/>
-          <w:lang w:eastAsia="ja-JP"/>
-        </w:rPr>
-        <w:t>日本のAmazon Flexは、貨物軽自動車運送事業の届出を行った個人事業主を対象としている（齊藤，2022）。</w:t>
-      </w:r>
-      <w:r>
-        <w:rPr>
-          <w:rFonts w:ascii="Century" w:hAnsi="Century" w:hint="eastAsia" w:eastAsia="ＭＳ 明朝"/>
-          <w:sz w:val="24"/>
-          <w:szCs w:val="28"/>
-          <w:lang w:eastAsia="ja-JP"/>
-        </w:rPr>
-        <w:t>これは、日本では、届出を行っていない一般の個人が有償で貨物を運送することは認められていないためである（林，2020）。</w:t>
+        <w:t>第三に、同じ名称の仕組みであっても、その内容が異なる。齊藤（2022，61頁）は、「アメリカの場合アマゾン・フレックスは、自家用車で配送する個人のドライバーを対象にしたものであるが、日本のアマゾン・フレックスは軽貨物運送業者に直接ネット通販貨物を運ばせるものである」と述べている。日本のAmazon Flexは、貨物軽自動車運送事業の届出を行った個人事業主を対象としている（齊藤，2022，61-62頁）。これは、日本では、届出を行っていない一般の個人が有償で貨物を運送することは認められていないためである（林，2020，13頁）。</w:t>
       </w:r>
     </w:p>
     <w:p>
@@ -2355,60 +1559,7 @@
           <w:szCs w:val="28"/>
           <w:lang w:eastAsia="ja-JP"/>
         </w:rPr>
-        <w:t xml:space="preserve">　</w:t>
-      </w:r>
-      <w:r>
-        <w:rPr>
-          <w:rFonts w:ascii="Century" w:hAnsi="Century" w:eastAsia="ＭＳ 明朝"/>
-          <w:sz w:val="24"/>
-          <w:szCs w:val="28"/>
-          <w:lang w:eastAsia="ja-JP"/>
-        </w:rPr>
-        <w:t>ただし、こうした違いは固定的なものではない。日本でも2023年には、米国のDSPと同様に配送会社の起業を支援する日本DSPが導入された</w:t>
-      </w:r>
-      <w:r>
-        <w:rPr>
-          <w:rFonts w:ascii="Century" w:hAnsi="Century" w:hint="eastAsia" w:eastAsia="ＭＳ 明朝"/>
-          <w:sz w:val="24"/>
-          <w:szCs w:val="28"/>
-          <w:lang w:eastAsia="ja-JP"/>
-        </w:rPr>
-      </w:r>
-      <w:r>
-        <w:rPr>
-          <w:rFonts w:ascii="Century" w:hAnsi="Century" w:eastAsia="ＭＳ 明朝"/>
-          <w:sz w:val="24"/>
-          <w:szCs w:val="28"/>
-          <w:lang w:eastAsia="ja-JP"/>
-        </w:rPr>
-        <w:t>（林，2023；齊藤，2023）。</w:t>
-      </w:r>
-      <w:r>
-        <w:rPr>
-          <w:rFonts w:ascii="Century" w:hAnsi="Century" w:eastAsia="ＭＳ 明朝"/>
-          <w:sz w:val="24"/>
-          <w:szCs w:val="28"/>
-          <w:lang w:eastAsia="ja-JP"/>
-        </w:rPr>
-        <w:t>また、ADPの中には売上高の約7割をアマゾンジャパンに依存する事業者もみられ（齊藤，2022）</w:t>
-      </w:r>
-      <w:r>
-        <w:rPr>
-          <w:rFonts w:ascii="Century" w:hAnsi="Century" w:eastAsia="ＭＳ 明朝"/>
-          <w:sz w:val="24"/>
-          <w:szCs w:val="28"/>
-          <w:lang w:eastAsia="ja-JP"/>
-        </w:rPr>
-        <w:t>、ADPの下請けドライバーの配送ルートや配送個数がAIによって割り当てられているとの報告もある（齊藤，2023）</w:t>
-      </w:r>
-      <w:r>
-        <w:rPr>
-          <w:rFonts w:ascii="Century" w:hAnsi="Century" w:eastAsia="ＭＳ 明朝"/>
-          <w:sz w:val="24"/>
-          <w:szCs w:val="28"/>
-          <w:lang w:eastAsia="ja-JP"/>
-        </w:rPr>
-        <w:t>。したがって、日米の違いは単純な二分法で捉えるのではなく、担い手の専属性や管理の程度における違いとして、しかも時間とともに変化しうるものとして捉える必要がある。</w:t>
+        <w:t xml:space="preserve">　ただし、こうした違いは固定的なものではない。日本でも2023年には、米国のDSPと同様に配送会社の起業を支援する日本DSPが導入された（林，2023，10頁；齊藤，2023，39頁）。また、ADPの中には売上高の約7割をアマゾンジャパンに依存する事業者もみられ（齊藤，2022，58-59頁）、ADPの下請けドライバーの配送ルートや配送個数がAIによって割り当てられているとの報告もある（齊藤，2023，44-45頁）。したがって、日米の違いは単純な二分法で捉えるのではなく、担い手の専属性や管理の程度における違いとして、しかも時間とともに変化しうるものとして捉える必要がある。</w:t>
       </w:r>
     </w:p>
     <w:p>
@@ -2430,34 +1581,7 @@
           <w:szCs w:val="28"/>
           <w:lang w:eastAsia="ja-JP"/>
         </w:rPr>
-        <w:t>同じ企業が、同じ「脱宅配便」という方針のもとで自社配送を構築しているにもかかわらず、なぜ日米で異なる担い手、管理方式、契約形態が採用されたのか。また、日本では当初、既存の地域運送事業者や個人事業主が活用されてきたにもかかわらず、なぜ近年になって米国と同様の仕組みが導入されたのか。</w:t>
-      </w:r>
-      <w:r>
-        <w:rPr>
-          <w:rFonts w:ascii="Century" w:hAnsi="Century" w:eastAsia="ＭＳ 明朝"/>
-          <w:sz w:val="24"/>
-          <w:szCs w:val="28"/>
-          <w:lang w:eastAsia="ja-JP"/>
-        </w:rPr>
-        <w:t>これ</w:t>
-      </w:r>
-      <w:r>
-        <w:rPr>
-          <w:rFonts w:ascii="Century" w:hAnsi="Century" w:hint="eastAsia" w:eastAsia="ＭＳ 明朝"/>
-          <w:sz w:val="24"/>
-          <w:szCs w:val="28"/>
-          <w:lang w:eastAsia="ja-JP"/>
-        </w:rPr>
-        <w:t>ら</w:t>
-      </w:r>
-      <w:r>
-        <w:rPr>
-          <w:rFonts w:ascii="Century" w:hAnsi="Century" w:eastAsia="ＭＳ 明朝"/>
-          <w:sz w:val="24"/>
-          <w:szCs w:val="28"/>
-          <w:lang w:eastAsia="ja-JP"/>
-        </w:rPr>
-        <w:t>が本研究の出発点となる問題意識である。齊藤（2022）は日米の取り組みの実態を詳細に比較しているが、日米の物流環境のどのような違いが、どのような論理を通じて配送方式の違いをもたらしたのかについては、理論的に説明する余地が残されている。</w:t>
+        <w:t>同じ企業が、同じ「脱宅配便」という方針のもとで自社配送を構築しているにもかかわらず、なぜ日米で異なる担い手、管理方式、契約形態が採用されたのか。また、日本では当初、既存の地域運送事業者や個人事業主が活用されてきたにもかかわらず、なぜ近年になって米国と同様の仕組みが導入されたのか。これらが本研究の出発点となる問題意識である。齊藤（2022，44-65頁）は日米の取り組みの実態を詳細に比較しているが、日米の物流環境のどのような違いが、どのような論理を通じて配送方式の違いをもたらしたのかについては、理論的に説明する余地が残されている。</w:t>
       </w:r>
     </w:p>
     <w:p>
@@ -3637,25 +2761,7 @@
           <w:szCs w:val="28"/>
           <w:lang w:eastAsia="ja-JP"/>
         </w:rPr>
-        <w:t>ただし、ADPやAmazon Flexによる配送の規模など、Amazonの配送体制については公表されていない情報が多い（齊藤，2022）。そのため、本研究の分析の一部は、先行研究が引用する新聞</w:t>
-      </w:r>
-      <w:r>
-        <w:rPr>
-          <w:rFonts w:ascii="Century" w:hAnsi="Century" w:cs="微软雅黑" w:hint="eastAsia" w:eastAsia="ＭＳ 明朝"/>
-          <w:sz w:val="24"/>
-          <w:szCs w:val="28"/>
-          <w:lang w:eastAsia="ja-JP"/>
-        </w:rPr>
-        <w:t>・</w:t>
-      </w:r>
-      <w:r>
-        <w:rPr>
-          <w:rFonts w:ascii="Century" w:hAnsi="Century" w:cs="等线" w:hint="eastAsia" w:eastAsia="ＭＳ 明朝"/>
-          <w:sz w:val="24"/>
-          <w:szCs w:val="28"/>
-          <w:lang w:eastAsia="ja-JP"/>
-        </w:rPr>
-        <w:t>雑誌記事などの二次的な情報に依拠せざるを得ない。こうした限界を補うため、本研究では可能な限り複数の資料を照合し、資料間で記述が異なる場合にはその旨を明記する。</w:t>
+        <w:t>ただし、ADPやAmazon Flexによる配送の規模など、Amazonの配送体制については公表されていない情報が多い（齊藤，2022，55頁，59頁）。そのため、本研究の分析の一部は、先行研究が引用する新聞・雑誌記事などの二次的な情報に依拠せざるを得ない。こうした限界を補うため、本研究では可能な限り複数の資料を照合し、資料間で記述が異なる場合にはその旨を明記する。</w:t>
       </w:r>
     </w:p>
     <w:p>
@@ -3759,43 +2865,7 @@
           <w:szCs w:val="28"/>
           <w:lang w:eastAsia="ja-JP"/>
         </w:rPr>
-        <w:t xml:space="preserve">　第一に、日米のラストマイル配送体制の違いを記述するだけでなく、その違いが「なぜ」生じたのかを理論的に説明しようとする点である。</w:t>
-      </w:r>
-      <w:r>
-        <w:rPr>
-          <w:rFonts w:hint="eastAsia" w:ascii="Century" w:hAnsi="Century" w:eastAsia="ＭＳ 明朝"/>
-          <w:sz w:val="24"/>
-          <w:szCs w:val="28"/>
-          <w:lang w:eastAsia="ja-JP"/>
-        </w:rPr>
-        <w:t>1.2</w:t>
-      </w:r>
-      <w:r>
-        <w:rPr>
-          <w:rFonts w:hint="eastAsia" w:ascii="Century" w:hAnsi="Century" w:eastAsia="ＭＳ 明朝"/>
-          <w:sz w:val="24"/>
-          <w:szCs w:val="28"/>
-          <w:lang w:eastAsia="ja-JP"/>
-        </w:rPr>
-        <w:t>で述べたように、齊藤（</w:t>
-      </w:r>
-      <w:r>
-        <w:rPr>
-          <w:rFonts w:hint="eastAsia" w:ascii="Century" w:hAnsi="Century" w:eastAsia="ＭＳ 明朝"/>
-          <w:sz w:val="24"/>
-          <w:szCs w:val="28"/>
-          <w:lang w:eastAsia="ja-JP"/>
-        </w:rPr>
-        <w:t>2022</w:t>
-      </w:r>
-      <w:r>
-        <w:rPr>
-          <w:rFonts w:hint="eastAsia" w:ascii="Century" w:hAnsi="Century" w:eastAsia="ＭＳ 明朝"/>
-          <w:sz w:val="24"/>
-          <w:szCs w:val="28"/>
-          <w:lang w:eastAsia="ja-JP"/>
-        </w:rPr>
-        <w:t>）は日米の取り組みの実態を詳細に比較しているが、その違いがどのような要因によって、どのような論理を通じて生じたのかについては、理論的に説明する余地が残されている。本研究は、取引費用論を用いて、配送体制の違いを取引の属性とガバナンス構造の関係から説明することで、この点を補完する。</w:t>
+        <w:t xml:space="preserve">　第一に、日米のラストマイル配送体制の違いを記述するだけでなく、その違いが「なぜ」生じたのかを理論的に説明しようとする点である。1.2で述べたように、齊藤（2022，44-65頁）は日米の取り組みの実態を詳細に比較しているが、その違いがどのような要因によって、どのような論理を通じて生じたのかについては、理論的に説明する余地が残されている。本研究は、取引費用論を用いて、配送体制の違いを取引の属性とガバナンス構造の関係から説明することで、この点を補完する。</w:t>
       </w:r>
     </w:p>
     <w:p>
@@ -3817,17 +2887,7 @@
           <w:szCs w:val="28"/>
           <w:lang w:eastAsia="ja-JP"/>
         </w:rPr>
-        <w:t>第二に、取引費用論と標準化・現地適応論という二つの理論を組み合わせた分析枠組みを提示する点である。取引費用論は、主に企業の境界やガバナンスの選択を扱う理論であり、制度的環境を統治コストを変化させるパラメータとして位置づけてはいるものの（Williamson，1991）、多国籍企業が本国の仕組みを各国でどの程度共通化し、どの程度現地に適応させるかを主な分析対象とするものではない。一方、標準化・現地適応論は、多国籍企業が各国の環境にどう対応するかを扱うが、個々</w:t>
-      </w:r>
-      <w:r>
-        <w:rPr>
-          <w:rFonts w:hint="eastAsia" w:ascii="Century" w:hAnsi="Century" w:eastAsia="ＭＳ 明朝"/>
-          <w:sz w:val="24"/>
-          <w:szCs w:val="28"/>
-          <w:lang w:eastAsia="ja-JP"/>
-        </w:rPr>
-        <w:lastRenderedPageBreak/>
-        <w:t>の業務を外部に委ねるのか、委ねる場合にどの程度管理するのかという判断の論理を十分に説明するものではない。本研究は、各国の物流環境の違いが取引の属性の違いを生み、それがガバナンス構造の違い、すなわち現地適応として現れるという分析枠組みを構築することで、両理論の接続を試みる。</w:t>
+        <w:t>第二に、取引費用論と標準化・現地適応論という二つの理論を組み合わせた分析枠組みを提示する点である。取引費用論は、主に企業の境界やガバナンスの選択を扱う理論であり、制度的環境を統治コストを変化させるパラメータとして位置づけてはいるものの（Williamson，1991，287頁）、多国籍企業が本国の仕組みを各国でどの程度共通化し、どの程度現地に適応させるかを主な分析対象とするものではない。一方、標準化・現地適応論は、多国籍企業が各国の環境にどう対応するかを扱うが、個々の業務を外部に委ねるのか、委ねる場合にどの程度管理するのかという判断の論理を十分に説明するものではない。本研究は、各国の物流環境の違いが取引の属性の違いを生み、それがガバナンス構造の違い、すなわち現地適応として現れるという分析枠組みを構築することで、両理論の接続を試みる。</w:t>
       </w:r>
     </w:p>
     <w:p>
@@ -3968,7 +3028,7 @@
           <w:szCs w:val="28"/>
           <w:lang w:eastAsia="ja-JP"/>
         </w:rPr>
-        <w:t xml:space="preserve">　第二に、日本のラストマイル配送が直面する課題への示唆である。アマゾンジャパンが大手宅配便事業者に代わる担い手として採用してきたADPは（齊藤，2022）、協力会社や個人の軽貨物運送事業者による下請構造に支えられており（齊藤，2022）、こうした軽貨物運送事業者の長時間労働や低収入が課題として指摘されている（齊藤，2022）。また、ドライバー不足が深刻化するなかで（林，2020）、配送の担い手をどのように確保し、組織するかは、EC事業者や物流事業者にとって重要な課題となっている。Amazonが日本の物流環境にどのように適応し、配送の担い手をどのように組織してきたのかを明らかにすることは、日本におけるラストマイル配送体制のあり方を考えるうえでも意義があると考えられる。</w:t>
+        <w:t xml:space="preserve">　第二に、日本のラストマイル配送が直面する課題への示唆である。アマゾンジャパンが大手宅配便事業者に代わる担い手として採用してきたADPは（齊藤，2022，65頁）、協力会社や個人の軽貨物運送事業者による下請構造に支えられており（齊藤，2022，59-60頁）、こうした軽貨物運送事業者の長時間労働や低収入が課題として指摘されている（齊藤，2022，60-61頁，64頁）。また、ドライバー不足が深刻化するなかで（林，2020，9頁）、配送の担い手をどのように確保し、組織するかは、EC事業者や物流事業者にとって重要な課題となっている。Amazonが日本の物流環境にどのように適応し、配送の担い手をどのように組織してきたのかを明らかにすることは、日本におけるラストマイル配送体制のあり方を考えるうえでも意義があると考えられる。</w:t>
       </w:r>
     </w:p>
     <w:p>
@@ -4782,7 +3842,7 @@
           <w:szCs w:val="24"/>
           <w:lang w:eastAsia="ja-JP"/>
         </w:rPr>
-        <w:t>ラストマイル配送に関する研究は、大きく二つの視点から行われてきた。第一は、顧客の視点から、配送の品質と顧客満足との関係を検討する研究である。丁（2023）は、ECのフルフィルメントに関する先行研究をレビューし、注文の追跡や適時性、商品の状態といった配送段階のフルフィルメント要素が顧客満足に影響を与えることを示している。また丁（2026）は、ラストマイル配送における情報品質が、顧客満足と再利用意向に与える影響を検討している。</w:t>
+        <w:t>ラストマイル配送に関する研究は、大きく二つの視点から行われてきた。第一は、顧客の視点から、配送の品質と顧客満足との関係を検討する研究である。丁（2023，8頁）は、ECのフルフィルメントに関する先行研究をレビューし、注文の追跡や適時性、商品の状態といった配送段階のフルフィルメント要素が顧客満足に影響を与えることを示している。また丁（2026，39頁）は、ラストマイル配送における情報品質が、顧客満足と再利用意向に与える影響を検討している。</w:t>
       </w:r>
     </w:p>
     <w:p>
@@ -4804,7 +3864,7 @@
           <w:szCs w:val="24"/>
           <w:lang w:eastAsia="ja-JP"/>
         </w:rPr>
-        <w:t>第二は、物流事業者や産業の視点から、ラストマイル配送を担う体制の課題を検討する研究である。林（2020）は、ネット通販の急増とドライバー不足を背景とする宅配危機を論じ、ラストマイルが自動化の困難な最も労働集約的な工程であり、物流革新の大きな障壁となっていることを指摘している。</w:t>
+        <w:t>第二は、物流事業者や産業の視点から、ラストマイル配送を担う体制の課題を検討する研究である。林（2020）は、ネット通販の急増とドライバー不足を背景とする宅配危機を論じ（9頁）、ラストマイルが自動化の困難な最も労働集約的な工程であり、物流革新の大きな障壁となっていることを指摘している（13-14頁）。</w:t>
       </w:r>
     </w:p>
     <w:p>
@@ -4826,7 +3886,7 @@
           <w:szCs w:val="24"/>
           <w:lang w:eastAsia="ja-JP"/>
         </w:rPr>
-        <w:t>これらの研究は、ラストマイル配送の重要性と課題を明らかにしている。しかし、EC事業者が配送の担い手を誰に求め、どのように組織し、どの程度管理するのかという点については、林（2020）がAmazonによる配送事業者の組織化に触れているものの、主たる検討対象とはなっていない。</w:t>
+        <w:t>これらの研究は、ラストマイル配送の重要性と課題を明らかにしている。しかし、EC事業者が配送の担い手を誰に求め、どのように組織し、どの程度管理するのかという点については、林（2020，10頁，13頁）がAmazonによる配送事業者の組織化に触れているものの、主たる検討対象とはなっていない。</w:t>
       </w:r>
     </w:p>
     <w:p>
@@ -4871,7 +3931,7 @@
           <w:szCs w:val="24"/>
           <w:lang w:eastAsia="ja-JP"/>
         </w:rPr>
-        <w:t>Amazonの配送体制を正面から取り上げているのが、齊藤による一連の研究である。齊藤（2021）は、Amazonの物流戦略を検討し、米国のAmazonが大手宅配便事業者への依存から脱却し、Amazon FlexやDSPなどを通じて自らコントロールする配送を拡大してきた過程を明らかにした）。齊藤（2022）は、これを日米比較へと発展させた。そこでは、米国のAmazonがフランチャイズ方式でAmazon専属の小規模な運送業者を起業させ、その配送を監視・評価しているのに対し、アマゾンジャパンはADPに配送を委託し、その下で協力会社や個人の軽貨物運送事業者が配送を担っていることが示されている。</w:t>
+        <w:t>Amazonの配送体制を正面から取り上げているのが、齊藤による一連の研究である。齊藤（2021）は、Amazonの物流戦略を検討し、米国のAmazonが大手宅配便事業者への依存から脱却し、Amazon FlexやDSPなどを通じて自らコントロールする配送を拡大してきた過程を明らかにした（53-56頁，59-60頁）。齊藤（2022）は、これを日米比較へと発展させた。そこでは、米国のAmazonがフランチャイズ方式でAmazon専属の小規模な運送業者を起業させ、その配送を監視・評価しているのに対し、アマゾンジャパンはADPに配送を委託し、その下で協力会社や個人の軽貨物運送事業者が配送を担っていることが示されている（64-65頁）。</w:t>
       </w:r>
     </w:p>
     <w:p>
@@ -4893,7 +3953,7 @@
           <w:szCs w:val="24"/>
           <w:lang w:eastAsia="ja-JP"/>
         </w:rPr>
-        <w:t>日本の近年の動向については、齊藤（2023）が、宅配便以外で運ばれる、いわゆる「隠れ宅配」の増加を指摘したうえで、ADPとAmazon Flexでは費用構造が異なり、Amazonは需要の変動に対応するため、宅配便、ADP、Amazon Flexという費用構造の異なる三つの配送主体に依存していると論じている。また林（2023）は、2024年問題が近づくなかで、2023年に配送会社の起業を支援する新たなプログラムが導入されたことを指摘している。さらに長谷川（2023）は、ADP、Amazon Flex、AHDPなど、ラストマイル配送の最新の動向を整理している。</w:t>
+        <w:t>日本の近年の動向については、齊藤（2023）が、宅配便以外で運ばれる、いわゆる「隠れ宅配」の増加を指摘したうえで（36-37頁）、ADPとAmazon Flexでは費用構造が異なり、Amazonは需要の変動に対応するため、宅配便、ADP、Amazon Flexという費用構造の異なる三つの配送主体に依存していると論じている（41頁）。また林（2023，10頁）は、2024年問題が近づくなかで、2023年に配送会社の起業を支援する新たなプログラムが導入されたことを指摘している。さらに長谷川（2023，44-49頁）は、ADP、Amazon Flex、AHDPなど、ラストマイル配送の最新の動向を整理している。</w:t>
       </w:r>
     </w:p>
     <w:p>
@@ -4939,7 +3999,7 @@
           <w:szCs w:val="24"/>
           <w:lang w:eastAsia="ja-JP"/>
         </w:rPr>
-        <w:t>以上の先行研究により、Amazonが日米で脱宅配便を進め、それぞれ異なる担い手と管理方式によって配送体制を構築してきた実態は、詳細に明らかにされてきた。なかでも齊藤（2022）は、日米の取り組みを比較した研究として重要である。</w:t>
+        <w:t>以上の先行研究により、Amazonが日米で脱宅配便を進め、それぞれ異なる担い手と管理方式によって配送体制を構築してきた実態は、詳細に明らかにされてきた。なかでも齊藤（2022，44-65頁）は、日米の取り組みを比較した研究として重要である。</w:t>
       </w:r>
     </w:p>
     <w:p>
@@ -4961,7 +4021,7 @@
           <w:szCs w:val="24"/>
           <w:lang w:eastAsia="ja-JP"/>
         </w:rPr>
-        <w:t>しかし、残された課題として次の三点が挙げられる。第一に、日米の違いがなぜ生じたのかについての理論的な説明である。齊藤（2022）は、日米でネット通販を取り巻く物流の仕組みや状況が異なることを違いの背景として挙げているが、物流環境のどのような違いが、どのような論理を通じて配送方式の違いをもたらしたのかは、十分に説明されていない。第二に、比較の尺度である。各配送主体の特徴や費用構造は明らかにされているものの（齊藤，2023）、それらを契約形態や管理の程度といった共通の尺度で比較する枠組みは示されていない。第三に、時間的な変化の扱いである。齊藤（2022）の刊行後には日本DSPが導入されており、こうした変化を含めて日米の違いを捉え直す必要がある。</w:t>
+        <w:t>しかし、残された課題として次の三点が挙げられる。第一に、日米の違いがなぜ生じたのかについての理論的な説明である。齊藤（2022，44頁）は、日米でネット通販を取り巻く物流の仕組みや状況が異なることを違いの背景として挙げているが、物流環境のどのような違いが、どのような論理を通じて配送方式の違いをもたらしたのかは、十分に説明されていない。第二に、比較の尺度である。各配送主体の特徴や費用構造は明らかにされているものの（齊藤，2023，41頁）、それらを契約形態や管理の程度といった共通の尺度で比較する枠組みは示されていない。第三に、時間的な変化の扱いである。齊藤（2022）の刊行後には日本DSPが導入されており、こうした変化を含めて日米の違いを捉え直す必要がある。</w:t>
       </w:r>
     </w:p>
     <w:p>
@@ -5075,172 +4135,7 @@
           <w:sz w:val="24"/>
           <w:lang w:eastAsia="ja-JP"/>
         </w:rPr>
-        <w:t>取引費用論の出発点は、</w:t>
-      </w:r>
-      <w:r>
-        <w:rPr>
-          <w:rFonts w:ascii="Century" w:hAnsi="Century" w:eastAsia="ＭＳ 明朝"/>
-          <w:sz w:val="24"/>
-          <w:lang w:eastAsia="ja-JP"/>
-        </w:rPr>
-        <w:t>Coase</w:t>
-      </w:r>
-      <w:r>
-        <w:rPr>
-          <w:rFonts w:ascii="Century" w:hAnsi="Century" w:eastAsia="ＭＳ 明朝"/>
-          <w:sz w:val="24"/>
-          <w:lang w:eastAsia="ja-JP"/>
-        </w:rPr>
-        <w:t>（</w:t>
-      </w:r>
-      <w:r>
-        <w:rPr>
-          <w:rFonts w:ascii="Century" w:hAnsi="Century" w:eastAsia="ＭＳ 明朝"/>
-          <w:sz w:val="24"/>
-          <w:lang w:eastAsia="ja-JP"/>
-        </w:rPr>
-        <w:t>1937</w:t>
-      </w:r>
-      <w:r>
-        <w:rPr>
-          <w:rFonts w:ascii="Century" w:hAnsi="Century" w:eastAsia="ＭＳ 明朝"/>
-          <w:sz w:val="24"/>
-          <w:lang w:eastAsia="ja-JP"/>
-        </w:rPr>
-        <w:t>）の問題提起にある。</w:t>
-      </w:r>
-      <w:r>
-        <w:rPr>
-          <w:rFonts w:ascii="Century" w:hAnsi="Century" w:eastAsia="ＭＳ 明朝"/>
-          <w:sz w:val="24"/>
-          <w:lang w:eastAsia="ja-JP"/>
-        </w:rPr>
-        <w:t>Coase（1937</w:t>
-      </w:r>
-      <w:r>
-        <w:rPr>
-          <w:rFonts w:ascii="Century" w:hAnsi="Century" w:eastAsia="ＭＳ 明朝"/>
-          <w:sz w:val="24"/>
-          <w:lang w:eastAsia="ja-JP"/>
-        </w:rPr>
-      </w:r>
-      <w:r>
-        <w:rPr>
-          <w:rFonts w:ascii="Century" w:hAnsi="Century" w:eastAsia="ＭＳ 明朝"/>
-          <w:sz w:val="24"/>
-          <w:lang w:eastAsia="ja-JP"/>
-        </w:rPr>
-      </w:r>
-      <w:r>
-        <w:rPr>
-          <w:rFonts w:ascii="Century" w:hAnsi="Century" w:eastAsia="ＭＳ 明朝"/>
-          <w:sz w:val="24"/>
-          <w:lang w:eastAsia="ja-JP"/>
-        </w:rPr>
-      </w:r>
-      <w:r>
-        <w:rPr>
-          <w:rFonts w:ascii="Century" w:hAnsi="Century" w:eastAsia="ＭＳ 明朝"/>
-          <w:sz w:val="24"/>
-          <w:lang w:eastAsia="ja-JP"/>
-        </w:rPr>
-      </w:r>
-      <w:r>
-        <w:rPr>
-          <w:rFonts w:ascii="Century" w:hAnsi="Century" w:eastAsia="ＭＳ 明朝"/>
-          <w:sz w:val="24"/>
-          <w:lang w:eastAsia="ja-JP"/>
-        </w:rPr>
-        <w:t>）は、企業が設立される主な理由を、価格メカニズムを利用するための費用、すなわち適切な価格を見いだす費用や、取引ごとに契約を交渉・締結する費用の存在に求めた。そして企業は、追加的な取引を企業内部で組織化する費用が、同じ取引を市場で行う費用と等しくなるところまで拡大するとされる（</w:t>
-      </w:r>
-      <w:r>
-        <w:rPr>
-          <w:rFonts w:ascii="Century" w:hAnsi="Century" w:eastAsia="ＭＳ 明朝"/>
-          <w:sz w:val="24"/>
-          <w:lang w:eastAsia="ja-JP"/>
-        </w:rPr>
-        <w:t>Coase，1937</w:t>
-      </w:r>
-      <w:r>
-        <w:rPr>
-          <w:rFonts w:ascii="Century" w:hAnsi="Century" w:eastAsia="ＭＳ 明朝"/>
-          <w:sz w:val="24"/>
-          <w:lang w:eastAsia="ja-JP"/>
-        </w:rPr>
-      </w:r>
-      <w:r>
-        <w:rPr>
-          <w:rFonts w:ascii="Century" w:hAnsi="Century" w:eastAsia="ＭＳ 明朝"/>
-          <w:sz w:val="24"/>
-          <w:lang w:eastAsia="ja-JP"/>
-        </w:rPr>
-      </w:r>
-      <w:r>
-        <w:rPr>
-          <w:rFonts w:ascii="Century" w:hAnsi="Century" w:eastAsia="ＭＳ 明朝"/>
-          <w:sz w:val="24"/>
-          <w:lang w:eastAsia="ja-JP"/>
-        </w:rPr>
-      </w:r>
-      <w:r>
-        <w:rPr>
-          <w:rFonts w:ascii="Century" w:hAnsi="Century" w:eastAsia="ＭＳ 明朝"/>
-          <w:sz w:val="24"/>
-          <w:lang w:eastAsia="ja-JP"/>
-        </w:rPr>
-      </w:r>
-      <w:r>
-        <w:rPr>
-          <w:rFonts w:ascii="Century" w:hAnsi="Century" w:eastAsia="ＭＳ 明朝"/>
-          <w:sz w:val="24"/>
-          <w:lang w:eastAsia="ja-JP"/>
-        </w:rPr>
-        <w:t>）。鈴木（</w:t>
-      </w:r>
-      <w:r>
-        <w:rPr>
-          <w:rFonts w:ascii="Century" w:hAnsi="Century" w:eastAsia="ＭＳ 明朝"/>
-          <w:sz w:val="24"/>
-          <w:lang w:eastAsia="ja-JP"/>
-        </w:rPr>
-        <w:t>2006</w:t>
-      </w:r>
-      <w:r>
-        <w:rPr>
-          <w:rFonts w:ascii="Century" w:hAnsi="Century" w:eastAsia="ＭＳ 明朝"/>
-          <w:sz w:val="24"/>
-          <w:lang w:eastAsia="ja-JP"/>
-        </w:rPr>
-        <w:t>）にもとづく武田（2013</w:t>
-      </w:r>
-      <w:r>
-        <w:rPr>
-          <w:rFonts w:ascii="Century" w:hAnsi="Century" w:eastAsia="ＭＳ 明朝"/>
-          <w:sz w:val="24"/>
-          <w:lang w:eastAsia="ja-JP"/>
-        </w:rPr>
-      </w:r>
-      <w:r>
-        <w:rPr>
-          <w:rFonts w:ascii="Century" w:hAnsi="Century" w:eastAsia="ＭＳ 明朝"/>
-          <w:sz w:val="24"/>
-          <w:lang w:eastAsia="ja-JP"/>
-        </w:rPr>
-      </w:r>
-      <w:r>
-        <w:rPr>
-          <w:rFonts w:ascii="Century" w:hAnsi="Century" w:eastAsia="ＭＳ 明朝"/>
-          <w:sz w:val="24"/>
-          <w:lang w:eastAsia="ja-JP"/>
-        </w:rPr>
-      </w:r>
-      <w:r>
-        <w:rPr>
-          <w:rFonts w:ascii="Century" w:hAnsi="Century" w:eastAsia="ＭＳ 明朝"/>
-          <w:sz w:val="24"/>
-          <w:lang w:eastAsia="ja-JP"/>
-        </w:rPr>
-        <w:t>）の整理によれば、取引費用には、取引相手の探索、交渉、契約作成といった取引前の費用と、契約履行のモニタリングや執行といった取引後の費用が含まれる。</w:t>
+        <w:t>取引費用論の出発点は、Coase（1937）の問題提起にある。Coase（1937，390-391頁）は、企業が設立される主な理由を、価格メカニズムを利用するための費用、すなわち適切な価格を見いだす費用や、取引ごとに契約を交渉・締結する費用の存在に求めた。そして企業は、追加的な取引を企業内部で組織化する費用が、同じ取引を市場で行う費用と等しくなるところまで拡大するとされる（Coase，1937，394-395頁）。武田（2013，317-318頁）の整理によれば、取引費用には、取引相手の探索、交渉、契約作成といった取引前の費用と、契約履行のモニタリングや執行といった取引後の費用が含まれる。</w:t>
       </w:r>
     </w:p>
     <w:p>
@@ -5258,227 +4153,10 @@
           <w:sz w:val="24"/>
           <w:lang w:eastAsia="ja-JP"/>
         </w:rPr>
-        <w:t>Coase</w:t>
-      </w:r>
-      <w:r>
-        <w:rPr>
-          <w:rFonts w:ascii="Century" w:hAnsi="Century" w:eastAsia="ＭＳ 明朝"/>
-          <w:sz w:val="24"/>
-          <w:lang w:eastAsia="ja-JP"/>
-        </w:rPr>
-        <w:t>が必ずしも明確にしなかった、市場での取引に費用が生じる理由を、</w:t>
-      </w:r>
-      <w:r>
-        <w:rPr>
-          <w:rFonts w:ascii="Century" w:hAnsi="Century" w:eastAsia="ＭＳ 明朝"/>
-          <w:sz w:val="24"/>
-          <w:lang w:eastAsia="ja-JP"/>
-        </w:rPr>
-        <w:t>Williamson</w:t>
-      </w:r>
-      <w:r>
-        <w:rPr>
-          <w:rFonts w:ascii="Century" w:hAnsi="Century" w:eastAsia="ＭＳ 明朝"/>
-          <w:sz w:val="24"/>
-          <w:lang w:eastAsia="ja-JP"/>
-        </w:rPr>
-        <w:t>は人間行動の二つの特性、すなわち限定合理性と機会主義に求めた（武田，2013</w:t>
-      </w:r>
-      <w:r>
-        <w:rPr>
-          <w:rFonts w:ascii="Century" w:hAnsi="Century" w:eastAsia="ＭＳ 明朝"/>
-          <w:sz w:val="24"/>
-          <w:lang w:eastAsia="ja-JP"/>
-        </w:rPr>
-      </w:r>
-      <w:r>
-        <w:rPr>
-          <w:rFonts w:ascii="Century" w:hAnsi="Century" w:eastAsia="ＭＳ 明朝"/>
-          <w:sz w:val="24"/>
-          <w:lang w:eastAsia="ja-JP"/>
-        </w:rPr>
-      </w:r>
-      <w:r>
-        <w:rPr>
-          <w:rFonts w:ascii="Century" w:hAnsi="Century" w:eastAsia="ＭＳ 明朝"/>
-          <w:sz w:val="24"/>
-          <w:lang w:eastAsia="ja-JP"/>
-        </w:rPr>
-      </w:r>
-      <w:r>
-        <w:rPr>
-          <w:rFonts w:ascii="Century" w:hAnsi="Century" w:eastAsia="ＭＳ 明朝"/>
-          <w:sz w:val="24"/>
-          <w:lang w:eastAsia="ja-JP"/>
-        </w:rPr>
-        <w:t>）。限定合理性とは、人間は合理的であろうと意図するものの、その合理性には限界がある（</w:t>
-      </w:r>
-      <w:r>
-        <w:rPr>
-          <w:rFonts w:ascii="Century" w:hAnsi="Century" w:eastAsia="ＭＳ 明朝"/>
-          <w:sz w:val="24"/>
-          <w:lang w:eastAsia="ja-JP"/>
-        </w:rPr>
-        <w:t>"intendedly rational, but only limitedly so"</w:t>
-      </w:r>
-      <w:r>
-        <w:rPr>
-          <w:rFonts w:ascii="Century" w:hAnsi="Century" w:eastAsia="ＭＳ 明朝"/>
-          <w:sz w:val="24"/>
-          <w:lang w:eastAsia="ja-JP"/>
-        </w:rPr>
-        <w:t>）ことを指す（</w:t>
-      </w:r>
-      <w:r>
-        <w:rPr>
-          <w:rFonts w:ascii="Century" w:hAnsi="Century" w:eastAsia="ＭＳ 明朝"/>
-          <w:sz w:val="24"/>
-          <w:lang w:eastAsia="ja-JP"/>
-        </w:rPr>
-        <w:t>Simon，1961</w:t>
-      </w:r>
-      <w:r>
-        <w:rPr>
-          <w:rFonts w:ascii="Century" w:hAnsi="Century" w:eastAsia="ＭＳ 明朝"/>
-          <w:sz w:val="24"/>
-          <w:lang w:eastAsia="ja-JP"/>
-        </w:rPr>
-      </w:r>
-      <w:r>
-        <w:rPr>
-          <w:rFonts w:ascii="Century" w:hAnsi="Century" w:eastAsia="ＭＳ 明朝"/>
-          <w:sz w:val="24"/>
-          <w:lang w:eastAsia="ja-JP"/>
-        </w:rPr>
-      </w:r>
-      <w:r>
-        <w:rPr>
-          <w:rFonts w:ascii="Century" w:hAnsi="Century" w:eastAsia="ＭＳ 明朝"/>
-          <w:sz w:val="24"/>
-          <w:lang w:eastAsia="ja-JP"/>
-        </w:rPr>
+        <w:t>Coaseが必ずしも明確にしなかった、市場での取引に費用が生じる理由を、Williamsonは人間行動の二つの特性、すなわち限定合理性と機会主義に求めた（武田，2013，324頁）。Williamson（1985，30頁）によれば、限定合理性とは、人間は合理的であろうと意図するものの、その合理性には限界がある（"intendedly rational, but only limitedly so"）ことを指す。機会主義とは、狡猾さを伴って自己の利益を追求すること（self-interest seeking with guile）である（Williamson，1985，30頁）。</w:t>
       </w:r>
       <w:proofErr w:type="spellStart"/>
-      <w:r>
-        <w:rPr>
-          <w:rFonts w:ascii="Century" w:hAnsi="Century" w:eastAsia="ＭＳ 明朝"/>
-          <w:sz w:val="24"/>
-          <w:lang w:eastAsia="ja-JP"/>
-        </w:rPr>
-      </w:r>
       <w:proofErr w:type="spellEnd"/>
-      <w:r>
-        <w:rPr>
-          <w:rFonts w:ascii="Century" w:hAnsi="Century" w:eastAsia="ＭＳ 明朝"/>
-          <w:sz w:val="24"/>
-          <w:lang w:eastAsia="ja-JP"/>
-        </w:rPr>
-        <w:t>；</w:t>
-      </w:r>
-      <w:r>
-        <w:rPr>
-          <w:rFonts w:ascii="Century" w:hAnsi="Century" w:eastAsia="ＭＳ 明朝"/>
-          <w:sz w:val="24"/>
-          <w:lang w:eastAsia="ja-JP"/>
-        </w:rPr>
-        <w:t>Williamson，1985</w:t>
-      </w:r>
-      <w:r>
-        <w:rPr>
-          <w:rFonts w:ascii="Century" w:hAnsi="Century" w:eastAsia="ＭＳ 明朝"/>
-          <w:sz w:val="24"/>
-          <w:lang w:eastAsia="ja-JP"/>
-        </w:rPr>
-      </w:r>
-      <w:r>
-        <w:rPr>
-          <w:rFonts w:ascii="Century" w:hAnsi="Century" w:eastAsia="ＭＳ 明朝"/>
-          <w:sz w:val="24"/>
-          <w:lang w:eastAsia="ja-JP"/>
-        </w:rPr>
-      </w:r>
-      <w:r>
-        <w:rPr>
-          <w:rFonts w:ascii="Century" w:hAnsi="Century" w:eastAsia="ＭＳ 明朝"/>
-          <w:sz w:val="24"/>
-          <w:lang w:eastAsia="ja-JP"/>
-        </w:rPr>
-      </w:r>
-      <w:r>
-        <w:rPr>
-          <w:rFonts w:ascii="Century" w:hAnsi="Century" w:eastAsia="ＭＳ 明朝"/>
-          <w:sz w:val="24"/>
-          <w:lang w:eastAsia="ja-JP"/>
-        </w:rPr>
-      </w:r>
-      <w:r>
-        <w:rPr>
-          <w:rFonts w:ascii="Century" w:hAnsi="Century" w:eastAsia="ＭＳ 明朝"/>
-          <w:sz w:val="24"/>
-          <w:lang w:eastAsia="ja-JP"/>
-        </w:rPr>
-        <w:t>より引用）。機会主義とは、狡猾さを伴って自己の利益を追求すること（</w:t>
-      </w:r>
-      <w:r>
-        <w:rPr>
-          <w:rFonts w:ascii="Century" w:hAnsi="Century" w:eastAsia="ＭＳ 明朝"/>
-          <w:sz w:val="24"/>
-          <w:lang w:eastAsia="ja-JP"/>
-        </w:rPr>
-        <w:t>self-interest seeking with guile</w:t>
-      </w:r>
-      <w:r>
-        <w:rPr>
-          <w:rFonts w:ascii="Century" w:hAnsi="Century" w:eastAsia="ＭＳ 明朝"/>
-          <w:sz w:val="24"/>
-          <w:lang w:eastAsia="ja-JP"/>
-        </w:rPr>
-        <w:t>）である（</w:t>
-      </w:r>
-      <w:r>
-        <w:rPr>
-          <w:rFonts w:ascii="Century" w:hAnsi="Century" w:eastAsia="ＭＳ 明朝"/>
-          <w:sz w:val="24"/>
-          <w:lang w:eastAsia="ja-JP"/>
-        </w:rPr>
-        <w:t>Williamson，1985</w:t>
-      </w:r>
-      <w:r>
-        <w:rPr>
-          <w:rFonts w:ascii="Century" w:hAnsi="Century" w:eastAsia="ＭＳ 明朝"/>
-          <w:sz w:val="24"/>
-          <w:lang w:eastAsia="ja-JP"/>
-        </w:rPr>
-      </w:r>
-      <w:r>
-        <w:rPr>
-          <w:rFonts w:ascii="Century" w:hAnsi="Century" w:eastAsia="ＭＳ 明朝"/>
-          <w:sz w:val="24"/>
-          <w:lang w:eastAsia="ja-JP"/>
-        </w:rPr>
-      </w:r>
-      <w:r>
-        <w:rPr>
-          <w:rFonts w:ascii="Century" w:hAnsi="Century" w:eastAsia="ＭＳ 明朝"/>
-          <w:sz w:val="24"/>
-          <w:lang w:eastAsia="ja-JP"/>
-        </w:rPr>
-      </w:r>
-      <w:r>
-        <w:rPr>
-          <w:rFonts w:ascii="Century" w:hAnsi="Century" w:eastAsia="ＭＳ 明朝"/>
-          <w:sz w:val="24"/>
-          <w:lang w:eastAsia="ja-JP"/>
-        </w:rPr>
-      </w:r>
-      <w:r>
-        <w:rPr>
-          <w:rFonts w:ascii="Century" w:hAnsi="Century" w:eastAsia="ＭＳ 明朝"/>
-          <w:sz w:val="24"/>
-          <w:lang w:eastAsia="ja-JP"/>
-        </w:rPr>
-        <w:t>）。</w:t>
-      </w:r>
     </w:p>
     <w:p>
       <w:pPr>
@@ -5495,87 +4173,7 @@
           <w:sz w:val="24"/>
           <w:lang w:eastAsia="ja-JP"/>
         </w:rPr>
-        <w:t>Williamson（1985</w:t>
-      </w:r>
-      <w:r>
-        <w:rPr>
-          <w:rFonts w:ascii="Century" w:hAnsi="Century" w:eastAsia="ＭＳ 明朝"/>
-          <w:sz w:val="24"/>
-          <w:lang w:eastAsia="ja-JP"/>
-        </w:rPr>
-      </w:r>
-      <w:r>
-        <w:rPr>
-          <w:rFonts w:ascii="Century" w:hAnsi="Century" w:eastAsia="ＭＳ 明朝"/>
-          <w:sz w:val="24"/>
-          <w:lang w:eastAsia="ja-JP"/>
-        </w:rPr>
-      </w:r>
-      <w:r>
-        <w:rPr>
-          <w:rFonts w:ascii="Century" w:hAnsi="Century" w:eastAsia="ＭＳ 明朝"/>
-          <w:sz w:val="24"/>
-          <w:lang w:eastAsia="ja-JP"/>
-        </w:rPr>
-      </w:r>
-      <w:r>
-        <w:rPr>
-          <w:rFonts w:ascii="Century" w:hAnsi="Century" w:eastAsia="ＭＳ 明朝"/>
-          <w:sz w:val="24"/>
-          <w:lang w:eastAsia="ja-JP"/>
-        </w:rPr>
-      </w:r>
-      <w:r>
-        <w:rPr>
-          <w:rFonts w:ascii="Century" w:hAnsi="Century" w:eastAsia="ＭＳ 明朝"/>
-          <w:sz w:val="24"/>
-          <w:lang w:eastAsia="ja-JP"/>
-        </w:rPr>
-        <w:t>）によれば、不確実性のもとで限定合理性、機会主義、資産特殊性の三つが同時に存在すると、事前の計画は不完全となり、約束は守られないおそれがあり、取引相手が誰であるかが重要になる。この場合、裁判所による契約の執行には限界があるため、当事者間の私的な統治の仕組みが必要となる。そこでの課題は、限定合理性を節約しつつ、機会主義の危険から取引を保護するように取引を組織することである（</w:t>
-      </w:r>
-      <w:r>
-        <w:rPr>
-          <w:rFonts w:ascii="Century" w:hAnsi="Century" w:eastAsia="ＭＳ 明朝"/>
-          <w:sz w:val="24"/>
-          <w:lang w:eastAsia="ja-JP"/>
-        </w:rPr>
-        <w:t>Williamson，1985</w:t>
-      </w:r>
-      <w:r>
-        <w:rPr>
-          <w:rFonts w:ascii="Century" w:hAnsi="Century" w:eastAsia="ＭＳ 明朝"/>
-          <w:sz w:val="24"/>
-          <w:lang w:eastAsia="ja-JP"/>
-        </w:rPr>
-      </w:r>
-      <w:r>
-        <w:rPr>
-          <w:rFonts w:ascii="Century" w:hAnsi="Century" w:eastAsia="ＭＳ 明朝"/>
-          <w:sz w:val="24"/>
-          <w:lang w:eastAsia="ja-JP"/>
-        </w:rPr>
-      </w:r>
-      <w:r>
-        <w:rPr>
-          <w:rFonts w:ascii="Century" w:hAnsi="Century" w:eastAsia="ＭＳ 明朝"/>
-          <w:sz w:val="24"/>
-          <w:lang w:eastAsia="ja-JP"/>
-        </w:rPr>
-      </w:r>
-      <w:r>
-        <w:rPr>
-          <w:rFonts w:ascii="Century" w:hAnsi="Century" w:eastAsia="ＭＳ 明朝"/>
-          <w:sz w:val="24"/>
-          <w:lang w:eastAsia="ja-JP"/>
-        </w:rPr>
-      </w:r>
-      <w:r>
-        <w:rPr>
-          <w:rFonts w:ascii="Century" w:hAnsi="Century" w:eastAsia="ＭＳ 明朝"/>
-          <w:sz w:val="24"/>
-          <w:lang w:eastAsia="ja-JP"/>
-        </w:rPr>
-        <w:t>）。</w:t>
+        <w:t>Williamson（1985，30-32頁）によれば、不確実性のもとで限定合理性、機会主義、資産特殊性の三つが同時に存在すると、事前の計画は不完全となり、約束は守られないおそれがあり、取引相手が誰であるかが重要になる。この場合、裁判所による契約の執行には限界があるため、当事者間の私的な統治の仕組みが必要となる。そこでの課題は、限定合理性を節約しつつ、機会主義の危険から取引を保護するように取引を組織することである（Williamson，1985，32頁）。</w:t>
       </w:r>
     </w:p>
     <w:p>
@@ -5621,43 +4219,7 @@
           <w:sz w:val="24"/>
           <w:lang w:eastAsia="ja-JP"/>
         </w:rPr>
-        <w:t>Williamson（1991</w:t>
-      </w:r>
-      <w:r>
-        <w:rPr>
-          <w:rFonts w:ascii="Century" w:hAnsi="Century" w:eastAsia="ＭＳ 明朝"/>
-          <w:sz w:val="24"/>
-          <w:lang w:eastAsia="ja-JP"/>
-        </w:rPr>
-      </w:r>
-      <w:r>
-        <w:rPr>
-          <w:rFonts w:ascii="Century" w:hAnsi="Century" w:eastAsia="ＭＳ 明朝"/>
-          <w:sz w:val="24"/>
-          <w:lang w:eastAsia="ja-JP"/>
-        </w:rPr>
-      </w:r>
-      <w:r>
-        <w:rPr>
-          <w:rFonts w:ascii="Century" w:hAnsi="Century" w:eastAsia="ＭＳ 明朝"/>
-          <w:sz w:val="24"/>
-          <w:lang w:eastAsia="ja-JP"/>
-        </w:rPr>
-      </w:r>
-      <w:r>
-        <w:rPr>
-          <w:rFonts w:ascii="Century" w:hAnsi="Century" w:eastAsia="ＭＳ 明朝"/>
-          <w:sz w:val="24"/>
-          <w:lang w:eastAsia="ja-JP"/>
-        </w:rPr>
-      </w:r>
-      <w:r>
-        <w:rPr>
-          <w:rFonts w:ascii="Century" w:hAnsi="Century" w:eastAsia="ＭＳ 明朝"/>
-          <w:sz w:val="24"/>
-          <w:lang w:eastAsia="ja-JP"/>
-        </w:rPr>
-        <w:t>）は、取引を分析の基本単位とし、取引の違いを捉える主要な次元として、取引が繰り返される頻度、取引がさらされる不確実性、財やサービスの供給に伴う資産特殊性の種類と程度の三つを挙げ、なかでも資産特殊性を重視している。</w:t>
+        <w:t>Williamson（1991，281頁）は、取引を分析の基本単位とし、取引の違いを捉える主要な次元として、取引が繰り返される頻度、取引がさらされる不確実性、財やサービスの供給に伴う資産特殊性の種類と程度の三つを挙げ、なかでも資産特殊性を重視している。</w:t>
       </w:r>
     </w:p>
     <w:p>
@@ -5675,328 +4237,7 @@
           <w:sz w:val="24"/>
           <w:lang w:eastAsia="ja-JP"/>
         </w:rPr>
-        <w:t>資産特殊性とは、ある資産を、その生産的価値を損なうことなく、別の用途や別の使用者に転用できる程度を指す（</w:t>
-      </w:r>
-      <w:r>
-        <w:rPr>
-          <w:rFonts w:ascii="Century" w:hAnsi="Century" w:eastAsia="ＭＳ 明朝"/>
-          <w:sz w:val="24"/>
-          <w:lang w:eastAsia="ja-JP"/>
-        </w:rPr>
-        <w:t>Williamson，1991</w:t>
-      </w:r>
-      <w:r>
-        <w:rPr>
-          <w:rFonts w:ascii="Century" w:hAnsi="Century" w:eastAsia="ＭＳ 明朝"/>
-          <w:sz w:val="24"/>
-          <w:lang w:eastAsia="ja-JP"/>
-        </w:rPr>
-      </w:r>
-      <w:r>
-        <w:rPr>
-          <w:rFonts w:ascii="Century" w:hAnsi="Century" w:eastAsia="ＭＳ 明朝"/>
-          <w:sz w:val="24"/>
-          <w:lang w:eastAsia="ja-JP"/>
-        </w:rPr>
-      </w:r>
-      <w:r>
-        <w:rPr>
-          <w:rFonts w:ascii="Century" w:hAnsi="Century" w:eastAsia="ＭＳ 明朝"/>
-          <w:sz w:val="24"/>
-          <w:lang w:eastAsia="ja-JP"/>
-        </w:rPr>
-      </w:r>
-      <w:r>
-        <w:rPr>
-          <w:rFonts w:ascii="Century" w:hAnsi="Century" w:eastAsia="ＭＳ 明朝"/>
-          <w:sz w:val="24"/>
-          <w:lang w:eastAsia="ja-JP"/>
-        </w:rPr>
-      </w:r>
-      <w:r>
-        <w:rPr>
-          <w:rFonts w:ascii="Century" w:hAnsi="Century" w:eastAsia="ＭＳ 明朝"/>
-          <w:sz w:val="24"/>
-          <w:lang w:eastAsia="ja-JP"/>
-        </w:rPr>
-        <w:t>）。言い換えれば、特定の取引のために行われた投資が、他の用途や取引相手に転用された場合にどれだけ価値を失うかを示す概念である（</w:t>
-      </w:r>
-      <w:r>
-        <w:rPr>
-          <w:rFonts w:ascii="Century" w:hAnsi="Century" w:eastAsia="ＭＳ 明朝"/>
-          <w:sz w:val="24"/>
-          <w:lang w:eastAsia="ja-JP"/>
-        </w:rPr>
-        <w:t>Williamson，1991</w:t>
-      </w:r>
-      <w:r>
-        <w:rPr>
-          <w:rFonts w:ascii="Century" w:hAnsi="Century" w:eastAsia="ＭＳ 明朝"/>
-          <w:sz w:val="24"/>
-          <w:lang w:eastAsia="ja-JP"/>
-        </w:rPr>
-      </w:r>
-      <w:r>
-        <w:rPr>
-          <w:rFonts w:ascii="Century" w:hAnsi="Century" w:eastAsia="ＭＳ 明朝"/>
-          <w:sz w:val="24"/>
-          <w:lang w:eastAsia="ja-JP"/>
-        </w:rPr>
-      </w:r>
-      <w:r>
-        <w:rPr>
-          <w:rFonts w:ascii="Century" w:hAnsi="Century" w:eastAsia="ＭＳ 明朝"/>
-          <w:sz w:val="24"/>
-          <w:lang w:eastAsia="ja-JP"/>
-        </w:rPr>
-      </w:r>
-      <w:r>
-        <w:rPr>
-          <w:rFonts w:ascii="Century" w:hAnsi="Century" w:eastAsia="ＭＳ 明朝"/>
-          <w:sz w:val="24"/>
-          <w:lang w:eastAsia="ja-JP"/>
-        </w:rPr>
-      </w:r>
-      <w:r>
-        <w:rPr>
-          <w:rFonts w:ascii="Century" w:hAnsi="Century" w:eastAsia="ＭＳ 明朝"/>
-          <w:sz w:val="24"/>
-          <w:lang w:eastAsia="ja-JP"/>
-        </w:rPr>
-        <w:t>）。</w:t>
-      </w:r>
-      <w:r>
-        <w:rPr>
-          <w:rFonts w:ascii="Century" w:hAnsi="Century" w:eastAsia="ＭＳ 明朝"/>
-          <w:sz w:val="24"/>
-          <w:lang w:eastAsia="ja-JP"/>
-        </w:rPr>
-        <w:t>Williamson（1991</w:t>
-      </w:r>
-      <w:r>
-        <w:rPr>
-          <w:rFonts w:ascii="Century" w:hAnsi="Century" w:eastAsia="ＭＳ 明朝"/>
-          <w:sz w:val="24"/>
-          <w:lang w:eastAsia="ja-JP"/>
-        </w:rPr>
-      </w:r>
-      <w:r>
-        <w:rPr>
-          <w:rFonts w:ascii="Century" w:hAnsi="Century" w:eastAsia="ＭＳ 明朝"/>
-          <w:sz w:val="24"/>
-          <w:lang w:eastAsia="ja-JP"/>
-        </w:rPr>
-      </w:r>
-      <w:r>
-        <w:rPr>
-          <w:rFonts w:ascii="Century" w:hAnsi="Century" w:eastAsia="ＭＳ 明朝"/>
-          <w:sz w:val="24"/>
-          <w:lang w:eastAsia="ja-JP"/>
-        </w:rPr>
-      </w:r>
-      <w:r>
-        <w:rPr>
-          <w:rFonts w:ascii="Century" w:hAnsi="Century" w:eastAsia="ＭＳ 明朝"/>
-          <w:sz w:val="24"/>
-          <w:lang w:eastAsia="ja-JP"/>
-        </w:rPr>
-      </w:r>
-      <w:r>
-        <w:rPr>
-          <w:rFonts w:ascii="Century" w:hAnsi="Century" w:eastAsia="ＭＳ 明朝"/>
-          <w:sz w:val="24"/>
-          <w:lang w:eastAsia="ja-JP"/>
-        </w:rPr>
-        <w:t>）は資産特殊性を、</w:t>
-      </w:r>
-      <w:r>
-        <w:rPr>
-          <w:rFonts w:ascii="Century" w:hAnsi="Century" w:eastAsia="ＭＳ 明朝"/>
-          <w:sz w:val="24"/>
-          <w:lang w:eastAsia="ja-JP"/>
-        </w:rPr>
-        <w:t>①</w:t>
-      </w:r>
-      <w:r>
-        <w:rPr>
-          <w:rFonts w:ascii="Century" w:hAnsi="Century" w:eastAsia="ＭＳ 明朝"/>
-          <w:sz w:val="24"/>
-          <w:lang w:eastAsia="ja-JP"/>
-        </w:rPr>
-        <w:t>工程を隣接させて在庫や輸送の費用を節約する立地特殊性、</w:t>
-      </w:r>
-      <w:r>
-        <w:rPr>
-          <w:rFonts w:ascii="Century" w:hAnsi="Century" w:eastAsia="ＭＳ 明朝"/>
-          <w:sz w:val="24"/>
-          <w:lang w:eastAsia="ja-JP"/>
-        </w:rPr>
-        <w:t>②</w:t>
-      </w:r>
-      <w:r>
-        <w:rPr>
-          <w:rFonts w:ascii="Century" w:hAnsi="Century" w:eastAsia="ＭＳ 明朝"/>
-          <w:sz w:val="24"/>
-          <w:lang w:eastAsia="ja-JP"/>
-        </w:rPr>
-        <w:t>特殊な金型のような物的資産特殊性、</w:t>
-      </w:r>
-      <w:r>
-        <w:rPr>
-          <w:rFonts w:ascii="Century" w:hAnsi="Century" w:eastAsia="ＭＳ 明朝"/>
-          <w:sz w:val="24"/>
-          <w:lang w:eastAsia="ja-JP"/>
-        </w:rPr>
-        <w:t>③</w:t>
-      </w:r>
-      <w:r>
-        <w:rPr>
-          <w:rFonts w:ascii="Century" w:hAnsi="Century" w:eastAsia="ＭＳ 明朝"/>
-          <w:sz w:val="24"/>
-          <w:lang w:eastAsia="ja-JP"/>
-        </w:rPr>
-        <w:t>経験を通じた学習によって生じる人的資産特殊性、</w:t>
-      </w:r>
-      <w:r>
-        <w:rPr>
-          <w:rFonts w:ascii="Century" w:hAnsi="Century" w:eastAsia="ＭＳ 明朝"/>
-          <w:sz w:val="24"/>
-          <w:lang w:eastAsia="ja-JP"/>
-        </w:rPr>
-        <w:t>④</w:t>
-      </w:r>
-      <w:r>
-        <w:rPr>
-          <w:rFonts w:ascii="Century" w:hAnsi="Century" w:eastAsia="ＭＳ 明朝"/>
-          <w:sz w:val="24"/>
-          <w:lang w:eastAsia="ja-JP"/>
-        </w:rPr>
-        <w:t>ブランド資本、</w:t>
-      </w:r>
-      <w:r>
-        <w:rPr>
-          <w:rFonts w:ascii="Century" w:hAnsi="Century" w:eastAsia="ＭＳ 明朝"/>
-          <w:sz w:val="24"/>
-          <w:lang w:eastAsia="ja-JP"/>
-        </w:rPr>
-        <w:lastRenderedPageBreak/>
-        <w:t>⑤</w:t>
-      </w:r>
-      <w:r>
-        <w:rPr>
-          <w:rFonts w:ascii="Century" w:hAnsi="Century" w:eastAsia="ＭＳ 明朝"/>
-          <w:sz w:val="24"/>
-          <w:lang w:eastAsia="ja-JP"/>
-        </w:rPr>
-        <w:t>特定の顧客の要請に応じて汎用的な設備に行われる投資である専用資産、</w:t>
-      </w:r>
-      <w:r>
-        <w:rPr>
-          <w:rFonts w:ascii="Century" w:hAnsi="Century" w:eastAsia="ＭＳ 明朝"/>
-          <w:sz w:val="24"/>
-          <w:lang w:eastAsia="ja-JP"/>
-        </w:rPr>
-        <w:t>⑥</w:t>
-      </w:r>
-      <w:r>
-        <w:rPr>
-          <w:rFonts w:ascii="Century" w:hAnsi="Century" w:eastAsia="ＭＳ 明朝"/>
-          <w:sz w:val="24"/>
-          <w:lang w:eastAsia="ja-JP"/>
-        </w:rPr>
-        <w:t>現場での適時の対応が不可欠となる時間的特殊性の六つに分類している。</w:t>
-      </w:r>
-      <w:r>
-        <w:rPr>
-          <w:rFonts w:ascii="Century" w:hAnsi="Century" w:eastAsia="ＭＳ 明朝"/>
-          <w:sz w:val="24"/>
-          <w:lang w:eastAsia="ja-JP"/>
-        </w:rPr>
-        <w:t>⑤</w:t>
-      </w:r>
-      <w:r>
-        <w:rPr>
-          <w:rFonts w:ascii="Century" w:hAnsi="Century" w:eastAsia="ＭＳ 明朝"/>
-          <w:sz w:val="24"/>
-          <w:lang w:eastAsia="ja-JP"/>
-        </w:rPr>
-        <w:t>の専用資産が示すように、汎用的な設備であっても、特定の顧客のために投資された場合には特殊性をもつ。すなわち資産特殊性は、資産が汎用的なものか特殊なものかという性質だけで決まるものではない。こうした資産特殊性、とりわけ</w:t>
-      </w:r>
-      <w:r>
-        <w:rPr>
-          <w:rFonts w:ascii="Century" w:hAnsi="Century" w:eastAsia="ＭＳ 明朝"/>
-          <w:sz w:val="24"/>
-          <w:lang w:eastAsia="ja-JP"/>
-        </w:rPr>
-        <w:t>①</w:t>
-      </w:r>
-      <w:r>
-        <w:rPr>
-          <w:rFonts w:ascii="Century" w:hAnsi="Century" w:eastAsia="ＭＳ 明朝"/>
-          <w:sz w:val="24"/>
-          <w:lang w:eastAsia="ja-JP"/>
-        </w:rPr>
-        <w:t>から</w:t>
-      </w:r>
-      <w:r>
-        <w:rPr>
-          <w:rFonts w:ascii="Century" w:hAnsi="Century" w:eastAsia="ＭＳ 明朝"/>
-          <w:sz w:val="24"/>
-          <w:lang w:eastAsia="ja-JP"/>
-        </w:rPr>
-        <w:t>⑤</w:t>
-      </w:r>
-      <w:r>
-        <w:rPr>
-          <w:rFonts w:ascii="Century" w:hAnsi="Century" w:eastAsia="ＭＳ 明朝"/>
-          <w:sz w:val="24"/>
-          <w:lang w:eastAsia="ja-JP"/>
-        </w:rPr>
-        <w:t>の形態は、取引当事者の間に双方向の依存関係を生み出し、契約上の危険を高める（</w:t>
-      </w:r>
-      <w:r>
-        <w:rPr>
-          <w:rFonts w:ascii="Century" w:hAnsi="Century" w:eastAsia="ＭＳ 明朝"/>
-          <w:sz w:val="24"/>
-          <w:lang w:eastAsia="ja-JP"/>
-        </w:rPr>
-        <w:t>Williamson，1991</w:t>
-      </w:r>
-      <w:r>
-        <w:rPr>
-          <w:rFonts w:ascii="Century" w:hAnsi="Century" w:eastAsia="ＭＳ 明朝"/>
-          <w:sz w:val="24"/>
-          <w:lang w:eastAsia="ja-JP"/>
-        </w:rPr>
-      </w:r>
-      <w:r>
-        <w:rPr>
-          <w:rFonts w:ascii="Century" w:hAnsi="Century" w:eastAsia="ＭＳ 明朝"/>
-          <w:sz w:val="24"/>
-          <w:lang w:eastAsia="ja-JP"/>
-        </w:rPr>
-      </w:r>
-      <w:r>
-        <w:rPr>
-          <w:rFonts w:ascii="Century" w:hAnsi="Century" w:eastAsia="ＭＳ 明朝"/>
-          <w:sz w:val="24"/>
-          <w:lang w:eastAsia="ja-JP"/>
-        </w:rPr>
-      </w:r>
-      <w:r>
-        <w:rPr>
-          <w:rFonts w:ascii="Century" w:hAnsi="Century" w:eastAsia="ＭＳ 明朝"/>
-          <w:sz w:val="24"/>
-          <w:lang w:eastAsia="ja-JP"/>
-        </w:rPr>
-      </w:r>
-      <w:r>
-        <w:rPr>
-          <w:rFonts w:ascii="Century" w:hAnsi="Century" w:eastAsia="ＭＳ 明朝"/>
-          <w:sz w:val="24"/>
-          <w:lang w:eastAsia="ja-JP"/>
-        </w:rPr>
-        <w:t>）。</w:t>
+        <w:t>資産特殊性とは、ある資産を、その生産的価値を損なうことなく、別の用途や別の使用者に転用できる程度を指す（Williamson，1991，281頁）。言い換えれば、特定の取引のために行われた投資が、他の用途や取引相手に転用された場合にどれだけ価値を失うかを示す概念である（Williamson，1991，282頁）。Williamson（1991，281-282頁）は資産特殊性を、①工程を隣接させて在庫や輸送の費用を節約する立地特殊性、②特殊な金型のような物的資産特殊性、③経験を通じた学習によって生じる人的資産特殊性、④ブランド資本、⑤特定の顧客の要請に応じて汎用的な設備に行われる投資である専用資産、⑥現場での適時の対応が不可欠となる時間的特殊性の六つに分類している。⑤の専用資産が示すように、汎用的な設備であっても、特定の顧客のために投資された場合には特殊性をもつ。すなわち資産特殊性は、資産が汎用的なものか特殊なものかという性質だけで決まるものではない。こうした資産特殊性、とりわけ①から⑤の形態は、取引当事者の間に双方向の依存関係を生み出し、契約上の危険を高める（Williamson，1991，282頁）。</w:t>
       </w:r>
     </w:p>
     <w:p>
@@ -6014,96 +4255,7 @@
           <w:sz w:val="24"/>
           <w:lang w:eastAsia="ja-JP"/>
         </w:rPr>
-        <w:t>不確実性については、取引をとりまく状況の変化である攪乱（</w:t>
-      </w:r>
-      <w:r>
-        <w:rPr>
-          <w:rFonts w:ascii="Century" w:hAnsi="Century" w:eastAsia="ＭＳ 明朝"/>
-          <w:sz w:val="24"/>
-          <w:lang w:eastAsia="ja-JP"/>
-        </w:rPr>
-        <w:t>disturbance</w:t>
-      </w:r>
-      <w:r>
-        <w:rPr>
-          <w:rFonts w:ascii="Century" w:hAnsi="Century" w:eastAsia="ＭＳ 明朝"/>
-          <w:sz w:val="24"/>
-          <w:lang w:eastAsia="ja-JP"/>
-        </w:rPr>
-        <w:t>）の発生頻度が高まる場合と、その影響が大きくなる場合とが区別される（</w:t>
-      </w:r>
-      <w:r>
-        <w:rPr>
-          <w:rFonts w:ascii="Century" w:hAnsi="Century" w:eastAsia="ＭＳ 明朝"/>
-          <w:sz w:val="24"/>
-          <w:lang w:eastAsia="ja-JP"/>
-        </w:rPr>
-        <w:t>Williamson，1991</w:t>
-      </w:r>
-      <w:r>
-        <w:rPr>
-          <w:rFonts w:ascii="Century" w:hAnsi="Century" w:eastAsia="ＭＳ 明朝"/>
-          <w:sz w:val="24"/>
-          <w:lang w:eastAsia="ja-JP"/>
-        </w:rPr>
-      </w:r>
-      <w:r>
-        <w:rPr>
-          <w:rFonts w:ascii="Century" w:hAnsi="Century" w:eastAsia="ＭＳ 明朝"/>
-          <w:sz w:val="24"/>
-          <w:lang w:eastAsia="ja-JP"/>
-        </w:rPr>
-      </w:r>
-      <w:r>
-        <w:rPr>
-          <w:rFonts w:ascii="Century" w:hAnsi="Century" w:eastAsia="ＭＳ 明朝"/>
-          <w:sz w:val="24"/>
-          <w:lang w:eastAsia="ja-JP"/>
-        </w:rPr>
-      </w:r>
-      <w:r>
-        <w:rPr>
-          <w:rFonts w:ascii="Century" w:hAnsi="Century" w:eastAsia="ＭＳ 明朝"/>
-          <w:sz w:val="24"/>
-          <w:lang w:eastAsia="ja-JP"/>
-        </w:rPr>
-      </w:r>
-      <w:r>
-        <w:rPr>
-          <w:rFonts w:ascii="Century" w:hAnsi="Century" w:eastAsia="ＭＳ 明朝"/>
-          <w:sz w:val="24"/>
-          <w:lang w:eastAsia="ja-JP"/>
-        </w:rPr>
-        <w:t>）。頻度については、取引が繰り返されるにつれて相手の情報が蓄積され、機会主義的な行動が抑制されるとされる（武田，2013</w:t>
-      </w:r>
-      <w:r>
-        <w:rPr>
-          <w:rFonts w:ascii="Century" w:hAnsi="Century" w:eastAsia="ＭＳ 明朝"/>
-          <w:sz w:val="24"/>
-          <w:lang w:eastAsia="ja-JP"/>
-        </w:rPr>
-      </w:r>
-      <w:r>
-        <w:rPr>
-          <w:rFonts w:ascii="Century" w:hAnsi="Century" w:eastAsia="ＭＳ 明朝"/>
-          <w:sz w:val="24"/>
-          <w:lang w:eastAsia="ja-JP"/>
-        </w:rPr>
-      </w:r>
-      <w:r>
-        <w:rPr>
-          <w:rFonts w:ascii="Century" w:hAnsi="Century" w:eastAsia="ＭＳ 明朝"/>
-          <w:sz w:val="24"/>
-          <w:lang w:eastAsia="ja-JP"/>
-        </w:rPr>
-      </w:r>
-      <w:r>
-        <w:rPr>
-          <w:rFonts w:ascii="Century" w:hAnsi="Century" w:eastAsia="ＭＳ 明朝"/>
-          <w:sz w:val="24"/>
-          <w:lang w:eastAsia="ja-JP"/>
-        </w:rPr>
-        <w:t>）。</w:t>
+        <w:t>不確実性については、取引をとりまく状況の変化である攪乱（disturbance）の発生頻度が高まる場合と、その影響が大きくなる場合とが区別される（Williamson，1991，291頁）。頻度については、取引が繰り返されるにつれて相手の情報が蓄積され、機会主義的な行動が抑制されるとされる（武田，2013，323頁）。</w:t>
       </w:r>
     </w:p>
     <w:p>
@@ -6121,164 +4273,7 @@
           <w:sz w:val="24"/>
           <w:lang w:eastAsia="ja-JP"/>
         </w:rPr>
-        <w:t>本研究では、資産特殊性を、配送事業者が</w:t>
-      </w:r>
-      <w:r>
-        <w:rPr>
-          <w:rFonts w:ascii="Century" w:hAnsi="Century" w:eastAsia="ＭＳ 明朝"/>
-          <w:sz w:val="24"/>
-          <w:lang w:eastAsia="ja-JP"/>
-        </w:rPr>
-        <w:t>Amazon</w:t>
-      </w:r>
-      <w:r>
-        <w:rPr>
-          <w:rFonts w:ascii="Century" w:hAnsi="Century" w:eastAsia="ＭＳ 明朝"/>
-          <w:sz w:val="24"/>
-          <w:lang w:eastAsia="ja-JP"/>
-        </w:rPr>
-        <w:t>との取引のために行った投資が、他の荷主との取引に転用された場合にどの程度価値を失うかという観点から捉える。例えば米国の</w:t>
-      </w:r>
-      <w:r>
-        <w:rPr>
-          <w:rFonts w:ascii="Century" w:hAnsi="Century" w:eastAsia="ＭＳ 明朝"/>
-          <w:sz w:val="24"/>
-          <w:lang w:eastAsia="ja-JP"/>
-        </w:rPr>
-        <w:t>DSP</w:t>
-      </w:r>
-      <w:r>
-        <w:rPr>
-          <w:rFonts w:ascii="Century" w:hAnsi="Century" w:eastAsia="ＭＳ 明朝"/>
-          <w:sz w:val="24"/>
-          <w:lang w:eastAsia="ja-JP"/>
-        </w:rPr>
-        <w:t>は、</w:t>
-      </w:r>
-      <w:r>
-        <w:rPr>
-          <w:rFonts w:ascii="Century" w:hAnsi="Century" w:eastAsia="ＭＳ 明朝"/>
-          <w:sz w:val="24"/>
-          <w:lang w:eastAsia="ja-JP"/>
-        </w:rPr>
-        <w:t>Amazon</w:t>
-      </w:r>
-      <w:r>
-        <w:rPr>
-          <w:rFonts w:ascii="Century" w:hAnsi="Century" w:eastAsia="ＭＳ 明朝"/>
-          <w:sz w:val="24"/>
-          <w:lang w:eastAsia="ja-JP"/>
-        </w:rPr>
-        <w:t>のロゴが印刷された専用の配送車を使用し、</w:t>
-      </w:r>
-      <w:r>
-        <w:rPr>
-          <w:rFonts w:ascii="Century" w:hAnsi="Century" w:eastAsia="ＭＳ 明朝"/>
-          <w:sz w:val="24"/>
-          <w:lang w:eastAsia="ja-JP"/>
-        </w:rPr>
-        <w:t>Amazon</w:t>
-      </w:r>
-      <w:r>
-        <w:rPr>
-          <w:rFonts w:ascii="Century" w:hAnsi="Century" w:eastAsia="ＭＳ 明朝"/>
-          <w:sz w:val="24"/>
-          <w:lang w:eastAsia="ja-JP"/>
-        </w:rPr>
-        <w:t>の制服を着たドライバーが</w:t>
-      </w:r>
-      <w:r>
-        <w:rPr>
-          <w:rFonts w:ascii="Century" w:hAnsi="Century" w:eastAsia="ＭＳ 明朝"/>
-          <w:sz w:val="24"/>
-          <w:lang w:eastAsia="ja-JP"/>
-        </w:rPr>
-        <w:t>Amazon</w:t>
-      </w:r>
-      <w:r>
-        <w:rPr>
-          <w:rFonts w:ascii="Century" w:hAnsi="Century" w:eastAsia="ＭＳ 明朝"/>
-          <w:sz w:val="24"/>
-          <w:lang w:eastAsia="ja-JP"/>
-        </w:rPr>
-        <w:t>の貨物を配送しており（齊藤，2022</w:t>
-      </w:r>
-      <w:r>
-        <w:rPr>
-          <w:rFonts w:ascii="Century" w:hAnsi="Century" w:eastAsia="ＭＳ 明朝"/>
-          <w:sz w:val="24"/>
-          <w:lang w:eastAsia="ja-JP"/>
-        </w:rPr>
-      </w:r>
-      <w:r>
-        <w:rPr>
-          <w:rFonts w:ascii="Century" w:hAnsi="Century" w:eastAsia="ＭＳ 明朝"/>
-          <w:sz w:val="24"/>
-          <w:lang w:eastAsia="ja-JP"/>
-        </w:rPr>
-      </w:r>
-      <w:r>
-        <w:rPr>
-          <w:rFonts w:ascii="Century" w:hAnsi="Century" w:eastAsia="ＭＳ 明朝"/>
-          <w:sz w:val="24"/>
-          <w:lang w:eastAsia="ja-JP"/>
-        </w:rPr>
-      </w:r>
-      <w:r>
-        <w:rPr>
-          <w:rFonts w:ascii="Century" w:hAnsi="Century" w:eastAsia="ＭＳ 明朝"/>
-          <w:sz w:val="24"/>
-          <w:lang w:eastAsia="ja-JP"/>
-        </w:rPr>
-        <w:t>）、ブランド資本や専用資産に近い性格をもつと考えられる。日本の</w:t>
-      </w:r>
-      <w:r>
-        <w:rPr>
-          <w:rFonts w:ascii="Century" w:hAnsi="Century" w:eastAsia="ＭＳ 明朝"/>
-          <w:sz w:val="24"/>
-          <w:lang w:eastAsia="ja-JP"/>
-        </w:rPr>
-        <w:t>ADP</w:t>
-      </w:r>
-      <w:r>
-        <w:rPr>
-          <w:rFonts w:ascii="Century" w:hAnsi="Century" w:eastAsia="ＭＳ 明朝"/>
-          <w:sz w:val="24"/>
-          <w:lang w:eastAsia="ja-JP"/>
-        </w:rPr>
-        <w:t>や</w:t>
-      </w:r>
-      <w:r>
-        <w:rPr>
-          <w:rFonts w:ascii="Century" w:hAnsi="Century" w:eastAsia="ＭＳ 明朝"/>
-          <w:sz w:val="24"/>
-          <w:lang w:eastAsia="ja-JP"/>
-        </w:rPr>
-        <w:t>Amazon Flex</w:t>
-      </w:r>
-      <w:r>
-        <w:rPr>
-          <w:rFonts w:ascii="Century" w:hAnsi="Century" w:eastAsia="ＭＳ 明朝"/>
-          <w:sz w:val="24"/>
-          <w:lang w:eastAsia="ja-JP"/>
-        </w:rPr>
-        <w:t>における資産特殊性の種類と程度については、第</w:t>
-      </w:r>
-      <w:r>
-        <w:rPr>
-          <w:rFonts w:ascii="Century" w:hAnsi="Century" w:eastAsia="ＭＳ 明朝"/>
-          <w:sz w:val="24"/>
-          <w:lang w:eastAsia="ja-JP"/>
-        </w:rPr>
-        <w:t>5</w:t>
-      </w:r>
-      <w:r>
-        <w:rPr>
-          <w:rFonts w:ascii="Century" w:hAnsi="Century" w:eastAsia="ＭＳ 明朝"/>
-          <w:sz w:val="24"/>
-          <w:lang w:eastAsia="ja-JP"/>
-        </w:rPr>
-        <w:t>章で検討する。</w:t>
+        <w:t>本研究では、資産特殊性を、配送事業者がAmazonとの取引のために行った投資が、他の荷主との取引に転用された場合にどの程度価値を失うかという観点から捉える。例えば米国のDSPは、Amazonのロゴが印刷された専用の配送車を使用し、Amazonの制服を着たドライバーがAmazonの貨物を配送しており（齊藤，2022，49頁）、ブランド資本や専用資産に近い性格をもつと考えられる。日本のADPやAmazon Flexにおける資産特殊性の種類と程度については、第5章で検討する。</w:t>
       </w:r>
     </w:p>
     <w:p>
@@ -6324,199 +4319,7 @@
           <w:sz w:val="24"/>
           <w:lang w:eastAsia="ja-JP"/>
         </w:rPr>
-        <w:t>ガバナンス構造とは、取引が組み込まれる制度的な枠組みであり（</w:t>
-      </w:r>
-      <w:r>
-        <w:rPr>
-          <w:rFonts w:ascii="Century" w:hAnsi="Century" w:eastAsia="ＭＳ 明朝"/>
-          <w:sz w:val="24"/>
-          <w:lang w:eastAsia="ja-JP"/>
-        </w:rPr>
-        <w:t>Williamson，1985</w:t>
-      </w:r>
-      <w:r>
-        <w:rPr>
-          <w:rFonts w:ascii="Century" w:hAnsi="Century" w:eastAsia="ＭＳ 明朝"/>
-          <w:sz w:val="24"/>
-          <w:lang w:eastAsia="ja-JP"/>
-        </w:rPr>
-      </w:r>
-      <w:r>
-        <w:rPr>
-          <w:rFonts w:ascii="Century" w:hAnsi="Century" w:eastAsia="ＭＳ 明朝"/>
-          <w:sz w:val="24"/>
-          <w:lang w:eastAsia="ja-JP"/>
-        </w:rPr>
-      </w:r>
-      <w:r>
-        <w:rPr>
-          <w:rFonts w:ascii="Century" w:hAnsi="Century" w:eastAsia="ＭＳ 明朝"/>
-          <w:sz w:val="24"/>
-          <w:lang w:eastAsia="ja-JP"/>
-        </w:rPr>
-      </w:r>
-      <w:r>
-        <w:rPr>
-          <w:rFonts w:ascii="Century" w:hAnsi="Century" w:eastAsia="ＭＳ 明朝"/>
-          <w:sz w:val="24"/>
-          <w:lang w:eastAsia="ja-JP"/>
-        </w:rPr>
-      </w:r>
-      <w:r>
-        <w:rPr>
-          <w:rFonts w:ascii="Century" w:hAnsi="Century" w:eastAsia="ＭＳ 明朝"/>
-          <w:sz w:val="24"/>
-          <w:lang w:eastAsia="ja-JP"/>
-        </w:rPr>
-        <w:t>）、潜在的な対立を事前に予見し、それを防止・緩和するために設計されるものである（</w:t>
-      </w:r>
-      <w:r>
-        <w:rPr>
-          <w:rFonts w:ascii="Century" w:hAnsi="Century" w:eastAsia="ＭＳ 明朝"/>
-          <w:sz w:val="24"/>
-          <w:lang w:eastAsia="ja-JP"/>
-        </w:rPr>
-        <w:t>Williamson，1985</w:t>
-      </w:r>
-      <w:r>
-        <w:rPr>
-          <w:rFonts w:ascii="Century" w:hAnsi="Century" w:eastAsia="ＭＳ 明朝"/>
-          <w:sz w:val="24"/>
-          <w:lang w:eastAsia="ja-JP"/>
-        </w:rPr>
-      </w:r>
-      <w:r>
-        <w:rPr>
-          <w:rFonts w:ascii="Century" w:hAnsi="Century" w:eastAsia="ＭＳ 明朝"/>
-          <w:sz w:val="24"/>
-          <w:lang w:eastAsia="ja-JP"/>
-        </w:rPr>
-      </w:r>
-      <w:r>
-        <w:rPr>
-          <w:rFonts w:ascii="Century" w:hAnsi="Century" w:eastAsia="ＭＳ 明朝"/>
-          <w:sz w:val="24"/>
-          <w:lang w:eastAsia="ja-JP"/>
-        </w:rPr>
-      </w:r>
-      <w:r>
-        <w:rPr>
-          <w:rFonts w:ascii="Century" w:hAnsi="Century" w:eastAsia="ＭＳ 明朝"/>
-          <w:sz w:val="24"/>
-          <w:lang w:eastAsia="ja-JP"/>
-        </w:rPr>
-      </w:r>
-      <w:r>
-        <w:rPr>
-          <w:rFonts w:ascii="Century" w:hAnsi="Century" w:eastAsia="ＭＳ 明朝"/>
-          <w:sz w:val="24"/>
-          <w:lang w:eastAsia="ja-JP"/>
-        </w:rPr>
-        <w:t>）。取引費用論の予測力の多くを支える識別的整合（</w:t>
-      </w:r>
-      <w:r>
-        <w:rPr>
-          <w:rFonts w:ascii="Century" w:hAnsi="Century" w:eastAsia="ＭＳ 明朝"/>
-          <w:sz w:val="24"/>
-          <w:lang w:eastAsia="ja-JP"/>
-        </w:rPr>
-        <w:t>discriminating alignment</w:t>
-      </w:r>
-      <w:r>
-        <w:rPr>
-          <w:rFonts w:ascii="Century" w:hAnsi="Century" w:eastAsia="ＭＳ 明朝"/>
-          <w:sz w:val="24"/>
-          <w:lang w:eastAsia="ja-JP"/>
-        </w:rPr>
-        <w:t>）仮説は、属性の異なる取引が、費用と能力の異なるガバナンス構造と、主として取引費用を節約するように対応づけられるとする（</w:t>
-      </w:r>
-      <w:r>
-        <w:rPr>
-          <w:rFonts w:ascii="Century" w:hAnsi="Century" w:eastAsia="ＭＳ 明朝"/>
-          <w:sz w:val="24"/>
-          <w:lang w:eastAsia="ja-JP"/>
-        </w:rPr>
-        <w:t>Williamson，1991</w:t>
-      </w:r>
-      <w:r>
-        <w:rPr>
-          <w:rFonts w:ascii="Century" w:hAnsi="Century" w:eastAsia="ＭＳ 明朝"/>
-          <w:sz w:val="24"/>
-          <w:lang w:eastAsia="ja-JP"/>
-        </w:rPr>
-      </w:r>
-      <w:r>
-        <w:rPr>
-          <w:rFonts w:ascii="Century" w:hAnsi="Century" w:eastAsia="ＭＳ 明朝"/>
-          <w:sz w:val="24"/>
-          <w:lang w:eastAsia="ja-JP"/>
-        </w:rPr>
-      </w:r>
-      <w:r>
-        <w:rPr>
-          <w:rFonts w:ascii="Century" w:hAnsi="Century" w:eastAsia="ＭＳ 明朝"/>
-          <w:sz w:val="24"/>
-          <w:lang w:eastAsia="ja-JP"/>
-        </w:rPr>
-      </w:r>
-      <w:r>
-        <w:rPr>
-          <w:rFonts w:ascii="Century" w:hAnsi="Century" w:eastAsia="ＭＳ 明朝"/>
-          <w:sz w:val="24"/>
-          <w:lang w:eastAsia="ja-JP"/>
-        </w:rPr>
-      </w:r>
-      <w:r>
-        <w:rPr>
-          <w:rFonts w:ascii="Century" w:hAnsi="Century" w:eastAsia="ＭＳ 明朝"/>
-          <w:sz w:val="24"/>
-          <w:lang w:eastAsia="ja-JP"/>
-        </w:rPr>
-        <w:t>）。基本的なガバナンス構造には、市場、階層組織（企業内部）、両者の中間に位置するハイブリッドの三つがあり、ハイブリッドには長期契約、相互取引、規制、フランチャイズなどが含まれる（</w:t>
-      </w:r>
-      <w:r>
-        <w:rPr>
-          <w:rFonts w:ascii="Century" w:hAnsi="Century" w:eastAsia="ＭＳ 明朝"/>
-          <w:sz w:val="24"/>
-          <w:lang w:eastAsia="ja-JP"/>
-        </w:rPr>
-        <w:t>Williamson，1991</w:t>
-      </w:r>
-      <w:r>
-        <w:rPr>
-          <w:rFonts w:ascii="Century" w:hAnsi="Century" w:eastAsia="ＭＳ 明朝"/>
-          <w:sz w:val="24"/>
-          <w:lang w:eastAsia="ja-JP"/>
-        </w:rPr>
-      </w:r>
-      <w:r>
-        <w:rPr>
-          <w:rFonts w:ascii="Century" w:hAnsi="Century" w:eastAsia="ＭＳ 明朝"/>
-          <w:sz w:val="24"/>
-          <w:lang w:eastAsia="ja-JP"/>
-        </w:rPr>
-      </w:r>
-      <w:r>
-        <w:rPr>
-          <w:rFonts w:ascii="Century" w:hAnsi="Century" w:eastAsia="ＭＳ 明朝"/>
-          <w:sz w:val="24"/>
-          <w:lang w:eastAsia="ja-JP"/>
-        </w:rPr>
-      </w:r>
-      <w:r>
-        <w:rPr>
-          <w:rFonts w:ascii="Century" w:hAnsi="Century" w:eastAsia="ＭＳ 明朝"/>
-          <w:sz w:val="24"/>
-          <w:lang w:eastAsia="ja-JP"/>
-        </w:rPr>
-      </w:r>
-      <w:r>
-        <w:rPr>
-          <w:rFonts w:ascii="Century" w:hAnsi="Century" w:eastAsia="ＭＳ 明朝"/>
-          <w:sz w:val="24"/>
-          <w:lang w:eastAsia="ja-JP"/>
-        </w:rPr>
-        <w:t>）。</w:t>
+        <w:t>ガバナンス構造とは、取引が組み込まれる制度的な枠組みであり（Williamson，1985，35頁）、潜在的な対立を事前に予見し、それを防止・緩和するために設計されるものである（Williamson，1985，29頁）。取引費用論の予測力の多くを支える識別的整合（discriminating alignment）仮説は、属性の異なる取引が、費用と能力の異なるガバナンス構造と、主として取引費用を節約するように対応づけられるとする（Williamson，1991，277頁）。基本的なガバナンス構造には、市場、階層組織（企業内部）、両者の中間に位置するハイブリッドの三つがあり、ハイブリッドには長期契約、相互取引、規制、フランチャイズなどが含まれる（Williamson，1991，280頁）。</w:t>
       </w:r>
     </w:p>
     <w:p>
@@ -6534,175 +4337,7 @@
           <w:sz w:val="24"/>
           <w:lang w:eastAsia="ja-JP"/>
         </w:rPr>
-        <w:t>三つのガバナンス構造は、インセンティブや管理的統制といった手段、適応能力、そして依拠する契約法において異なる（</w:t>
-      </w:r>
-      <w:r>
-        <w:rPr>
-          <w:rFonts w:ascii="Century" w:hAnsi="Century" w:eastAsia="ＭＳ 明朝"/>
-          <w:sz w:val="24"/>
-          <w:lang w:eastAsia="ja-JP"/>
-        </w:rPr>
-        <w:t>Williamson，1991</w:t>
-      </w:r>
-      <w:r>
-        <w:rPr>
-          <w:rFonts w:ascii="Century" w:hAnsi="Century" w:eastAsia="ＭＳ 明朝"/>
-          <w:sz w:val="24"/>
-          <w:lang w:eastAsia="ja-JP"/>
-        </w:rPr>
-      </w:r>
-      <w:r>
-        <w:rPr>
-          <w:rFonts w:ascii="Century" w:hAnsi="Century" w:eastAsia="ＭＳ 明朝"/>
-          <w:sz w:val="24"/>
-          <w:lang w:eastAsia="ja-JP"/>
-        </w:rPr>
-      </w:r>
-      <w:r>
-        <w:rPr>
-          <w:rFonts w:ascii="Century" w:hAnsi="Century" w:eastAsia="ＭＳ 明朝"/>
-          <w:sz w:val="24"/>
-          <w:lang w:eastAsia="ja-JP"/>
-        </w:rPr>
-      </w:r>
-      <w:r>
-        <w:rPr>
-          <w:rFonts w:ascii="Century" w:hAnsi="Century" w:eastAsia="ＭＳ 明朝"/>
-          <w:sz w:val="24"/>
-          <w:lang w:eastAsia="ja-JP"/>
-        </w:rPr>
-      </w:r>
-      <w:r>
-        <w:rPr>
-          <w:rFonts w:ascii="Century" w:hAnsi="Century" w:eastAsia="ＭＳ 明朝"/>
-          <w:sz w:val="24"/>
-          <w:lang w:eastAsia="ja-JP"/>
-        </w:rPr>
-        <w:t>）。適応には、価格の変化に応じて各当事者が自律的に対応する適応（</w:t>
-      </w:r>
-      <w:r>
-        <w:rPr>
-          <w:rFonts w:ascii="Century" w:hAnsi="Century" w:eastAsia="ＭＳ 明朝"/>
-          <w:sz w:val="24"/>
-          <w:lang w:eastAsia="ja-JP"/>
-        </w:rPr>
-        <w:t>A</w:t>
-      </w:r>
-      <w:r>
-        <w:rPr>
-          <w:rFonts w:ascii="Century" w:hAnsi="Century" w:eastAsia="ＭＳ 明朝"/>
-          <w:sz w:val="24"/>
-          <w:lang w:eastAsia="ja-JP"/>
-        </w:rPr>
-        <w:t>：</w:t>
-      </w:r>
-      <w:r>
-        <w:rPr>
-          <w:rFonts w:ascii="Century" w:hAnsi="Century" w:eastAsia="ＭＳ 明朝"/>
-          <w:sz w:val="24"/>
-          <w:lang w:eastAsia="ja-JP"/>
-        </w:rPr>
-        <w:t>autonomy</w:t>
-      </w:r>
-      <w:r>
-        <w:rPr>
-          <w:rFonts w:ascii="Century" w:hAnsi="Century" w:eastAsia="ＭＳ 明朝"/>
-          <w:sz w:val="24"/>
-          <w:lang w:eastAsia="ja-JP"/>
-        </w:rPr>
-        <w:t>）と、当事者間の調整を必要とする協調的な適応（</w:t>
-      </w:r>
-      <w:r>
-        <w:rPr>
-          <w:rFonts w:ascii="Century" w:hAnsi="Century" w:eastAsia="ＭＳ 明朝"/>
-          <w:sz w:val="24"/>
-          <w:lang w:eastAsia="ja-JP"/>
-        </w:rPr>
-        <w:t>C</w:t>
-      </w:r>
-      <w:r>
-        <w:rPr>
-          <w:rFonts w:ascii="Century" w:hAnsi="Century" w:eastAsia="ＭＳ 明朝"/>
-          <w:sz w:val="24"/>
-          <w:lang w:eastAsia="ja-JP"/>
-        </w:rPr>
-        <w:t>：</w:t>
-      </w:r>
-      <w:r>
-        <w:rPr>
-          <w:rFonts w:ascii="Century" w:hAnsi="Century" w:eastAsia="ＭＳ 明朝"/>
-          <w:sz w:val="24"/>
-          <w:lang w:eastAsia="ja-JP"/>
-        </w:rPr>
-        <w:t>cooperation</w:t>
-      </w:r>
-      <w:r>
-        <w:rPr>
-          <w:rFonts w:ascii="Century" w:hAnsi="Century" w:eastAsia="ＭＳ 明朝"/>
-          <w:sz w:val="24"/>
-          <w:lang w:eastAsia="ja-JP"/>
-        </w:rPr>
-        <w:t>）がある。市場は前者に優れ、強いインセンティブをもつ一方、階層組織は後者に優れ、監視などの管理的統制を強く用いることができるが、インセンティブは弱まる。ハイブリッドは、これらすべての点で両者の中間的な性格をもつ（</w:t>
-      </w:r>
-      <w:r>
-        <w:rPr>
-          <w:rFonts w:ascii="Century" w:hAnsi="Century" w:eastAsia="ＭＳ 明朝"/>
-          <w:sz w:val="24"/>
-          <w:lang w:eastAsia="ja-JP"/>
-        </w:rPr>
-        <w:t>Williamson，1991</w:t>
-      </w:r>
-      <w:r>
-        <w:rPr>
-          <w:rFonts w:ascii="Century" w:hAnsi="Century" w:eastAsia="ＭＳ 明朝"/>
-          <w:sz w:val="24"/>
-          <w:lang w:eastAsia="ja-JP"/>
-        </w:rPr>
-      </w:r>
-      <w:r>
-        <w:rPr>
-          <w:rFonts w:ascii="Century" w:hAnsi="Century" w:eastAsia="ＭＳ 明朝"/>
-          <w:sz w:val="24"/>
-          <w:lang w:eastAsia="ja-JP"/>
-        </w:rPr>
-      </w:r>
-      <w:r>
-        <w:rPr>
-          <w:rFonts w:ascii="Century" w:hAnsi="Century" w:eastAsia="ＭＳ 明朝"/>
-          <w:sz w:val="24"/>
-          <w:lang w:eastAsia="ja-JP"/>
-        </w:rPr>
-      </w:r>
-      <w:r>
-        <w:rPr>
-          <w:rFonts w:ascii="Century" w:hAnsi="Century" w:eastAsia="ＭＳ 明朝"/>
-          <w:sz w:val="24"/>
-          <w:lang w:eastAsia="ja-JP"/>
-        </w:rPr>
-      </w:r>
-      <w:r>
-        <w:rPr>
-          <w:rFonts w:ascii="Century" w:hAnsi="Century" w:eastAsia="ＭＳ 明朝"/>
-          <w:sz w:val="24"/>
-          <w:lang w:eastAsia="ja-JP"/>
-        </w:rPr>
-        <w:t>）。これを整理したものが表</w:t>
-      </w:r>
-      <w:r>
-        <w:rPr>
-          <w:rFonts w:ascii="Century" w:hAnsi="Century" w:eastAsia="ＭＳ 明朝"/>
-          <w:sz w:val="24"/>
-          <w:lang w:eastAsia="ja-JP"/>
-        </w:rPr>
-        <w:t>2-1</w:t>
-      </w:r>
-      <w:r>
-        <w:rPr>
-          <w:rFonts w:ascii="Century" w:hAnsi="Century" w:eastAsia="ＭＳ 明朝"/>
-          <w:sz w:val="24"/>
-          <w:lang w:eastAsia="ja-JP"/>
-        </w:rPr>
-        <w:t>である。</w:t>
+        <w:t>三つのガバナンス構造は、インセンティブや管理的統制といった手段、適応能力、そして依拠する契約法において異なる（Williamson，1991，277-281頁）。適応には、価格の変化に応じて各当事者が自律的に対応する適応（A：autonomy）と、当事者間の調整を必要とする協調的な適応（C：cooperation）がある。市場は前者に優れ、強いインセンティブをもつ一方、階層組織は後者に優れ、監視などの管理的統制を強く用いることができるが、インセンティブは弱まる。ハイブリッドは、これらすべての点で両者の中間的な性格をもつ（Williamson，1991，280-281頁）。これを整理したものが表2-1である。</w:t>
       </w:r>
     </w:p>
     <w:p>
@@ -7654,73 +5289,7 @@
           <w:szCs w:val="18"/>
           <w:lang w:eastAsia="ja-JP"/>
         </w:rPr>
-        <w:t>出所：</w:t>
-      </w:r>
-      <w:r>
-        <w:rPr>
-          <w:rFonts w:ascii="Century" w:hAnsi="Century" w:eastAsia="ＭＳ 明朝"/>
-          <w:sz w:val="18"/>
-          <w:szCs w:val="18"/>
-          <w:lang w:eastAsia="ja-JP"/>
-        </w:rPr>
-        <w:t>Williamson（1991）のTable 1</w:t>
-      </w:r>
-      <w:r>
-        <w:rPr>
-          <w:rFonts w:ascii="Century" w:hAnsi="Century" w:eastAsia="ＭＳ 明朝"/>
-          <w:sz w:val="18"/>
-          <w:szCs w:val="18"/>
-          <w:lang w:eastAsia="ja-JP"/>
-        </w:rPr>
-      </w:r>
-      <w:r>
-        <w:rPr>
-          <w:rFonts w:ascii="Century" w:hAnsi="Century" w:eastAsia="ＭＳ 明朝"/>
-          <w:sz w:val="18"/>
-          <w:szCs w:val="18"/>
-          <w:lang w:eastAsia="ja-JP"/>
-        </w:rPr>
-      </w:r>
-      <w:r>
-        <w:rPr>
-          <w:rFonts w:ascii="Century" w:hAnsi="Century" w:eastAsia="ＭＳ 明朝"/>
-          <w:sz w:val="18"/>
-          <w:szCs w:val="18"/>
-          <w:lang w:eastAsia="ja-JP"/>
-        </w:rPr>
-      </w:r>
-      <w:r>
-        <w:rPr>
-          <w:rFonts w:ascii="Century" w:hAnsi="Century" w:eastAsia="ＭＳ 明朝"/>
-          <w:sz w:val="18"/>
-          <w:szCs w:val="18"/>
-          <w:lang w:eastAsia="ja-JP"/>
-        </w:rPr>
-      </w:r>
-      <w:r>
-        <w:rPr>
-          <w:rFonts w:ascii="Century" w:hAnsi="Century" w:eastAsia="ＭＳ 明朝"/>
-          <w:sz w:val="18"/>
-          <w:szCs w:val="18"/>
-          <w:lang w:eastAsia="ja-JP"/>
-        </w:rPr>
-      </w:r>
-      <w:r>
-        <w:rPr>
-          <w:rFonts w:ascii="Century" w:hAnsi="Century" w:eastAsia="ＭＳ 明朝"/>
-          <w:sz w:val="18"/>
-          <w:szCs w:val="18"/>
-          <w:lang w:eastAsia="ja-JP"/>
-        </w:rPr>
-      </w:r>
-      <w:r>
-        <w:rPr>
-          <w:rFonts w:ascii="Century" w:hAnsi="Century" w:eastAsia="ＭＳ 明朝"/>
-          <w:sz w:val="18"/>
-          <w:szCs w:val="18"/>
-          <w:lang w:eastAsia="ja-JP"/>
-        </w:rPr>
-        <w:t>をもとに筆者作成。</w:t>
+        <w:t>出所：Williamson（1991，281頁，Table 1）をもとに筆者作成。</w:t>
       </w:r>
     </w:p>
     <w:p>
@@ -7746,95 +5315,7 @@
           <w:sz w:val="24"/>
           <w:lang w:eastAsia="ja-JP"/>
         </w:rPr>
-        <w:t>その結果、資産特殊性が低い取引では市場、中程度の取引ではハイブリッド、高い取引では階層組織が、それぞれ最も統治コストの低いガバナンス構造となる（</w:t>
-      </w:r>
-      <w:r>
-        <w:rPr>
-          <w:rFonts w:ascii="Century" w:hAnsi="Century" w:eastAsia="ＭＳ 明朝"/>
-          <w:sz w:val="24"/>
-          <w:lang w:eastAsia="ja-JP"/>
-        </w:rPr>
-        <w:t>Williamson，1991</w:t>
-      </w:r>
-      <w:r>
-        <w:rPr>
-          <w:rFonts w:ascii="Century" w:hAnsi="Century" w:eastAsia="ＭＳ 明朝"/>
-          <w:sz w:val="24"/>
-          <w:lang w:eastAsia="ja-JP"/>
-        </w:rPr>
-      </w:r>
-      <w:r>
-        <w:rPr>
-          <w:rFonts w:ascii="Century" w:hAnsi="Century" w:eastAsia="ＭＳ 明朝"/>
-          <w:sz w:val="24"/>
-          <w:lang w:eastAsia="ja-JP"/>
-        </w:rPr>
-      </w:r>
-      <w:r>
-        <w:rPr>
-          <w:rFonts w:ascii="Century" w:hAnsi="Century" w:eastAsia="ＭＳ 明朝"/>
-          <w:sz w:val="24"/>
-          <w:lang w:eastAsia="ja-JP"/>
-        </w:rPr>
-      </w:r>
-      <w:r>
-        <w:rPr>
-          <w:rFonts w:ascii="Century" w:hAnsi="Century" w:eastAsia="ＭＳ 明朝"/>
-          <w:sz w:val="24"/>
-          <w:lang w:eastAsia="ja-JP"/>
-        </w:rPr>
-      </w:r>
-      <w:r>
-        <w:rPr>
-          <w:rFonts w:ascii="Century" w:hAnsi="Century" w:eastAsia="ＭＳ 明朝"/>
-          <w:sz w:val="24"/>
-          <w:lang w:eastAsia="ja-JP"/>
-        </w:rPr>
-        <w:t>）。ただし、ハイブリッドは双方の合意を通じて適応する必要があるため、攪乱が頻繁に生じる場合に最も影響を受けやすいとされる（</w:t>
-      </w:r>
-      <w:r>
-        <w:rPr>
-          <w:rFonts w:ascii="Century" w:hAnsi="Century" w:eastAsia="ＭＳ 明朝"/>
-          <w:sz w:val="24"/>
-          <w:lang w:eastAsia="ja-JP"/>
-        </w:rPr>
-        <w:t>Williamson，1991</w:t>
-      </w:r>
-      <w:r>
-        <w:rPr>
-          <w:rFonts w:ascii="Century" w:hAnsi="Century" w:eastAsia="ＭＳ 明朝"/>
-          <w:sz w:val="24"/>
-          <w:lang w:eastAsia="ja-JP"/>
-        </w:rPr>
-      </w:r>
-      <w:r>
-        <w:rPr>
-          <w:rFonts w:ascii="Century" w:hAnsi="Century" w:eastAsia="ＭＳ 明朝"/>
-          <w:sz w:val="24"/>
-          <w:lang w:eastAsia="ja-JP"/>
-        </w:rPr>
-      </w:r>
-      <w:r>
-        <w:rPr>
-          <w:rFonts w:ascii="Century" w:hAnsi="Century" w:eastAsia="ＭＳ 明朝"/>
-          <w:sz w:val="24"/>
-          <w:lang w:eastAsia="ja-JP"/>
-        </w:rPr>
-      </w:r>
-      <w:r>
-        <w:rPr>
-          <w:rFonts w:ascii="Century" w:hAnsi="Century" w:eastAsia="ＭＳ 明朝"/>
-          <w:sz w:val="24"/>
-          <w:lang w:eastAsia="ja-JP"/>
-        </w:rPr>
-      </w:r>
-      <w:r>
-        <w:rPr>
-          <w:rFonts w:ascii="Century" w:hAnsi="Century" w:eastAsia="ＭＳ 明朝"/>
-          <w:sz w:val="24"/>
-          <w:lang w:eastAsia="ja-JP"/>
-        </w:rPr>
-        <w:t>）。</w:t>
+        <w:t>その結果、資産特殊性が低い取引では市場、中程度の取引ではハイブリッド、高い取引では階層組織が、それぞれ最も統治コストの低いガバナンス構造となる（Williamson，1991，284頁）。ただし、ハイブリッドは双方の合意を通じて適応する必要があるため、攪乱が頻繁に生じる場合に最も影響を受けやすいとされる（Williamson，1991，291頁）。</w:t>
       </w:r>
     </w:p>
     <w:p>
@@ -7852,95 +5333,7 @@
           <w:sz w:val="24"/>
           <w:lang w:eastAsia="ja-JP"/>
         </w:rPr>
-        <w:t>本研究にとって重要なのは、同じハイブリッドの中にも管理の程度に差があるという点である。</w:t>
-      </w:r>
-      <w:r>
-        <w:rPr>
-          <w:rFonts w:ascii="Century" w:hAnsi="Century" w:eastAsia="ＭＳ 明朝"/>
-          <w:sz w:val="24"/>
-          <w:lang w:eastAsia="ja-JP"/>
-        </w:rPr>
-        <w:t>Williamson（1991</w:t>
-      </w:r>
-      <w:r>
-        <w:rPr>
-          <w:rFonts w:ascii="Century" w:hAnsi="Century" w:eastAsia="ＭＳ 明朝"/>
-          <w:sz w:val="24"/>
-          <w:lang w:eastAsia="ja-JP"/>
-        </w:rPr>
-      </w:r>
-      <w:r>
-        <w:rPr>
-          <w:rFonts w:ascii="Century" w:hAnsi="Century" w:eastAsia="ＭＳ 明朝"/>
-          <w:sz w:val="24"/>
-          <w:lang w:eastAsia="ja-JP"/>
-        </w:rPr>
-      </w:r>
-      <w:r>
-        <w:rPr>
-          <w:rFonts w:ascii="Century" w:hAnsi="Century" w:eastAsia="ＭＳ 明朝"/>
-          <w:sz w:val="24"/>
-          <w:lang w:eastAsia="ja-JP"/>
-        </w:rPr>
-      </w:r>
-      <w:r>
-        <w:rPr>
-          <w:rFonts w:ascii="Century" w:hAnsi="Century" w:eastAsia="ＭＳ 明朝"/>
-          <w:sz w:val="24"/>
-          <w:lang w:eastAsia="ja-JP"/>
-        </w:rPr>
-      </w:r>
-      <w:r>
-        <w:rPr>
-          <w:rFonts w:ascii="Century" w:hAnsi="Century" w:eastAsia="ＭＳ 明朝"/>
-          <w:sz w:val="24"/>
-          <w:lang w:eastAsia="ja-JP"/>
-        </w:rPr>
-        <w:t>）はフランチャイズをハイブリッドの例として挙げ、フランチャイジーは階層組織より大きな自律性をもつ一方で、市場取引と比べると追加的なルールや監視のもとに置かれると説明している。さらに、同じフランチャイズでも、統制の強いものは統制の弱いものよりも、資産特殊性の高い側に位置づけられている（</w:t>
-      </w:r>
-      <w:r>
-        <w:rPr>
-          <w:rFonts w:ascii="Century" w:hAnsi="Century" w:eastAsia="ＭＳ 明朝"/>
-          <w:sz w:val="24"/>
-          <w:lang w:eastAsia="ja-JP"/>
-        </w:rPr>
-        <w:t>Williamson，1991</w:t>
-      </w:r>
-      <w:r>
-        <w:rPr>
-          <w:rFonts w:ascii="Century" w:hAnsi="Century" w:eastAsia="ＭＳ 明朝"/>
-          <w:sz w:val="24"/>
-          <w:lang w:eastAsia="ja-JP"/>
-        </w:rPr>
-      </w:r>
-      <w:r>
-        <w:rPr>
-          <w:rFonts w:ascii="Century" w:hAnsi="Century" w:eastAsia="ＭＳ 明朝"/>
-          <w:sz w:val="24"/>
-          <w:lang w:eastAsia="ja-JP"/>
-        </w:rPr>
-      </w:r>
-      <w:r>
-        <w:rPr>
-          <w:rFonts w:ascii="Century" w:hAnsi="Century" w:eastAsia="ＭＳ 明朝"/>
-          <w:sz w:val="24"/>
-          <w:lang w:eastAsia="ja-JP"/>
-        </w:rPr>
-      </w:r>
-      <w:r>
-        <w:rPr>
-          <w:rFonts w:ascii="Century" w:hAnsi="Century" w:eastAsia="ＭＳ 明朝"/>
-          <w:sz w:val="24"/>
-          <w:lang w:eastAsia="ja-JP"/>
-        </w:rPr>
-      </w:r>
-      <w:r>
-        <w:rPr>
-          <w:rFonts w:ascii="Century" w:hAnsi="Century" w:eastAsia="ＭＳ 明朝"/>
-          <w:sz w:val="24"/>
-          <w:lang w:eastAsia="ja-JP"/>
-        </w:rPr>
-        <w:t>）。したがって、ガバナンス構造の違いは、市場・ハイブリッド・階層組織のいずれを選ぶかという問題だけでなく、同じ形態の中での管理の程度の違いとしても捉えられる。本研究が、配送の担い手との契約形態に加えて、監視・管理の程度に着目するのはこのためである。</w:t>
+        <w:t>本研究にとって重要なのは、同じハイブリッドの中にも管理の程度に差があるという点である。Williamson（1991，283頁）はフランチャイズをハイブリッドの例として挙げ、フランチャイジーは階層組織より大きな自律性をもつ一方で、市場取引と比べると追加的なルールや監視のもとに置かれると説明している。さらに、同じフランチャイズでも、統制の強いものは統制の弱いものよりも、資産特殊性の高い側に位置づけられている（Williamson，1991，284頁）。したがって、ガバナンス構造の違いは、市場・ハイブリッド・階層組織のいずれを選ぶかという問題だけでなく、同じ形態の中での管理の程度の違いとしても捉えられる。本研究が、配送の担い手との契約形態に加えて、監視・管理の程度に着目するのはこのためである。</w:t>
       </w:r>
     </w:p>
     <w:p>
@@ -7986,91 +5379,7 @@
           <w:sz w:val="24"/>
           <w:lang w:eastAsia="ja-JP"/>
         </w:rPr>
-        <w:t>Williamson（1991</w:t>
-      </w:r>
-      <w:r>
-        <w:rPr>
-          <w:rFonts w:hint="eastAsia" w:ascii="Century" w:hAnsi="Century" w:eastAsia="ＭＳ 明朝"/>
-          <w:sz w:val="24"/>
-          <w:lang w:eastAsia="ja-JP"/>
-        </w:rPr>
-      </w:r>
-      <w:r>
-        <w:rPr>
-          <w:rFonts w:hint="eastAsia" w:ascii="Century" w:hAnsi="Century" w:eastAsia="ＭＳ 明朝"/>
-          <w:sz w:val="24"/>
-          <w:lang w:eastAsia="ja-JP"/>
-        </w:rPr>
-      </w:r>
-      <w:r>
-        <w:rPr>
-          <w:rFonts w:hint="eastAsia" w:ascii="Century" w:hAnsi="Century" w:eastAsia="ＭＳ 明朝"/>
-          <w:sz w:val="24"/>
-          <w:lang w:eastAsia="ja-JP"/>
-        </w:rPr>
-      </w:r>
-      <w:r>
-        <w:rPr>
-          <w:rFonts w:hint="eastAsia" w:ascii="Century" w:hAnsi="Century" w:eastAsia="ＭＳ 明朝"/>
-          <w:sz w:val="24"/>
-          <w:lang w:eastAsia="ja-JP"/>
-        </w:rPr>
-      </w:r>
-      <w:r>
-        <w:rPr>
-          <w:rFonts w:hint="eastAsia" w:ascii="Century" w:hAnsi="Century" w:eastAsia="ＭＳ 明朝"/>
-          <w:sz w:val="24"/>
-          <w:lang w:eastAsia="ja-JP"/>
-        </w:rPr>
-        <w:t>）は、</w:t>
-      </w:r>
-      <w:r>
-        <w:rPr>
-          <w:rFonts w:hint="eastAsia" w:ascii="Century" w:hAnsi="Century" w:eastAsia="ＭＳ 明朝"/>
-          <w:sz w:val="24"/>
-          <w:lang w:eastAsia="ja-JP"/>
-        </w:rPr>
-        <w:t>Davis &amp; North</w:t>
-      </w:r>
-      <w:r>
-        <w:rPr>
-          <w:rFonts w:hint="eastAsia" w:ascii="Century" w:hAnsi="Century" w:eastAsia="ＭＳ 明朝"/>
-          <w:sz w:val="24"/>
-          <w:lang w:eastAsia="ja-JP"/>
-        </w:rPr>
-        <w:t>（</w:t>
-      </w:r>
-      <w:r>
-        <w:rPr>
-          <w:rFonts w:hint="eastAsia" w:ascii="Century" w:hAnsi="Century" w:eastAsia="ＭＳ 明朝"/>
-          <w:sz w:val="24"/>
-          <w:lang w:eastAsia="ja-JP"/>
-        </w:rPr>
-        <w:t>1971</w:t>
-      </w:r>
-      <w:r>
-        <w:rPr>
-          <w:rFonts w:hint="eastAsia" w:ascii="Century" w:hAnsi="Century" w:eastAsia="ＭＳ 明朝"/>
-          <w:sz w:val="24"/>
-          <w:lang w:eastAsia="ja-JP"/>
-        </w:rPr>
-        <w:t>）の定義を引用し、生産、交換、分配の基礎となる政治的・社会的・法的な基本ルールの集合を制度的環境と呼んでいる。そのうえで、制度的環境を、ガバナンス構造の相対的な統治コストを変化させるパラメータ（</w:t>
-      </w:r>
-      <w:r>
-        <w:rPr>
-          <w:rFonts w:hint="eastAsia" w:ascii="Century" w:hAnsi="Century" w:eastAsia="ＭＳ 明朝"/>
-          <w:sz w:val="24"/>
-          <w:lang w:eastAsia="ja-JP"/>
-        </w:rPr>
-        <w:t>shift parameters</w:t>
-      </w:r>
-      <w:r>
-        <w:rPr>
-          <w:rFonts w:hint="eastAsia" w:ascii="Century" w:hAnsi="Century" w:eastAsia="ＭＳ 明朝"/>
-          <w:sz w:val="24"/>
-          <w:lang w:eastAsia="ja-JP"/>
-        </w:rPr>
-        <w:t>）として位置づけ、財産権、契約法、評判効果、不確実性の四つの変化を検討している。また、市場・ハイブリッド・階層組織の三つを想定すると、市場から階層組織への移行（またはその逆）には大きなパラメータの変化が必要であるのに対し、市場からハイブリッドへ、あるいはハイブリッドから階層組織への移行は、より小さな変化によっても生じうるとしている（同上）。</w:t>
+        <w:t>Williamson（1991，287頁）は、生産、交換、分配の基礎となる政治的・社会的・法的な基本ルールの集合を制度的環境と呼んでいる。そのうえで、制度的環境を、ガバナンス構造の相対的な統治コストを変化させるパラメータ（shift parameters）として位置づけ、財産権、契約法、評判効果、不確実性の四つの変化を検討している。また、市場・ハイブリッド・階層組織の三つを想定すると、市場から階層組織への移行（またはその逆）には大きなパラメータの変化が必要であるのに対し、市場からハイブリッドへ、あるいはハイブリッドから階層組織への移行は、より小さな変化によっても生じうるとしている（同上）。</w:t>
       </w:r>
     </w:p>
     <w:p>
@@ -8088,95 +5397,7 @@
           <w:sz w:val="24"/>
           <w:lang w:eastAsia="ja-JP"/>
         </w:rPr>
-        <w:t>さらに</w:t>
-      </w:r>
-      <w:r>
-        <w:rPr>
-          <w:rFonts w:hint="eastAsia" w:ascii="Century" w:hAnsi="Century" w:eastAsia="ＭＳ 明朝"/>
-          <w:sz w:val="24"/>
-          <w:lang w:eastAsia="ja-JP"/>
-        </w:rPr>
-        <w:t>Williamson（1991</w:t>
-      </w:r>
-      <w:r>
-        <w:rPr>
-          <w:rFonts w:hint="eastAsia" w:ascii="Century" w:hAnsi="Century" w:eastAsia="ＭＳ 明朝"/>
-          <w:sz w:val="24"/>
-          <w:lang w:eastAsia="ja-JP"/>
-        </w:rPr>
-      </w:r>
-      <w:r>
-        <w:rPr>
-          <w:rFonts w:hint="eastAsia" w:ascii="Century" w:hAnsi="Century" w:eastAsia="ＭＳ 明朝"/>
-          <w:sz w:val="24"/>
-          <w:lang w:eastAsia="ja-JP"/>
-        </w:rPr>
-      </w:r>
-      <w:r>
-        <w:rPr>
-          <w:rFonts w:hint="eastAsia" w:ascii="Century" w:hAnsi="Century" w:eastAsia="ＭＳ 明朝"/>
-          <w:sz w:val="24"/>
-          <w:lang w:eastAsia="ja-JP"/>
-        </w:rPr>
-      </w:r>
-      <w:r>
-        <w:rPr>
-          <w:rFonts w:hint="eastAsia" w:ascii="Century" w:hAnsi="Century" w:eastAsia="ＭＳ 明朝"/>
-          <w:sz w:val="24"/>
-          <w:lang w:eastAsia="ja-JP"/>
-        </w:rPr>
-      </w:r>
-      <w:r>
-        <w:rPr>
-          <w:rFonts w:hint="eastAsia" w:ascii="Century" w:hAnsi="Century" w:eastAsia="ＭＳ 明朝"/>
-          <w:sz w:val="24"/>
-          <w:lang w:eastAsia="ja-JP"/>
-        </w:rPr>
-        <w:t>）は、日本企業の雇用、下請、銀行取引の慣行が相互に補完的な関係にあることに触れ、慣行間の結びつきが重要である場合には、個々の慣行だけを他国にそのまま移植しても最適にはならないと指摘している。そのうえで、経済改革への応用にあたっては、資本主義の形態ごとの文脈の違いを明示的に考慮する必要があると述べている（</w:t>
-      </w:r>
-      <w:r>
-        <w:rPr>
-          <w:rFonts w:hint="eastAsia" w:ascii="Century" w:hAnsi="Century" w:eastAsia="ＭＳ 明朝"/>
-          <w:sz w:val="24"/>
-          <w:lang w:eastAsia="ja-JP"/>
-        </w:rPr>
-        <w:t>Williamson，1991</w:t>
-      </w:r>
-      <w:r>
-        <w:rPr>
-          <w:rFonts w:hint="eastAsia" w:ascii="Century" w:hAnsi="Century" w:eastAsia="ＭＳ 明朝"/>
-          <w:sz w:val="24"/>
-          <w:lang w:eastAsia="ja-JP"/>
-        </w:rPr>
-      </w:r>
-      <w:r>
-        <w:rPr>
-          <w:rFonts w:hint="eastAsia" w:ascii="Century" w:hAnsi="Century" w:eastAsia="ＭＳ 明朝"/>
-          <w:sz w:val="24"/>
-          <w:lang w:eastAsia="ja-JP"/>
-        </w:rPr>
-      </w:r>
-      <w:r>
-        <w:rPr>
-          <w:rFonts w:hint="eastAsia" w:ascii="Century" w:hAnsi="Century" w:eastAsia="ＭＳ 明朝"/>
-          <w:sz w:val="24"/>
-          <w:lang w:eastAsia="ja-JP"/>
-        </w:rPr>
-      </w:r>
-      <w:r>
-        <w:rPr>
-          <w:rFonts w:hint="eastAsia" w:ascii="Century" w:hAnsi="Century" w:eastAsia="ＭＳ 明朝"/>
-          <w:sz w:val="24"/>
-          <w:lang w:eastAsia="ja-JP"/>
-        </w:rPr>
-      </w:r>
-      <w:r>
-        <w:rPr>
-          <w:rFonts w:hint="eastAsia" w:ascii="Century" w:hAnsi="Century" w:eastAsia="ＭＳ 明朝"/>
-          <w:sz w:val="24"/>
-          <w:lang w:eastAsia="ja-JP"/>
-        </w:rPr>
-        <w:t>）。</w:t>
+        <w:t>さらにWilliamson（1991，293-294頁）は、日本企業の雇用、下請、銀行取引の慣行が相互に補完的な関係にあることに触れ、慣行間の結びつきが重要である場合には、個々の慣行だけを他国にそのまま移植しても最適にはならないと指摘している。そのうえで、経済改革への応用にあたっては、資本主義の形態ごとの文脈の違いを明示的に考慮する必要があると述べている（Williamson，1991，294頁）。</w:t>
       </w:r>
     </w:p>
     <w:p>
@@ -8328,7 +5549,7 @@
           <w:b w:val="0"/>
           <w:sz w:val="24"/>
         </w:rPr>
-        <w:t>鈴木泰（2006）『開発政策の合理性と脆弱性―レント効果とレント・シーキングの研究―』晃洋書房。</w:t>
+        <w:t>武田巧（2013）「取引費用低下と日本型経済諸制度」『政経論叢』明治大学政治経済研究所，81(3・4)，315-343頁。</w:t>
       </w:r>
     </w:p>
     <w:p>
@@ -8342,7 +5563,7 @@
           <w:b w:val="0"/>
           <w:sz w:val="24"/>
         </w:rPr>
-        <w:t>武田巧（2013）「取引費用低下と日本型経済諸制度」『政経論叢』明治大学政治経済研究所，81(3・4)，315-343頁。</w:t>
+        <w:t>丁明（2023）「電子商取引におけるフルフィルメントが顧客満足に与える影響―文献レビュー―」『経営学研究論集』明治大学大学院，59，1-16頁。</w:t>
       </w:r>
     </w:p>
     <w:p>
@@ -8356,7 +5577,7 @@
           <w:b w:val="0"/>
           <w:sz w:val="24"/>
         </w:rPr>
-        <w:t>丁明（2023）「電子商取引におけるフルフィルメントが顧客満足に与える影響―文献レビュー―」『経営学研究論集』明治大学大学院，59，1-16頁。</w:t>
+        <w:t>丁明（2026）「ラストマイル配送における情報品質が顧客満足と再利用意向に与える影響」『流通研究』日本商業学会，29(1)，39-52頁。</w:t>
       </w:r>
     </w:p>
     <w:p>
@@ -8370,7 +5591,7 @@
           <w:b w:val="0"/>
           <w:sz w:val="24"/>
         </w:rPr>
-        <w:t>丁明（2026）「ラストマイル配送における情報品質が顧客満足と再利用意向に与える影響」『流通研究』日本商業学会，29(1)，39-52頁。</w:t>
+        <w:t>長谷川雅行（2023）「ラストマイル配送における最新の動向」『物流問題研究』74，44-50頁。</w:t>
       </w:r>
     </w:p>
     <w:p>
@@ -8384,7 +5605,7 @@
           <w:b w:val="0"/>
           <w:sz w:val="24"/>
         </w:rPr>
-        <w:t>長谷川雅行（2023）「ラストマイル配送における最新の動向」『物流問題研究』74，44-50頁。</w:t>
+        <w:t>林克彦（2020）「宅配危機からネット通販物流革新へ」『計画行政』日本計画行政学会，43(2)，9-14頁。</w:t>
       </w:r>
     </w:p>
     <w:p>
@@ -8398,7 +5619,27 @@
           <w:b w:val="0"/>
           <w:sz w:val="24"/>
         </w:rPr>
-        <w:t>林克彦（2020）「宅配危機からネット通販物流革新へ」『計画行政』日本計画行政学会，43(2)，9-14頁。</w:t>
+        <w:t>林克彦（2023）「第1章　ウィズコロナ期における消費者行動とネット通販物流の変化」『消費者行動の変化がネット通販物流に及ぼす影響に関する研究』日交研シリーズA-870，公益社団法人日本交通政策研究会，1-17頁。</w:t>
+      </w:r>
+    </w:p>
+    <w:p>
+      <w:pPr>
+        <w:spacing w:lineRule="exact" w:line="360"/>
+        <w:ind w:firstLine="0" w:left="0"/>
+      </w:pPr>
+    </w:p>
+    <w:p>
+      <w:pPr>
+        <w:spacing w:lineRule="exact" w:line="360"/>
+        <w:ind w:firstLine="0" w:left="0"/>
+      </w:pPr>
+      <w:r>
+        <w:rPr>
+          <w:rFonts w:ascii="Century" w:hAnsi="Century" w:eastAsia="ＭＳ 明朝"/>
+          <w:b/>
+          <w:sz w:val="24"/>
+        </w:rPr>
+        <w:t>【外国語文献】</w:t>
       </w:r>
     </w:p>
     <w:p>
@@ -8412,27 +5653,7 @@
           <w:b w:val="0"/>
           <w:sz w:val="24"/>
         </w:rPr>
-        <w:t>林克彦（2023）「第1章　ウィズコロナ期における消費者行動とネット通販物流の変化」『消費者行動の変化がネット通販物流に及ぼす影響に関する研究』日交研シリーズA-870，公益社団法人日本交通政策研究会，1-17頁。</w:t>
-      </w:r>
-    </w:p>
-    <w:p>
-      <w:pPr>
-        <w:spacing w:lineRule="exact" w:line="360"/>
-        <w:ind w:firstLine="0" w:left="0"/>
-      </w:pPr>
-    </w:p>
-    <w:p>
-      <w:pPr>
-        <w:spacing w:lineRule="exact" w:line="360"/>
-        <w:ind w:firstLine="0" w:left="0"/>
-      </w:pPr>
-      <w:r>
-        <w:rPr>
-          <w:rFonts w:ascii="Century" w:hAnsi="Century" w:eastAsia="ＭＳ 明朝"/>
-          <w:b/>
-          <w:sz w:val="24"/>
-        </w:rPr>
-        <w:t>【外国語文献】</w:t>
+        <w:t>Bartlett, C. A., &amp; Ghoshal, S. (1989). Managing across borders: The transnational solution. Harvard Business School Press.</w:t>
       </w:r>
     </w:p>
     <w:p>
@@ -8446,7 +5667,7 @@
           <w:b w:val="0"/>
           <w:sz w:val="24"/>
         </w:rPr>
-        <w:t>Bartlett, C. A., &amp; Ghoshal, S. (1989). Managing across borders: The transnational solution. Harvard Business School Press.</w:t>
+        <w:t>Coase, R. H. (1937). The nature of the firm. Economica, 4(16), 386–405.</w:t>
       </w:r>
     </w:p>
     <w:p>
@@ -8460,7 +5681,7 @@
           <w:b w:val="0"/>
           <w:sz w:val="24"/>
         </w:rPr>
-        <w:t>Coase, R. H. (1937). The nature of the firm. Economica, 4(16), 386–405.</w:t>
+        <w:t>Prahalad, C. K., &amp; Doz, Y. L. (1987). The multinational mission: Balancing local demands and global vision. Free Press.</w:t>
       </w:r>
     </w:p>
     <w:p>
@@ -8474,7 +5695,7 @@
           <w:b w:val="0"/>
           <w:sz w:val="24"/>
         </w:rPr>
-        <w:t>Davis, L. E., &amp; North, D. C. (1971). Institutional change and American economic growth. Cambridge University Press.</w:t>
+        <w:t>Williamson, O. E. (1985). The economic institutions of capitalism: Firms, markets, relational contracting. Free Press.</w:t>
       </w:r>
     </w:p>
     <w:p>
@@ -8488,105 +5709,7 @@
           <w:b w:val="0"/>
           <w:sz w:val="24"/>
         </w:rPr>
-        <w:t>Gevaers, R., Van de Voorde, E., &amp; Vanelslander, T. (2011). Characteristics and typology of last-mile logistics from an innovation perspective in an urban context. In City distribution and urban freight transport. Edward Elgar Publishing.</w:t>
-      </w:r>
-    </w:p>
-    <w:p>
-      <w:pPr>
-        <w:spacing w:lineRule="exact" w:line="360"/>
-        <w:ind w:hanging="480" w:left="480"/>
-      </w:pPr>
-      <w:r>
-        <w:rPr>
-          <w:rFonts w:ascii="Century" w:hAnsi="Century" w:eastAsia="ＭＳ 明朝"/>
-          <w:b w:val="0"/>
-          <w:sz w:val="24"/>
-        </w:rPr>
-        <w:t>Ha, N. T., Akbari, M., &amp; Au, B. (2023). Last mile delivery in logistics and supply chain management: A bibliometric analysis and future directions. Benchmarking: An International Journal, 30(4), 1137–1170.</w:t>
-      </w:r>
-    </w:p>
-    <w:p>
-      <w:pPr>
-        <w:spacing w:lineRule="exact" w:line="360"/>
-        <w:ind w:hanging="480" w:left="480"/>
-      </w:pPr>
-      <w:r>
-        <w:rPr>
-          <w:rFonts w:ascii="Century" w:hAnsi="Century" w:eastAsia="ＭＳ 明朝"/>
-          <w:b w:val="0"/>
-          <w:sz w:val="24"/>
-        </w:rPr>
-        <w:t>Inoue, Y., &amp; Hashimoto, M. (2023). Significance of face-to-face service quality in last mile delivery for e-commerce platforms. Transportation Research Interdisciplinary Perspectives, 21, 100885.</w:t>
-      </w:r>
-    </w:p>
-    <w:p>
-      <w:pPr>
-        <w:spacing w:lineRule="exact" w:line="360"/>
-        <w:ind w:hanging="480" w:left="480"/>
-      </w:pPr>
-      <w:r>
-        <w:rPr>
-          <w:rFonts w:ascii="Century" w:hAnsi="Century" w:eastAsia="ＭＳ 明朝"/>
-          <w:b w:val="0"/>
-          <w:sz w:val="24"/>
-        </w:rPr>
-        <w:t>Prahalad, C. K., &amp; Doz, Y. L. (1987). The multinational mission: Balancing local demands and global vision. Free Press.</w:t>
-      </w:r>
-    </w:p>
-    <w:p>
-      <w:pPr>
-        <w:spacing w:lineRule="exact" w:line="360"/>
-        <w:ind w:hanging="480" w:left="480"/>
-      </w:pPr>
-      <w:r>
-        <w:rPr>
-          <w:rFonts w:ascii="Century" w:hAnsi="Century" w:eastAsia="ＭＳ 明朝"/>
-          <w:b w:val="0"/>
-          <w:sz w:val="24"/>
-        </w:rPr>
-        <w:t>Simon, H. A. (1961). Administrative behavior (2nd ed.). Macmillan.</w:t>
-      </w:r>
-    </w:p>
-    <w:p>
-      <w:pPr>
-        <w:spacing w:lineRule="exact" w:line="360"/>
-        <w:ind w:hanging="480" w:left="480"/>
-      </w:pPr>
-      <w:r>
-        <w:rPr>
-          <w:rFonts w:ascii="Century" w:hAnsi="Century" w:eastAsia="ＭＳ 明朝"/>
-          <w:b w:val="0"/>
-          <w:sz w:val="24"/>
-        </w:rPr>
-        <w:t>Williamson, O. E. (1985). The economic institutions of capitalism: Firms, markets, relational contracting. Free Press.</w:t>
-      </w:r>
-    </w:p>
-    <w:p>
-      <w:pPr>
-        <w:spacing w:lineRule="exact" w:line="360"/>
-        <w:ind w:hanging="480" w:left="480"/>
-      </w:pPr>
-      <w:r>
-        <w:rPr>
-          <w:rFonts w:ascii="Century" w:hAnsi="Century" w:eastAsia="ＭＳ 明朝"/>
-          <w:b w:val="0"/>
-          <w:sz w:val="24"/>
-        </w:rPr>
         <w:t>Williamson, O. E. (1991). Comparative economic organization: The analysis of discrete structural alternatives. Administrative Science Quarterly, 36(2), 269–296.</w:t>
-      </w:r>
-    </w:p>
-    <w:p>
-      <w:pPr>
-        <w:spacing w:lineRule="exact" w:line="360"/>
-        <w:ind w:hanging="480" w:left="480"/>
-      </w:pPr>
-      <w:r>
-        <w:rPr>
-          <w:rFonts w:ascii="Century" w:hAnsi="Century" w:eastAsia="ＭＳ 明朝"/>
-          <w:b w:val="0"/>
-          <w:sz w:val="24"/>
-        </w:rPr>
-        <w:t>Zamal, M. A., Schrotenboer, A. H., &amp; van Woensel, T. (2025). End-to-end logistics in metropolitan areas: A stochastic dynamic order-assignment and dispatching problem. Transportation Research Part B: Methodological, 199, 103249.</w:t>
       </w:r>
     </w:p>
     <w:sectPr>

</xml_diff>

<commit_message>
Attribute summarized prior research accurately instead of to citing authors
Co-Authored-By: Claude Opus 5.5 <noreply@anthropic.com>
Claude-Session: https://claude.ai/code/session_01D75XZCNXPUXwLshn5jBJpA
</commit_message>
<xml_diff>
--- a/thesis/修士論文_第1章_第2章_目次・参考文献付き.docx
+++ b/thesis/修士論文_第1章_第2章_目次・参考文献付き.docx
@@ -1224,7 +1224,7 @@
           <w:szCs w:val="28"/>
           <w:lang w:eastAsia="ja-JP"/>
         </w:rPr>
-        <w:t>フルフィルメントの中でも、本研究が注目するのはラストマイル配送である。丁（2026，39頁）によれば、ECにおけるフルフィルメントは、生産拠点から物流倉庫へ至る「ファーストマイル」、物流拠点間の輸送を担う「ミドルマイル」、顧客へ商品を届ける「ラストマイル」の3段階で構成される。ラストマイル配送の定義は論者によって様々であるが、本研究では丁（2026，40頁）にならい、ラストマイル配送を「最終発送地点から荷受人が受け取る地点までの輸送プロセス」と捉える。</w:t>
+        <w:t>フルフィルメントの中でも、本研究が注目するのはラストマイル配送である。丁（2026，39頁）は、先行研究にもとづき、ECにおけるフルフィルメントを、生産拠点から物流倉庫へ至る「ファーストマイル」、物流拠点間の輸送を担う「ミドルマイル」、顧客へ商品を届ける「ラストマイル」の3段階に整理している。ラストマイル配送の定義は論者によって様々であるが、丁（2026，40頁）は、先行研究の定義にもとづき、ラストマイル配送を「最終発送地点から荷受人が受け取る地点までの輸送プロセス」と捉えている。本研究もこの定義に従う。</w:t>
       </w:r>
     </w:p>
     <w:p>
@@ -1268,7 +1268,7 @@
           <w:szCs w:val="28"/>
           <w:lang w:eastAsia="ja-JP"/>
         </w:rPr>
-        <w:t>第二に、ラストマイル配送はコストと効率性の面でも大きな課題を抱えている。丁（2026，39頁）は、ラストマイルがフルフィルメントの中で最もコストが高く非効率な段階であり、環境負荷の問題も深刻であると述べている。また丁（2023，5-6頁）も、ECでは膨大な数の商品を小ロットで「極めて多くの場所」に届けなければならず、ラストマイル問題はまさにこのことを反映していると指摘している。さらに、ECの宅配需要の急増とラストマイルにおけるドライバー不足を背景として、宅配危機が深刻化している（林，2020，9頁）。林（2020，13-14頁）は、ラストマイルは自動化や無人化が困難な最も労働集約的な工程であり、物流革新の大きな障壁となっていると指摘している。</w:t>
+        <w:t>第二に、ラストマイル配送はコストと効率性の面でも大きな課題を抱えている。丁（2026，39頁）は、先行研究にもとづき、ラストマイルがフルフィルメントの中で最もコストが高く非効率な段階であり、環境負荷の問題も深刻であると述べている。また丁（2023，5-6頁）も、ECでは膨大な数の商品を小ロットで「極めて多くの場所」に届けなければならず、ラストマイル問題はまさにこのことを反映していると指摘している。さらに、ECの宅配需要の急増とラストマイルにおけるドライバー不足を背景として、宅配危機が深刻化している（林，2020，9頁）。林（2020，13-14頁）は、ラストマイルは自動化や無人化が困難な最も労働集約的な工程であり、物流革新の大きな障壁となっていると指摘している。</w:t>
       </w:r>
       <w:proofErr w:type="spellStart"/>
       <w:proofErr w:type="spellEnd"/>
@@ -4135,7 +4135,7 @@
           <w:sz w:val="24"/>
           <w:lang w:eastAsia="ja-JP"/>
         </w:rPr>
-        <w:t>取引費用論の出発点は、Coase（1937）の問題提起にある。Coase（1937，390-391頁）は、企業が設立される主な理由を、価格メカニズムを利用するための費用、すなわち適切な価格を見いだす費用や、取引ごとに契約を交渉・締結する費用の存在に求めた。そして企業は、追加的な取引を企業内部で組織化する費用が、同じ取引を市場で行う費用と等しくなるところまで拡大するとされる（Coase，1937，394-395頁）。武田（2013，317-318頁）の整理によれば、取引費用には、取引相手の探索、交渉、契約作成といった取引前の費用と、契約履行のモニタリングや執行といった取引後の費用が含まれる。</w:t>
+        <w:t>取引費用論の出発点は、Coase（1937）の問題提起にある。Coase（1937，390-391頁）は、企業が設立される主な理由を、価格メカニズムを利用するための費用、すなわち適切な価格を見いだす費用や、取引ごとに契約を交渉・締結する費用の存在に求めた。そして企業は、追加的な取引を企業内部で組織化する費用が、同じ取引を市場で行う費用と等しくなるところまで拡大するとされる（Coase，1937，394-395頁）。武田（2013，317-318頁）が先行研究にもとづいて行った整理によれば、取引費用には、取引相手の探索、交渉、契約作成といった取引前の費用と、契約履行のモニタリングや執行といった取引後の費用が含まれる。</w:t>
       </w:r>
     </w:p>
     <w:p>
@@ -4153,7 +4153,7 @@
           <w:sz w:val="24"/>
           <w:lang w:eastAsia="ja-JP"/>
         </w:rPr>
-        <w:t>Coaseが必ずしも明確にしなかった、市場での取引に費用が生じる理由を、Williamsonは人間行動の二つの特性、すなわち限定合理性と機会主義に求めた（武田，2013，324頁）。Williamson（1985，30頁）によれば、限定合理性とは、人間は合理的であろうと意図するものの、その合理性には限界がある（"intendedly rational, but only limitedly so"）ことを指す。機会主義とは、狡猾さを伴って自己の利益を追求すること（self-interest seeking with guile）である（Williamson，1985，30頁）。</w:t>
+        <w:t>Coaseが必ずしも明確にしなかった、市場での取引に費用が生じる理由を、Williamsonは人間行動の二つの特性、すなわち限定合理性と機会主義に求めた（武田，2013，324頁）。Williamson（1985，30頁）は、人間は合理的であろうと意図するものの、その合理性には限界があるという限定合理性を、取引費用論の行動仮定の一つとしている。機会主義とは、狡猾さを伴って自己の利益を追求すること（self-interest seeking with guile）である（Williamson，1985，30頁）。</w:t>
       </w:r>
       <w:proofErr w:type="spellStart"/>
       <w:proofErr w:type="spellEnd"/>
@@ -5379,7 +5379,7 @@
           <w:sz w:val="24"/>
           <w:lang w:eastAsia="ja-JP"/>
         </w:rPr>
-        <w:t>Williamson（1991，287頁）は、生産、交換、分配の基礎となる政治的・社会的・法的な基本ルールの集合を制度的環境と呼んでいる。そのうえで、制度的環境を、ガバナンス構造の相対的な統治コストを変化させるパラメータ（shift parameters）として位置づけ、財産権、契約法、評判効果、不確実性の四つの変化を検討している。また、市場・ハイブリッド・階層組織の三つを想定すると、市場から階層組織への移行（またはその逆）には大きなパラメータの変化が必要であるのに対し、市場からハイブリッドへ、あるいはハイブリッドから階層組織への移行は、より小さな変化によっても生じうるとしている（同上）。</w:t>
+        <w:t>Williamson（1991，287頁）は、既存の定義を用いて、生産、交換、分配の基礎となる政治的・社会的・法的な基本ルールの集合を制度的環境と呼んでいる。そのうえで、制度的環境を、ガバナンス構造の相対的な統治コストを変化させるパラメータ（shift parameters）として位置づけ、財産権、契約法、評判効果、不確実性の四つの変化を検討している。また、市場・ハイブリッド・階層組織の三つを想定すると、市場から階層組織への移行（またはその逆）には大きなパラメータの変化が必要であるのに対し、市場からハイブリッドへ、あるいはハイブリッドから階層組織への移行は、より小さな変化によっても生じうるとしている（同上）。</w:t>
       </w:r>
     </w:p>
     <w:p>

</xml_diff>

<commit_message>
Unify page notation to p./pp. in Chapter 2 sections and master document
Co-Authored-By: Claude Opus 5.5 <noreply@anthropic.com>
Claude-Session: https://claude.ai/code/session_01D75XZCNXPUXwLshn5jBJpA
</commit_message>
<xml_diff>
--- a/thesis/修士論文_第1章_第2章_目次・参考文献付き.docx
+++ b/thesis/修士論文_第1章_第2章_目次・参考文献付き.docx
@@ -1165,7 +1165,7 @@
           <w:szCs w:val="28"/>
           <w:lang w:eastAsia="ja-JP"/>
         </w:rPr>
-        <w:t>ECでは、消費者が実店舗に来店して商品を持ち帰る従来の小売業とは異なり、注文を受けた商品を事業者が顧客の手元まで届ける必要がある。そのため、受注から配達までの物流業務を一体的に担うフルフィルメントが、EC企業にとって重要なオペレーションとなる。丁（2023，5頁）は、EC におけるフルフィルメントの業務範囲は、「検品、在庫管理、商品保管」などといった Inbound operations、および、「（顧客の注文に対応した） 商品のピッキング、梱包、発送、配達」などといった Outbound operations の 2 種類の業務を対象としたサービスであると整理している。また丁（2023，2頁）は、「フルフィルメントにおける優位性は，EC における顧客満足に極めて大きな影響を与えると考えられる」と述べている。そのため、フルフィルメントはEC事業の成否を左右する重要な要因であると考えられる。</w:t>
+        <w:t>ECでは、消費者が実店舗に来店して商品を持ち帰る従来の小売業とは異なり、注文を受けた商品を事業者が顧客の手元まで届ける必要がある。そのため、受注から配達までの物流業務を一体的に担うフルフィルメントが、EC企業にとって重要なオペレーションとなる。丁（2023，p.5）は、EC におけるフルフィルメントの業務範囲は、「検品、在庫管理、商品保管」などといった Inbound operations、および、「（顧客の注文に対応した） 商品のピッキング、梱包、発送、配達」などといった Outbound operations の 2 種類の業務を対象としたサービスであると整理している。また丁（2023，p.2）は、「フルフィルメントにおける優位性は，EC における顧客満足に極めて大きな影響を与えると考えられる」と述べている。そのため、フルフィルメントはEC事業の成否を左右する重要な要因であると考えられる。</w:t>
       </w:r>
     </w:p>
     <w:p>
@@ -1224,7 +1224,7 @@
           <w:szCs w:val="28"/>
           <w:lang w:eastAsia="ja-JP"/>
         </w:rPr>
-        <w:t>フルフィルメントの中でも、本研究が注目するのはラストマイル配送である。丁（2026，39頁）は、先行研究にもとづき、ECにおけるフルフィルメントを、生産拠点から物流倉庫へ至る「ファーストマイル」、物流拠点間の輸送を担う「ミドルマイル」、顧客へ商品を届ける「ラストマイル」の3段階に整理している。ラストマイル配送の定義は論者によって様々であるが、丁（2026，40頁）は、先行研究の定義にもとづき、ラストマイル配送を「最終発送地点から荷受人が受け取る地点までの輸送プロセス」と捉えている。本研究もこの定義に従う。</w:t>
+        <w:t>フルフィルメントの中でも、本研究が注目するのはラストマイル配送である。丁（2026，p.39）は、先行研究にもとづき、ECにおけるフルフィルメントを、生産拠点から物流倉庫へ至る「ファーストマイル」、物流拠点間の輸送を担う「ミドルマイル」、顧客へ商品を届ける「ラストマイル」の3段階に整理している。ラストマイル配送の定義は論者によって様々であるが、丁（2026，p.40）は、先行研究の定義にもとづき、ラストマイル配送を「最終発送地点から荷受人が受け取る地点までの輸送プロセス」と捉えている。本研究もこの定義に従う。</w:t>
       </w:r>
     </w:p>
     <w:p>
@@ -1246,7 +1246,7 @@
           <w:szCs w:val="28"/>
           <w:lang w:eastAsia="ja-JP"/>
         </w:rPr>
-        <w:t>ラストマイル配送は、次の二つの理由からEC物流において特に重要な位置を占める。第一に、ラストマイル配送は顧客と直接接する物流工程であり、その品質が顧客の評価に直結する。丁（2023，8頁）は、先行研究のレビューを通じて、「注文の追跡」「適時性／オンタイム配送」「商品の状態／配送品質」など、配送段階に関わるフルフィルメント要素が顧客満足に影響を与えることを示している。また丁（2026）は、配達員による対面サービスの品質が顧客満足に影響することを示す先行研究を整理したうえで（41頁）、配送状況の追跡などに関わる配送情報の品質が、顧客満足を介して再利用意向に影響することを明らかにしている（39頁，49頁）。</w:t>
+        <w:t>ラストマイル配送は、次の二つの理由からEC物流において特に重要な位置を占める。第一に、ラストマイル配送は顧客と直接接する物流工程であり、その品質が顧客の評価に直結する。丁（2023，p.8）は、先行研究のレビューを通じて、「注文の追跡」「適時性／オンタイム配送」「商品の状態／配送品質」など、配送段階に関わるフルフィルメント要素が顧客満足に影響を与えることを示している。また丁（2026）は、配達員による対面サービスの品質が顧客満足に影響することを示す先行研究を整理したうえで（p.41）、配送状況の追跡などに関わる配送情報の品質が、顧客満足を介して再利用意向に影響することを明らかにしている（pp.39，49）。</w:t>
       </w:r>
     </w:p>
     <w:p>
@@ -1268,7 +1268,7 @@
           <w:szCs w:val="28"/>
           <w:lang w:eastAsia="ja-JP"/>
         </w:rPr>
-        <w:t>第二に、ラストマイル配送はコストと効率性の面でも大きな課題を抱えている。丁（2026，39頁）は、先行研究にもとづき、ラストマイルがフルフィルメントの中で最もコストが高く非効率な段階であり、環境負荷の問題も深刻であると述べている。また丁（2023，5-6頁）も、ECでは膨大な数の商品を小ロットで「極めて多くの場所」に届けなければならず、ラストマイル問題はまさにこのことを反映していると指摘している。さらに、ECの宅配需要の急増とラストマイルにおけるドライバー不足を背景として、宅配危機が深刻化している（林，2020，9頁）。林（2020，13-14頁）は、ラストマイルは自動化や無人化が困難な最も労働集約的な工程であり、物流革新の大きな障壁となっていると指摘している。</w:t>
+        <w:t>第二に、ラストマイル配送はコストと効率性の面でも大きな課題を抱えている。丁（2026，p.39）は、先行研究にもとづき、ラストマイルがフルフィルメントの中で最もコストが高く非効率な段階であり、環境負荷の問題も深刻であると述べている。また丁（2023，pp.5-6）も、ECでは膨大な数の商品を小ロットで「極めて多くの場所」に届けなければならず、ラストマイル問題はまさにこのことを反映していると指摘している。さらに、ECの宅配需要の急増とラストマイルにおけるドライバー不足を背景として、宅配危機が深刻化している（林，2020，p.9）。林（2020，pp.13-14）は、ラストマイルは自動化や無人化が困難な最も労働集約的な工程であり、物流革新の大きな障壁となっていると指摘している。</w:t>
       </w:r>
       <w:proofErr w:type="spellStart"/>
       <w:proofErr w:type="spellEnd"/>
@@ -1341,7 +1341,7 @@
           <w:szCs w:val="28"/>
           <w:lang w:eastAsia="ja-JP"/>
         </w:rPr>
-        <w:t>こうした中で、EC企業であるAmazonは、フルフィルメントセンターを中心とする独自の物流ネットワークを構築するとともに、ラストマイル配送においても宅配便事業者への依存から脱却し、自らコントロールできる配送の拡大を進めてきた（齊藤，2021，59-60頁；齊藤，2022，44頁）。なお、本研究では、宅配便事業者に委託せず、Amazonが配送の担い手を自ら調達・組織化して行う配送を「自社配送」と呼ぶ。ただし、その実際の担い手は主として運送事業者や個人事業主といった外部の事業者であり、Amazonが直接雇用するドライバーによる配送を意味するものではない点に留意が必要である。</w:t>
+        <w:t>こうした中で、EC企業であるAmazonは、フルフィルメントセンターを中心とする独自の物流ネットワークを構築するとともに、ラストマイル配送においても宅配便事業者への依存から脱却し、自らコントロールできる配送の拡大を進めてきた（齊藤，2021，pp.59-60；齊藤，2022，p.44）。なお、本研究では、宅配便事業者に委託せず、Amazonが配送の担い手を自ら調達・組織化して行う配送を「自社配送」と呼ぶ。ただし、その実際の担い手は主として運送事業者や個人事業主といった外部の事業者であり、Amazonが直接雇用するドライバーによる配送を意味するものではない点に留意が必要である。</w:t>
       </w:r>
     </w:p>
     <w:p>
@@ -1363,7 +1363,7 @@
           <w:szCs w:val="28"/>
           <w:lang w:eastAsia="ja-JP"/>
         </w:rPr>
-        <w:t>米国のAmazonは、従来、UPSやFedExといった大手宅配便事業者や郵便のUSPSにラストマイル配送を委託してきた。しかし、寡占的な市場構造のもとで大手宅配便事業者は毎年のように運賃の値上げを行い、Amazonの売上高に占める輸送コストの比率は2017年には12.2％に上昇した（齊藤，2021，53頁）。さらに2013年のクリスマスシーズンには、急増した貨物にUPSが対応できず大規模な遅配が発生し、顧客の信頼が大きく損なわれた。これを契機として、Amazonは自らコントロールできるラストマイル配送に取り組み始めた（齊藤，2022，45-46頁）。具体的には、2015年に自家用車を保有する個人ドライバーに配送を委託するAmazon Flexを、2018年にはAmazonの貨物を専門に配送する運送会社の起業を支援するデリバリー・サービス・パートナー（DSP）プログラムを開始した（齊藤，2022，49頁，53頁）。その結果、Amazonが出荷する貨物のうち自社でコントロールする配送の比率は、2016年末の8％から2019年7月には49％に達したとされる（齊藤，2022，46頁）。</w:t>
+        <w:t>米国のAmazonは、従来、UPSやFedExといった大手宅配便事業者や郵便のUSPSにラストマイル配送を委託してきた。しかし、寡占的な市場構造のもとで大手宅配便事業者は毎年のように運賃の値上げを行い、Amazonの売上高に占める輸送コストの比率は2017年には12.2％に上昇した（齊藤，2021，p.53）。さらに2013年のクリスマスシーズンには、急増した貨物にUPSが対応できず大規模な遅配が発生し、顧客の信頼が大きく損なわれた。これを契機として、Amazonは自らコントロールできるラストマイル配送に取り組み始めた（齊藤，2022，pp.45-46）。具体的には、2015年に自家用車を保有する個人ドライバーに配送を委託するAmazon Flexを、2018年にはAmazonの貨物を専門に配送する運送会社の起業を支援するデリバリー・サービス・パートナー（DSP）プログラムを開始した（齊藤，2022，pp.49，53）。その結果、Amazonが出荷する貨物のうち自社でコントロールする配送の比率は、2016年末の8％から2019年7月には49％に達したとされる（齊藤，2022，p.46）。</w:t>
       </w:r>
     </w:p>
     <w:p>
@@ -1385,7 +1385,7 @@
           <w:szCs w:val="28"/>
           <w:lang w:eastAsia="ja-JP"/>
         </w:rPr>
-        <w:t>アマゾンジャパンも、ラストマイル配送を基本的にヤマト運輸、日本郵便、佐川急便の大手宅配便事業者に依存してきた（齊藤，2022，56頁）。しかし、2013年には佐川急便が採算性の低い大口ネット通販契約を見直し（林，2020，9-10頁）、さらに2017年には、ドライバー不足のもとでヤマト運輸が荷受量の総量規制や一部サービスの停止を行うとともに、アマゾンジャパンに対しても40％の運賃値上げを実施した（齊藤，2022，56頁）。いわゆる「宅配クライシス」である。齊藤（2022，56頁）は、この宅配クライシスがアマゾンジャパンにとって脱宅配便を進める重要な契機になったと指摘している。実際に、アマゾンジャパンの配送に占める大手宅配便3社の利用率は、2017年4月の94％から2020年9月には41％にまで低下したとされる（齊藤，2022，56-57頁）。</w:t>
+        <w:t>アマゾンジャパンも、ラストマイル配送を基本的にヤマト運輸、日本郵便、佐川急便の大手宅配便事業者に依存してきた（齊藤，2022，p.56）。しかし、2013年には佐川急便が採算性の低い大口ネット通販契約を見直し（林，2020，pp.9-10）、さらに2017年には、ドライバー不足のもとでヤマト運輸が荷受量の総量規制や一部サービスの停止を行うとともに、アマゾンジャパンに対しても40％の運賃値上げを実施した（齊藤，2022，p.56）。いわゆる「宅配クライシス」である。齊藤（2022，p.56）は、この宅配クライシスがアマゾンジャパンにとって脱宅配便を進める重要な契機になったと指摘している。実際に、アマゾンジャパンの配送に占める大手宅配便3社の利用率は、2017年4月の94％から2020年9月には41％にまで低下したとされる（齊藤，2022，pp.56-57）。</w:t>
       </w:r>
     </w:p>
     <w:p>
@@ -1407,7 +1407,7 @@
           <w:szCs w:val="28"/>
           <w:lang w:eastAsia="ja-JP"/>
         </w:rPr>
-        <w:t>こうした中でアマゾンジャパンは、地域の中堅・中小運送事業者であるデリバリープロバイダ（ADP）への配送委託、貨物軽自動車運送事業の届出を行った個人事業主と直接契約するAmazon Flex、地域の店舗等が空き時間に近隣へ配送するAmazon Hub デリバリーパートナープログラム（AHDP）などを通じて、自らコントロールできる配送を拡大してきた（長谷川，2023，44-49頁；齊藤，2023，37-38頁）。2021年には、アマゾンジャパンが出荷する貨物約7億個のうち、約半数が宅配便以外で配送されていたと推計されている（齊藤，2022，57頁）。さらに2023年3月には、運送事業の経験がない人も含めて配送会社の起業を支援する、新たなデリバリーサービスパートナープログラム（以下、日本DSP）の運用を開始した（アマゾンジャパン，2023）。</w:t>
+        <w:t>こうした中でアマゾンジャパンは、地域の中堅・中小運送事業者であるデリバリープロバイダ（ADP）への配送委託、貨物軽自動車運送事業の届出を行った個人事業主と直接契約するAmazon Flex、地域の店舗等が空き時間に近隣へ配送するAmazon Hub デリバリーパートナープログラム（AHDP）などを通じて、自らコントロールできる配送を拡大してきた（長谷川，2023，pp.44-49；齊藤，2023，pp.37-38）。2021年には、アマゾンジャパンが出荷する貨物約7億個のうち、約半数が宅配便以外で配送されていたと推計されている（齊藤，2022，p.57）。さらに2023年3月には、運送事業の経験がない人も含めて配送会社の起業を支援する、新たなデリバリーサービスパートナープログラム（以下、日本DSP）の運用を開始した（アマゾンジャパン，2023）。</w:t>
       </w:r>
     </w:p>
     <w:p>
@@ -1471,7 +1471,7 @@
           <w:szCs w:val="28"/>
           <w:lang w:eastAsia="ja-JP"/>
         </w:rPr>
-        <w:t>1.1.3で述べたように、日米いずれにおいても、Amazonは大手宅配便事業者への依存を減らし、自社配送を拡大してきたという点では共通している。しかし、齊藤（2022，44頁）が指摘するように、日米ではEC物流を取り巻く仕組みや状況が異なるため、ラストマイル配送への取り組みにもそれぞれ異なる特徴がみられる。</w:t>
+        <w:t>1.1.3で述べたように、日米いずれにおいても、Amazonは大手宅配便事業者への依存を減らし、自社配送を拡大してきたという点では共通している。しかし、齊藤（2022，p.44）が指摘するように、日米ではEC物流を取り巻く仕組みや状況が異なるため、ラストマイル配送への取り組みにもそれぞれ異なる特徴がみられる。</w:t>
       </w:r>
     </w:p>
     <w:p>
@@ -1493,7 +1493,7 @@
           <w:szCs w:val="28"/>
           <w:lang w:eastAsia="ja-JP"/>
         </w:rPr>
-        <w:t>第一に、配送の主な担い手が異なる。米国では、Amazonの貨物を専門に配送する小規模な運送会社をDSPとして新たに起業させ、大規模に組織化してきた。DSPは、Amazonのロゴが入った専用の配送車両を用い、Amazonの制服を着たドライバーが配送を行うフランチャイズ型の仕組みである（齊藤，2022，49-50頁）。これに対して日本では、既存の地域運送事業者であるADPに配送を委託してきたが、実際の配送は、ADPの下請けである協力会社や個人の軽貨物運送事業者によって担われている（齊藤，2022，59-60頁）。</w:t>
+        <w:t>第一に、配送の主な担い手が異なる。米国では、Amazonの貨物を専門に配送する小規模な運送会社をDSPとして新たに起業させ、大規模に組織化してきた。DSPは、Amazonのロゴが入った専用の配送車両を用い、Amazonの制服を着たドライバーが配送を行うフランチャイズ型の仕組みである（齊藤，2022，pp.49-50）。これに対して日本では、既存の地域運送事業者であるADPに配送を委託してきたが、実際の配送は、ADPの下請けである協力会社や個人の軽貨物運送事業者によって担われている（齊藤，2022，pp.59-60）。</w:t>
       </w:r>
     </w:p>
     <w:p>
@@ -1515,7 +1515,7 @@
           <w:szCs w:val="28"/>
           <w:lang w:eastAsia="ja-JP"/>
         </w:rPr>
-        <w:t>第二に、Amazonによる管理の程度が異なる。米国のAmazonは、独自のアルゴリズムによって配送ルートと配送個数を割り当てるとともに、車載カメラやテレマティクス装置、スマートフォンのアプリを通じてドライバーの運転や配送状況を監視している。さらに、その評価に基づいて運賃を変動させ、評価の低いDSPとは契約を打ち切っている（齊藤，2022，51-52頁）。一方、日本のADPについて齊藤（2022，65頁）は、アマゾンジャパンは従来の宅配便事業者と同様に配送業務を委託しているにすぎず、米国のような監視や統制は行っていないとしている。</w:t>
+        <w:t>第二に、Amazonによる管理の程度が異なる。米国のAmazonは、独自のアルゴリズムによって配送ルートと配送個数を割り当てるとともに、車載カメラやテレマティクス装置、スマートフォンのアプリを通じてドライバーの運転や配送状況を監視している。さらに、その評価に基づいて運賃を変動させ、評価の低いDSPとは契約を打ち切っている（齊藤，2022，pp.51-52）。一方、日本のADPについて齊藤（2022，p.65）は、アマゾンジャパンは従来の宅配便事業者と同様に配送業務を委託しているにすぎず、米国のような監視や統制は行っていないとしている。</w:t>
       </w:r>
     </w:p>
     <w:p>
@@ -1537,7 +1537,7 @@
           <w:szCs w:val="28"/>
           <w:lang w:eastAsia="ja-JP"/>
         </w:rPr>
-        <w:t>第三に、同じ名称の仕組みであっても、その内容が異なる。齊藤（2022，61頁）は、「アメリカの場合アマゾン・フレックスは、自家用車で配送する個人のドライバーを対象にしたものであるが、日本のアマゾン・フレックスは軽貨物運送業者に直接ネット通販貨物を運ばせるものである」と述べている。日本のAmazon Flexは、貨物軽自動車運送事業の届出を行った個人事業主を対象としている（齊藤，2022，61-62頁）。これは、日本では、届出を行っていない一般の個人が有償で貨物を運送することは認められていないためである（林，2020，13頁）。</w:t>
+        <w:t>第三に、同じ名称の仕組みであっても、その内容が異なる。齊藤（2022，p.61）は、「アメリカの場合アマゾン・フレックスは、自家用車で配送する個人のドライバーを対象にしたものであるが、日本のアマゾン・フレックスは軽貨物運送業者に直接ネット通販貨物を運ばせるものである」と述べている。日本のAmazon Flexは、貨物軽自動車運送事業の届出を行った個人事業主を対象としている（齊藤，2022，pp.61-62）。これは、日本では、届出を行っていない一般の個人が有償で貨物を運送することは認められていないためである（林，2020，p.13）。</w:t>
       </w:r>
     </w:p>
     <w:p>
@@ -1559,7 +1559,7 @@
           <w:szCs w:val="28"/>
           <w:lang w:eastAsia="ja-JP"/>
         </w:rPr>
-        <w:t xml:space="preserve">　ただし、こうした違いは固定的なものではない。日本でも2023年には、米国のDSPと同様に配送会社の起業を支援する日本DSPが導入された（林，2023，10頁；齊藤，2023，39頁）。また、ADPの中には売上高の約7割をアマゾンジャパンに依存する事業者もみられ（齊藤，2022，58-59頁）、ADPの下請けドライバーの配送ルートや配送個数がAIによって割り当てられているとの報告もある（齊藤，2023，44-45頁）。したがって、日米の違いは単純な二分法で捉えるのではなく、担い手の専属性や管理の程度における違いとして、しかも時間とともに変化しうるものとして捉える必要がある。</w:t>
+        <w:t xml:space="preserve">　ただし、こうした違いは固定的なものではない。日本でも2023年には、米国のDSPと同様に配送会社の起業を支援する日本DSPが導入された（林，2023，p.10；齊藤，2023，p.39）。また、ADPの中には売上高の約7割をアマゾンジャパンに依存する事業者もみられ（齊藤，2022，pp.58-59）、ADPの下請けドライバーの配送ルートや配送個数がAIによって割り当てられているとの報告もある（齊藤，2023，pp.44-45）。したがって、日米の違いは単純な二分法で捉えるのではなく、担い手の専属性や管理の程度における違いとして、しかも時間とともに変化しうるものとして捉える必要がある。</w:t>
       </w:r>
     </w:p>
     <w:p>
@@ -1581,7 +1581,7 @@
           <w:szCs w:val="28"/>
           <w:lang w:eastAsia="ja-JP"/>
         </w:rPr>
-        <w:t>同じ企業が、同じ「脱宅配便」という方針のもとで自社配送を構築しているにもかかわらず、なぜ日米で異なる担い手、管理方式、契約形態が採用されたのか。また、日本では当初、既存の地域運送事業者や個人事業主が活用されてきたにもかかわらず、なぜ近年になって米国と同様の仕組みが導入されたのか。これらが本研究の出発点となる問題意識である。齊藤（2022，44-65頁）は日米の取り組みの実態を詳細に比較しているが、日米の物流環境のどのような違いが、どのような論理を通じて配送方式の違いをもたらしたのかについては、理論的に説明する余地が残されている。</w:t>
+        <w:t>同じ企業が、同じ「脱宅配便」という方針のもとで自社配送を構築しているにもかかわらず、なぜ日米で異なる担い手、管理方式、契約形態が採用されたのか。また、日本では当初、既存の地域運送事業者や個人事業主が活用されてきたにもかかわらず、なぜ近年になって米国と同様の仕組みが導入されたのか。これらが本研究の出発点となる問題意識である。齊藤（2022，pp.44-65）は日米の取り組みの実態を詳細に比較しているが、日米の物流環境のどのような違いが、どのような論理を通じて配送方式の違いをもたらしたのかについては、理論的に説明する余地が残されている。</w:t>
       </w:r>
     </w:p>
     <w:p>
@@ -2761,7 +2761,7 @@
           <w:szCs w:val="28"/>
           <w:lang w:eastAsia="ja-JP"/>
         </w:rPr>
-        <w:t>ただし、ADPやAmazon Flexによる配送の規模など、Amazonの配送体制については公表されていない情報が多い（齊藤，2022，55頁，59頁）。そのため、本研究の分析の一部は、先行研究が引用する新聞・雑誌記事などの二次的な情報に依拠せざるを得ない。こうした限界を補うため、本研究では可能な限り複数の資料を照合し、資料間で記述が異なる場合にはその旨を明記する。</w:t>
+        <w:t>ただし、ADPやAmazon Flexによる配送の規模など、Amazonの配送体制については公表されていない情報が多い（齊藤，2022，pp.55，59）。そのため、本研究の分析の一部は、先行研究が引用する新聞・雑誌記事などの二次的な情報に依拠せざるを得ない。こうした限界を補うため、本研究では可能な限り複数の資料を照合し、資料間で記述が異なる場合にはその旨を明記する。</w:t>
       </w:r>
     </w:p>
     <w:p>
@@ -2865,7 +2865,7 @@
           <w:szCs w:val="28"/>
           <w:lang w:eastAsia="ja-JP"/>
         </w:rPr>
-        <w:t xml:space="preserve">　第一に、日米のラストマイル配送体制の違いを記述するだけでなく、その違いが「なぜ」生じたのかを理論的に説明しようとする点である。1.2で述べたように、齊藤（2022，44-65頁）は日米の取り組みの実態を詳細に比較しているが、その違いがどのような要因によって、どのような論理を通じて生じたのかについては、理論的に説明する余地が残されている。本研究は、取引費用論を用いて、配送体制の違いを取引の属性とガバナンス構造の関係から説明することで、この点を補完する。</w:t>
+        <w:t xml:space="preserve">　第一に、日米のラストマイル配送体制の違いを記述するだけでなく、その違いが「なぜ」生じたのかを理論的に説明しようとする点である。1.2で述べたように、齊藤（2022，pp.44-65）は日米の取り組みの実態を詳細に比較しているが、その違いがどのような要因によって、どのような論理を通じて生じたのかについては、理論的に説明する余地が残されている。本研究は、取引費用論を用いて、配送体制の違いを取引の属性とガバナンス構造の関係から説明することで、この点を補完する。</w:t>
       </w:r>
     </w:p>
     <w:p>
@@ -2887,7 +2887,7 @@
           <w:szCs w:val="28"/>
           <w:lang w:eastAsia="ja-JP"/>
         </w:rPr>
-        <w:t>第二に、取引費用論と標準化・現地適応論という二つの理論を組み合わせた分析枠組みを提示する点である。取引費用論は、主に企業の境界やガバナンスの選択を扱う理論であり、制度的環境を統治コストを変化させるパラメータとして位置づけてはいるものの（Williamson，1991，287頁）、多国籍企業が本国の仕組みを各国でどの程度共通化し、どの程度現地に適応させるかを主な分析対象とするものではない。一方、標準化・現地適応論は、多国籍企業が各国の環境にどう対応するかを扱うが、個々の業務を外部に委ねるのか、委ねる場合にどの程度管理するのかという判断の論理を十分に説明するものではない。本研究は、各国の物流環境の違いが取引の属性の違いを生み、それがガバナンス構造の違い、すなわち現地適応として現れるという分析枠組みを構築することで、両理論の接続を試みる。</w:t>
+        <w:t>第二に、取引費用論と標準化・現地適応論という二つの理論を組み合わせた分析枠組みを提示する点である。取引費用論は、主に企業の境界やガバナンスの選択を扱う理論であり、制度的環境を統治コストを変化させるパラメータとして位置づけてはいるものの（Williamson，1991，p.287）、多国籍企業が本国の仕組みを各国でどの程度共通化し、どの程度現地に適応させるかを主な分析対象とするものではない。一方、標準化・現地適応論は、多国籍企業が各国の環境にどう対応するかを扱うが、個々の業務を外部に委ねるのか、委ねる場合にどの程度管理するのかという判断の論理を十分に説明するものではない。本研究は、各国の物流環境の違いが取引の属性の違いを生み、それがガバナンス構造の違い、すなわち現地適応として現れるという分析枠組みを構築することで、両理論の接続を試みる。</w:t>
       </w:r>
     </w:p>
     <w:p>
@@ -3028,7 +3028,7 @@
           <w:szCs w:val="28"/>
           <w:lang w:eastAsia="ja-JP"/>
         </w:rPr>
-        <w:t xml:space="preserve">　第二に、日本のラストマイル配送が直面する課題への示唆である。アマゾンジャパンが大手宅配便事業者に代わる担い手として採用してきたADPは（齊藤，2022，65頁）、協力会社や個人の軽貨物運送事業者による下請構造に支えられており（齊藤，2022，59-60頁）、こうした軽貨物運送事業者の長時間労働や低収入が課題として指摘されている（齊藤，2022，60-61頁，64頁）。また、ドライバー不足が深刻化するなかで（林，2020，9頁）、配送の担い手をどのように確保し、組織するかは、EC事業者や物流事業者にとって重要な課題となっている。Amazonが日本の物流環境にどのように適応し、配送の担い手をどのように組織してきたのかを明らかにすることは、日本におけるラストマイル配送体制のあり方を考えるうえでも意義があると考えられる。</w:t>
+        <w:t xml:space="preserve">　第二に、日本のラストマイル配送が直面する課題への示唆である。アマゾンジャパンが大手宅配便事業者に代わる担い手として採用してきたADPは（齊藤，2022，p.65）、協力会社や個人の軽貨物運送事業者による下請構造に支えられており（齊藤，2022，pp.59-60）、こうした軽貨物運送事業者の長時間労働や低収入が課題として指摘されている（齊藤，2022，pp.60-61，64）。また、ドライバー不足が深刻化するなかで（林，2020，p.9）、配送の担い手をどのように確保し、組織するかは、EC事業者や物流事業者にとって重要な課題となっている。Amazonが日本の物流環境にどのように適応し、配送の担い手をどのように組織してきたのかを明らかにすることは、日本におけるラストマイル配送体制のあり方を考えるうえでも意義があると考えられる。</w:t>
       </w:r>
     </w:p>
     <w:p>
@@ -3842,7 +3842,7 @@
           <w:szCs w:val="24"/>
           <w:lang w:eastAsia="ja-JP"/>
         </w:rPr>
-        <w:t>ラストマイル配送に関する研究は、大きく二つの視点から行われてきた。第一は、顧客の視点から、配送の品質と顧客満足との関係を検討する研究である。丁（2023，8頁）は、ECのフルフィルメントに関する先行研究をレビューし、注文の追跡や適時性、商品の状態といった配送段階のフルフィルメント要素が顧客満足に影響を与えることを示している。また丁（2026，39頁）は、ラストマイル配送における情報品質が、顧客満足と再利用意向に与える影響を検討している。</w:t>
+        <w:t>ラストマイル配送に関する研究は、大きく二つの視点から行われてきた。第一は、顧客の視点から、配送の品質と顧客満足との関係を検討する研究である。丁（2023，p.8）は、ECのフルフィルメントに関する先行研究をレビューし、注文の追跡や適時性、商品の状態といった配送段階のフルフィルメント要素が顧客満足に影響を与えることを示している。また丁（2026，p.39）は、ラストマイル配送における情報品質が、顧客満足と再利用意向に与える影響を検討している。</w:t>
       </w:r>
     </w:p>
     <w:p>
@@ -3864,7 +3864,7 @@
           <w:szCs w:val="24"/>
           <w:lang w:eastAsia="ja-JP"/>
         </w:rPr>
-        <w:t>第二は、物流事業者や産業の視点から、ラストマイル配送を担う体制の課題を検討する研究である。林（2020）は、ネット通販の急増とドライバー不足を背景とする宅配危機を論じ（9頁）、ラストマイルが自動化の困難な最も労働集約的な工程であり、物流革新の大きな障壁となっていることを指摘している（13-14頁）。</w:t>
+        <w:t>第二は、物流事業者や産業の視点から、ラストマイル配送を担う体制の課題を検討する研究である。林（2020）は、ネット通販の急増とドライバー不足を背景とする宅配危機を論じ（p.9）、ラストマイルが自動化の困難な最も労働集約的な工程であり、物流革新の大きな障壁となっていることを指摘している（pp.13-14）。</w:t>
       </w:r>
     </w:p>
     <w:p>
@@ -3886,7 +3886,7 @@
           <w:szCs w:val="24"/>
           <w:lang w:eastAsia="ja-JP"/>
         </w:rPr>
-        <w:t>これらの研究は、ラストマイル配送の重要性と課題を明らかにしている。しかし、EC事業者が配送の担い手を誰に求め、どのように組織し、どの程度管理するのかという点については、林（2020，10頁，13頁）がAmazonによる配送事業者の組織化に触れているものの、主たる検討対象とはなっていない。</w:t>
+        <w:t>これらの研究は、ラストマイル配送の重要性と課題を明らかにしている。しかし、EC事業者が配送の担い手を誰に求め、どのように組織し、どの程度管理するのかという点については、林（2020，pp.10，13）がAmazonによる配送事業者の組織化に触れているものの、主たる検討対象とはなっていない。</w:t>
       </w:r>
     </w:p>
     <w:p>
@@ -3931,7 +3931,7 @@
           <w:szCs w:val="24"/>
           <w:lang w:eastAsia="ja-JP"/>
         </w:rPr>
-        <w:t>Amazonの配送体制を正面から取り上げているのが、齊藤による一連の研究である。齊藤（2021）は、Amazonの物流戦略を検討し、米国のAmazonが大手宅配便事業者への依存から脱却し、Amazon FlexやDSPなどを通じて自らコントロールする配送を拡大してきた過程を明らかにした（53-56頁，59-60頁）。齊藤（2022）は、これを日米比較へと発展させた。そこでは、米国のAmazonがフランチャイズ方式でAmazon専属の小規模な運送業者を起業させ、その配送を監視・評価しているのに対し、アマゾンジャパンはADPに配送を委託し、その下で協力会社や個人の軽貨物運送事業者が配送を担っていることが示されている（64-65頁）。</w:t>
+        <w:t>Amazonの配送体制を正面から取り上げているのが、齊藤による一連の研究である。齊藤（2021）は、Amazonの物流戦略を検討し、米国のAmazonが大手宅配便事業者への依存から脱却し、Amazon FlexやDSPなどを通じて自らコントロールする配送を拡大してきた過程を明らかにした（pp.53-56，59-60）。齊藤（2022）は、これを日米比較へと発展させた。そこでは、米国のAmazonがフランチャイズ方式でAmazon専属の小規模な運送業者を起業させ、その配送を監視・評価しているのに対し、アマゾンジャパンはADPに配送を委託し、その下で協力会社や個人の軽貨物運送事業者が配送を担っていることが示されている（pp.64-65）。</w:t>
       </w:r>
     </w:p>
     <w:p>
@@ -3953,7 +3953,7 @@
           <w:szCs w:val="24"/>
           <w:lang w:eastAsia="ja-JP"/>
         </w:rPr>
-        <w:t>日本の近年の動向については、齊藤（2023）が、宅配便以外で運ばれる、いわゆる「隠れ宅配」の増加を指摘したうえで（36-37頁）、ADPとAmazon Flexでは費用構造が異なり、Amazonは需要の変動に対応するため、宅配便、ADP、Amazon Flexという費用構造の異なる三つの配送主体に依存していると論じている（41頁）。また林（2023，10頁）は、2024年問題が近づくなかで、2023年に配送会社の起業を支援する新たなプログラムが導入されたことを指摘している。さらに長谷川（2023，44-49頁）は、ADP、Amazon Flex、AHDPなど、ラストマイル配送の最新の動向を整理している。</w:t>
+        <w:t>日本の近年の動向については、齊藤（2023）が、宅配便以外で運ばれる、いわゆる「隠れ宅配」の増加を指摘したうえで（pp.36-37）、ADPとAmazon Flexでは費用構造が異なり、Amazonは需要の変動に対応するため、宅配便、ADP、Amazon Flexという費用構造の異なる三つの配送主体に依存していると論じている（p.41）。また林（2023，p.10）は、2024年問題が近づくなかで、2023年に配送会社の起業を支援する新たなプログラムが導入されたことを指摘している。さらに長谷川（2023，pp.44-49）は、ADP、Amazon Flex、AHDPなど、ラストマイル配送の最新の動向を整理している。</w:t>
       </w:r>
     </w:p>
     <w:p>
@@ -3999,7 +3999,7 @@
           <w:szCs w:val="24"/>
           <w:lang w:eastAsia="ja-JP"/>
         </w:rPr>
-        <w:t>以上の先行研究により、Amazonが日米で脱宅配便を進め、それぞれ異なる担い手と管理方式によって配送体制を構築してきた実態は、詳細に明らかにされてきた。なかでも齊藤（2022，44-65頁）は、日米の取り組みを比較した研究として重要である。</w:t>
+        <w:t>以上の先行研究により、Amazonが日米で脱宅配便を進め、それぞれ異なる担い手と管理方式によって配送体制を構築してきた実態は、詳細に明らかにされてきた。なかでも齊藤（2022，pp.44-65）は、日米の取り組みを比較した研究として重要である。</w:t>
       </w:r>
     </w:p>
     <w:p>
@@ -4021,7 +4021,7 @@
           <w:szCs w:val="24"/>
           <w:lang w:eastAsia="ja-JP"/>
         </w:rPr>
-        <w:t>しかし、残された課題として次の三点が挙げられる。第一に、日米の違いがなぜ生じたのかについての理論的な説明である。齊藤（2022，44頁）は、日米でネット通販を取り巻く物流の仕組みや状況が異なることを違いの背景として挙げているが、物流環境のどのような違いが、どのような論理を通じて配送方式の違いをもたらしたのかは、十分に説明されていない。第二に、比較の尺度である。各配送主体の特徴や費用構造は明らかにされているものの（齊藤，2023，41頁）、それらを契約形態や管理の程度といった共通の尺度で比較する枠組みは示されていない。第三に、時間的な変化の扱いである。齊藤（2022）の刊行後には日本DSPが導入されており、こうした変化を含めて日米の違いを捉え直す必要がある。</w:t>
+        <w:t>しかし、残された課題として次の三点が挙げられる。第一に、日米の違いがなぜ生じたのかについての理論的な説明である。齊藤（2022，p.44）は、日米でネット通販を取り巻く物流の仕組みや状況が異なることを違いの背景として挙げているが、物流環境のどのような違いが、どのような論理を通じて配送方式の違いをもたらしたのかは、十分に説明されていない。第二に、比較の尺度である。各配送主体の特徴や費用構造は明らかにされているものの（齊藤，2023，p.41）、それらを契約形態や管理の程度といった共通の尺度で比較する枠組みは示されていない。第三に、時間的な変化の扱いである。齊藤（2022）の刊行後には日本DSPが導入されており、こうした変化を含めて日米の違いを捉え直す必要がある。</w:t>
       </w:r>
     </w:p>
     <w:p>
@@ -4135,7 +4135,7 @@
           <w:sz w:val="24"/>
           <w:lang w:eastAsia="ja-JP"/>
         </w:rPr>
-        <w:t>取引費用論の出発点は、Coase（1937）の問題提起にある。Coase（1937，390-391頁）は、企業が設立される主な理由を、価格メカニズムを利用するための費用、すなわち適切な価格を見いだす費用や、取引ごとに契約を交渉・締結する費用の存在に求めた。そして企業は、追加的な取引を企業内部で組織化する費用が、同じ取引を市場で行う費用と等しくなるところまで拡大するとされる（Coase，1937，394-395頁）。武田（2013，317-318頁）が先行研究にもとづいて行った整理によれば、取引費用には、取引相手の探索、交渉、契約作成といった取引前の費用と、契約履行のモニタリングや執行といった取引後の費用が含まれる。</w:t>
+        <w:t>取引費用論の出発点は、Coase（1937）の問題提起にある。Coase（1937，pp.390-391）は、企業が設立される主な理由を、価格メカニズムを利用するための費用、すなわち適切な価格を見いだす費用や、取引ごとに契約を交渉・締結する費用の存在に求めた。そして企業は、追加的な取引を企業内部で組織化する費用が、同じ取引を市場で行う費用と等しくなるところまで拡大するとされる（Coase，1937，pp.394-395）。武田（2013，pp.317-318）が先行研究にもとづいて行った整理によれば、取引費用には、取引相手の探索、交渉、契約作成といった取引前の費用と、契約履行のモニタリングや執行といった取引後の費用が含まれる。</w:t>
       </w:r>
     </w:p>
     <w:p>
@@ -4153,7 +4153,7 @@
           <w:sz w:val="24"/>
           <w:lang w:eastAsia="ja-JP"/>
         </w:rPr>
-        <w:t>Coaseが必ずしも明確にしなかった、市場での取引に費用が生じる理由を、Williamsonは人間行動の二つの特性、すなわち限定合理性と機会主義に求めた（武田，2013，324頁）。Williamson（1985，30頁）は、人間は合理的であろうと意図するものの、その合理性には限界があるという限定合理性を、取引費用論の行動仮定の一つとしている。機会主義とは、狡猾さを伴って自己の利益を追求すること（self-interest seeking with guile）である（Williamson，1985，30頁）。</w:t>
+        <w:t>Coaseが必ずしも明確にしなかった、市場での取引に費用が生じる理由を、Williamsonは人間行動の二つの特性、すなわち限定合理性と機会主義に求めた（武田，2013，p.324）。Williamson（1985，p.30）は、人間は合理的であろうと意図するものの、その合理性には限界があるという限定合理性を、取引費用論の行動仮定の一つとしている。機会主義とは、狡猾さを伴って自己の利益を追求すること（self-interest seeking with guile）である（Williamson，1985，p.30）。</w:t>
       </w:r>
       <w:proofErr w:type="spellStart"/>
       <w:proofErr w:type="spellEnd"/>
@@ -4173,7 +4173,7 @@
           <w:sz w:val="24"/>
           <w:lang w:eastAsia="ja-JP"/>
         </w:rPr>
-        <w:t>Williamson（1985，30-32頁）によれば、不確実性のもとで限定合理性、機会主義、資産特殊性の三つが同時に存在すると、事前の計画は不完全となり、約束は守られないおそれがあり、取引相手が誰であるかが重要になる。この場合、裁判所による契約の執行には限界があるため、当事者間の私的な統治の仕組みが必要となる。そこでの課題は、限定合理性を節約しつつ、機会主義の危険から取引を保護するように取引を組織することである（Williamson，1985，32頁）。</w:t>
+        <w:t>Williamson（1985，pp.30-32）によれば、不確実性のもとで限定合理性、機会主義、資産特殊性の三つが同時に存在すると、事前の計画は不完全となり、約束は守られないおそれがあり、取引相手が誰であるかが重要になる。この場合、裁判所による契約の執行には限界があるため、当事者間の私的な統治の仕組みが必要となる。そこでの課題は、限定合理性を節約しつつ、機会主義の危険から取引を保護するように取引を組織することである（Williamson，1985，p.32）。</w:t>
       </w:r>
     </w:p>
     <w:p>
@@ -4219,7 +4219,7 @@
           <w:sz w:val="24"/>
           <w:lang w:eastAsia="ja-JP"/>
         </w:rPr>
-        <w:t>Williamson（1991，281頁）は、取引を分析の基本単位とし、取引の違いを捉える主要な次元として、取引が繰り返される頻度、取引がさらされる不確実性、財やサービスの供給に伴う資産特殊性の種類と程度の三つを挙げ、なかでも資産特殊性を重視している。</w:t>
+        <w:t>Williamson（1991，p.281）は、取引を分析の基本単位とし、取引の違いを捉える主要な次元として、取引が繰り返される頻度、取引がさらされる不確実性、財やサービスの供給に伴う資産特殊性の種類と程度の三つを挙げ、なかでも資産特殊性を重視している。</w:t>
       </w:r>
     </w:p>
     <w:p>
@@ -4237,7 +4237,7 @@
           <w:sz w:val="24"/>
           <w:lang w:eastAsia="ja-JP"/>
         </w:rPr>
-        <w:t>資産特殊性とは、ある資産を、その生産的価値を損なうことなく、別の用途や別の使用者に転用できる程度を指す（Williamson，1991，281頁）。言い換えれば、特定の取引のために行われた投資が、他の用途や取引相手に転用された場合にどれだけ価値を失うかを示す概念である（Williamson，1991，282頁）。Williamson（1991，281-282頁）は資産特殊性を、①工程を隣接させて在庫や輸送の費用を節約する立地特殊性、②特殊な金型のような物的資産特殊性、③経験を通じた学習によって生じる人的資産特殊性、④ブランド資本、⑤特定の顧客の要請に応じて汎用的な設備に行われる投資である専用資産、⑥現場での適時の対応が不可欠となる時間的特殊性の六つに分類している。⑤の専用資産が示すように、汎用的な設備であっても、特定の顧客のために投資された場合には特殊性をもつ。すなわち資産特殊性は、資産が汎用的なものか特殊なものかという性質だけで決まるものではない。こうした資産特殊性、とりわけ①から⑤の形態は、取引当事者の間に双方向の依存関係を生み出し、契約上の危険を高める（Williamson，1991，282頁）。</w:t>
+        <w:t>資産特殊性とは、ある資産を、その生産的価値を損なうことなく、別の用途や別の使用者に転用できる程度を指す（Williamson，1991，p.281）。言い換えれば、特定の取引のために行われた投資が、他の用途や取引相手に転用された場合にどれだけ価値を失うかを示す概念である（Williamson，1991，p.282）。Williamson（1991，pp.281-282）は資産特殊性を、①工程を隣接させて在庫や輸送の費用を節約する立地特殊性、②特殊な金型のような物的資産特殊性、③経験を通じた学習によって生じる人的資産特殊性、④ブランド資本、⑤特定の顧客の要請に応じて汎用的な設備に行われる投資である専用資産、⑥現場での適時の対応が不可欠となる時間的特殊性の六つに分類している。⑤の専用資産が示すように、汎用的な設備であっても、特定の顧客のために投資された場合には特殊性をもつ。すなわち資産特殊性は、資産が汎用的なものか特殊なものかという性質だけで決まるものではない。こうした資産特殊性、とりわけ①から⑤の形態は、取引当事者の間に双方向の依存関係を生み出し、契約上の危険を高める（Williamson，1991，p.282）。</w:t>
       </w:r>
     </w:p>
     <w:p>
@@ -4255,7 +4255,7 @@
           <w:sz w:val="24"/>
           <w:lang w:eastAsia="ja-JP"/>
         </w:rPr>
-        <w:t>不確実性については、取引をとりまく状況の変化である攪乱（disturbance）の発生頻度が高まる場合と、その影響が大きくなる場合とが区別される（Williamson，1991，291頁）。頻度については、取引が繰り返されるにつれて相手の情報が蓄積され、機会主義的な行動が抑制されるとされる（武田，2013，323頁）。</w:t>
+        <w:t>不確実性については、取引をとりまく状況の変化である攪乱（disturbance）の発生頻度が高まる場合と、その影響が大きくなる場合とが区別される（Williamson，1991，p.291）。頻度については、取引が繰り返されるにつれて相手の情報が蓄積され、機会主義的な行動が抑制されるとされる（武田，2013，p.323）。</w:t>
       </w:r>
     </w:p>
     <w:p>
@@ -4273,7 +4273,7 @@
           <w:sz w:val="24"/>
           <w:lang w:eastAsia="ja-JP"/>
         </w:rPr>
-        <w:t>本研究では、資産特殊性を、配送事業者がAmazonとの取引のために行った投資が、他の荷主との取引に転用された場合にどの程度価値を失うかという観点から捉える。例えば米国のDSPは、Amazonのロゴが印刷された専用の配送車を使用し、Amazonの制服を着たドライバーがAmazonの貨物を配送しており（齊藤，2022，49頁）、ブランド資本や専用資産に近い性格をもつと考えられる。日本のADPやAmazon Flexにおける資産特殊性の種類と程度については、第5章で検討する。</w:t>
+        <w:t>本研究では、資産特殊性を、配送事業者がAmazonとの取引のために行った投資が、他の荷主との取引に転用された場合にどの程度価値を失うかという観点から捉える。例えば米国のDSPは、Amazonのロゴが印刷された専用の配送車を使用し、Amazonの制服を着たドライバーがAmazonの貨物を配送しており（齊藤，2022，p.49）、ブランド資本や専用資産に近い性格をもつと考えられる。日本のADPやAmazon Flexにおける資産特殊性の種類と程度については、第5章で検討する。</w:t>
       </w:r>
     </w:p>
     <w:p>
@@ -4319,7 +4319,7 @@
           <w:sz w:val="24"/>
           <w:lang w:eastAsia="ja-JP"/>
         </w:rPr>
-        <w:t>ガバナンス構造とは、取引が組み込まれる制度的な枠組みであり（Williamson，1985，35頁）、潜在的な対立を事前に予見し、それを防止・緩和するために設計されるものである（Williamson，1985，29頁）。取引費用論の予測力の多くを支える識別的整合（discriminating alignment）仮説は、属性の異なる取引が、費用と能力の異なるガバナンス構造と、主として取引費用を節約するように対応づけられるとする（Williamson，1991，277頁）。基本的なガバナンス構造には、市場、階層組織（企業内部）、両者の中間に位置するハイブリッドの三つがあり、ハイブリッドには長期契約、相互取引、規制、フランチャイズなどが含まれる（Williamson，1991，280頁）。</w:t>
+        <w:t>ガバナンス構造とは、取引が組み込まれる制度的な枠組みであり（Williamson，1985，p.35）、潜在的な対立を事前に予見し、それを防止・緩和するために設計されるものである（Williamson，1985，p.29）。取引費用論の予測力の多くを支える識別的整合（discriminating alignment）仮説は、属性の異なる取引が、費用と能力の異なるガバナンス構造と、主として取引費用を節約するように対応づけられるとする（Williamson，1991，p.277）。基本的なガバナンス構造には、市場、階層組織（企業内部）、両者の中間に位置するハイブリッドの三つがあり、ハイブリッドには長期契約、相互取引、規制、フランチャイズなどが含まれる（Williamson，1991，p.280）。</w:t>
       </w:r>
     </w:p>
     <w:p>
@@ -4337,7 +4337,7 @@
           <w:sz w:val="24"/>
           <w:lang w:eastAsia="ja-JP"/>
         </w:rPr>
-        <w:t>三つのガバナンス構造は、インセンティブや管理的統制といった手段、適応能力、そして依拠する契約法において異なる（Williamson，1991，277-281頁）。適応には、価格の変化に応じて各当事者が自律的に対応する適応（A：autonomy）と、当事者間の調整を必要とする協調的な適応（C：cooperation）がある。市場は前者に優れ、強いインセンティブをもつ一方、階層組織は後者に優れ、監視などの管理的統制を強く用いることができるが、インセンティブは弱まる。ハイブリッドは、これらすべての点で両者の中間的な性格をもつ（Williamson，1991，280-281頁）。これを整理したものが表2-1である。</w:t>
+        <w:t>三つのガバナンス構造は、インセンティブや管理的統制といった手段、適応能力、そして依拠する契約法において異なる（Williamson，1991，pp.277-281）。適応には、価格の変化に応じて各当事者が自律的に対応する適応（A：autonomy）と、当事者間の調整を必要とする協調的な適応（C：cooperation）がある。市場は前者に優れ、強いインセンティブをもつ一方、階層組織は後者に優れ、監視などの管理的統制を強く用いることができるが、インセンティブは弱まる。ハイブリッドは、これらすべての点で両者の中間的な性格をもつ（Williamson，1991，pp.280-281）。これを整理したものが表2-1である。</w:t>
       </w:r>
     </w:p>
     <w:p>
@@ -5289,7 +5289,7 @@
           <w:szCs w:val="18"/>
           <w:lang w:eastAsia="ja-JP"/>
         </w:rPr>
-        <w:t>出所：Williamson（1991，281頁，Table 1）をもとに筆者作成。</w:t>
+        <w:t>出所：Williamson（1991，p.281，Table 1）をもとに筆者作成。</w:t>
       </w:r>
     </w:p>
     <w:p>
@@ -5315,7 +5315,7 @@
           <w:sz w:val="24"/>
           <w:lang w:eastAsia="ja-JP"/>
         </w:rPr>
-        <w:t>その結果、資産特殊性が低い取引では市場、中程度の取引ではハイブリッド、高い取引では階層組織が、それぞれ最も統治コストの低いガバナンス構造となる（Williamson，1991，284頁）。ただし、ハイブリッドは双方の合意を通じて適応する必要があるため、攪乱が頻繁に生じる場合に最も影響を受けやすいとされる（Williamson，1991，291頁）。</w:t>
+        <w:t>その結果、資産特殊性が低い取引では市場、中程度の取引ではハイブリッド、高い取引では階層組織が、それぞれ最も統治コストの低いガバナンス構造となる（Williamson，1991，p.284）。ただし、ハイブリッドは双方の合意を通じて適応する必要があるため、攪乱が頻繁に生じる場合に最も影響を受けやすいとされる（Williamson，1991，p.291）。</w:t>
       </w:r>
     </w:p>
     <w:p>
@@ -5333,7 +5333,7 @@
           <w:sz w:val="24"/>
           <w:lang w:eastAsia="ja-JP"/>
         </w:rPr>
-        <w:t>本研究にとって重要なのは、同じハイブリッドの中にも管理の程度に差があるという点である。Williamson（1991，283頁）はフランチャイズをハイブリッドの例として挙げ、フランチャイジーは階層組織より大きな自律性をもつ一方で、市場取引と比べると追加的なルールや監視のもとに置かれると説明している。さらに、同じフランチャイズでも、統制の強いものは統制の弱いものよりも、資産特殊性の高い側に位置づけられている（Williamson，1991，284頁）。したがって、ガバナンス構造の違いは、市場・ハイブリッド・階層組織のいずれを選ぶかという問題だけでなく、同じ形態の中での管理の程度の違いとしても捉えられる。本研究が、配送の担い手との契約形態に加えて、監視・管理の程度に着目するのはこのためである。</w:t>
+        <w:t>本研究にとって重要なのは、同じハイブリッドの中にも管理の程度に差があるという点である。Williamson（1991，p.283）はフランチャイズをハイブリッドの例として挙げ、フランチャイジーは階層組織より大きな自律性をもつ一方で、市場取引と比べると追加的なルールや監視のもとに置かれると説明している。さらに、同じフランチャイズでも、統制の強いものは統制の弱いものよりも、資産特殊性の高い側に位置づけられている（Williamson，1991，p.284）。したがって、ガバナンス構造の違いは、市場・ハイブリッド・階層組織のいずれを選ぶかという問題だけでなく、同じ形態の中での管理の程度の違いとしても捉えられる。本研究が、配送の担い手との契約形態に加えて、監視・管理の程度に着目するのはこのためである。</w:t>
       </w:r>
     </w:p>
     <w:p>
@@ -5379,7 +5379,7 @@
           <w:sz w:val="24"/>
           <w:lang w:eastAsia="ja-JP"/>
         </w:rPr>
-        <w:t>Williamson（1991，287頁）は、既存の定義を用いて、生産、交換、分配の基礎となる政治的・社会的・法的な基本ルールの集合を制度的環境と呼んでいる。そのうえで、制度的環境を、ガバナンス構造の相対的な統治コストを変化させるパラメータ（shift parameters）として位置づけ、財産権、契約法、評判効果、不確実性の四つの変化を検討している。また、市場・ハイブリッド・階層組織の三つを想定すると、市場から階層組織への移行（またはその逆）には大きなパラメータの変化が必要であるのに対し、市場からハイブリッドへ、あるいはハイブリッドから階層組織への移行は、より小さな変化によっても生じうるとしている（同上）。</w:t>
+        <w:t>Williamson（1991，p.287）は、既存の定義を用いて、生産、交換、分配の基礎となる政治的・社会的・法的な基本ルールの集合を制度的環境と呼んでいる。そのうえで、制度的環境を、ガバナンス構造の相対的な統治コストを変化させるパラメータ（shift parameters）として位置づけ、財産権、契約法、評判効果、不確実性の四つの変化を検討している。また、市場・ハイブリッド・階層組織の三つを想定すると、市場から階層組織への移行（またはその逆）には大きなパラメータの変化が必要であるのに対し、市場からハイブリッドへ、あるいはハイブリッドから階層組織への移行は、より小さな変化によっても生じうるとしている（同上）。</w:t>
       </w:r>
     </w:p>
     <w:p>
@@ -5397,7 +5397,7 @@
           <w:sz w:val="24"/>
           <w:lang w:eastAsia="ja-JP"/>
         </w:rPr>
-        <w:t>さらにWilliamson（1991，293-294頁）は、日本企業の雇用、下請、銀行取引の慣行が相互に補完的な関係にあることに触れ、慣行間の結びつきが重要である場合には、個々の慣行だけを他国にそのまま移植しても最適にはならないと指摘している。そのうえで、経済改革への応用にあたっては、資本主義の形態ごとの文脈の違いを明示的に考慮する必要があると述べている（Williamson，1991，294頁）。</w:t>
+        <w:t>さらにWilliamson（1991，pp.293-294）は、日本企業の雇用、下請、銀行取引の慣行が相互に補完的な関係にあることに触れ、慣行間の結びつきが重要である場合には、個々の慣行だけを他国にそのまま移植しても最適にはならないと指摘している。そのうえで、経済改革への応用にあたっては、資本主義の形態ごとの文脈の違いを明示的に考慮する必要があると述べている（Williamson，1991，p.294）。</w:t>
       </w:r>
     </w:p>
     <w:p>
@@ -5507,7 +5507,7 @@
           <w:b w:val="0"/>
           <w:sz w:val="24"/>
         </w:rPr>
-        <w:t>齊藤実（2021）「Eコマース時代におけるアマゾンの物流戦略」『経済貿易研究：研究所年報』神奈川大学経済貿易研究所，47，39-62頁。</w:t>
+        <w:t>齊藤実（2021）「Eコマース時代におけるアマゾンの物流戦略」『経済貿易研究：研究所年報』神奈川大学経済貿易研究所，47，pp.39-62。</w:t>
       </w:r>
     </w:p>
     <w:p>
@@ -5521,7 +5521,7 @@
           <w:b w:val="0"/>
           <w:sz w:val="24"/>
         </w:rPr>
-        <w:t>齊藤実（2022）「第4章　アマゾンのラストマイル配送に関する日米比較」『消費者行動の変化が小型貨物輸送に及ぼす影響に関する研究』日交研シリーズA-840，公益社団法人日本交通政策研究会，44-68頁。</w:t>
+        <w:t>齊藤実（2022）「第4章　アマゾンのラストマイル配送に関する日米比較」『消費者行動の変化が小型貨物輸送に及ぼす影響に関する研究』日交研シリーズA-840，公益社団法人日本交通政策研究会，pp.44-68。</w:t>
       </w:r>
     </w:p>
     <w:p>
@@ -5535,7 +5535,7 @@
           <w:b w:val="0"/>
           <w:sz w:val="24"/>
         </w:rPr>
-        <w:t>齊藤実（2023）「第3章　ネット通販のラストマイル物流における現状と課題」『消費者行動の変化がネット通販物流に及ぼす影響に関する研究』日交研シリーズA-870，公益社団法人日本交通政策研究会，33-50頁。</w:t>
+        <w:t>齊藤実（2023）「第3章　ネット通販のラストマイル物流における現状と課題」『消費者行動の変化がネット通販物流に及ぼす影響に関する研究』日交研シリーズA-870，公益社団法人日本交通政策研究会，pp.33-50。</w:t>
       </w:r>
     </w:p>
     <w:p>
@@ -5549,7 +5549,7 @@
           <w:b w:val="0"/>
           <w:sz w:val="24"/>
         </w:rPr>
-        <w:t>武田巧（2013）「取引費用低下と日本型経済諸制度」『政経論叢』明治大学政治経済研究所，81(3・4)，315-343頁。</w:t>
+        <w:t>武田巧（2013）「取引費用低下と日本型経済諸制度」『政経論叢』明治大学政治経済研究所，81(3・4)，pp.315-343。</w:t>
       </w:r>
     </w:p>
     <w:p>
@@ -5563,7 +5563,7 @@
           <w:b w:val="0"/>
           <w:sz w:val="24"/>
         </w:rPr>
-        <w:t>丁明（2023）「電子商取引におけるフルフィルメントが顧客満足に与える影響―文献レビュー―」『経営学研究論集』明治大学大学院，59，1-16頁。</w:t>
+        <w:t>丁明（2023）「電子商取引におけるフルフィルメントが顧客満足に与える影響―文献レビュー―」『経営学研究論集』明治大学大学院，59，pp.1-16。</w:t>
       </w:r>
     </w:p>
     <w:p>
@@ -5577,7 +5577,7 @@
           <w:b w:val="0"/>
           <w:sz w:val="24"/>
         </w:rPr>
-        <w:t>丁明（2026）「ラストマイル配送における情報品質が顧客満足と再利用意向に与える影響」『流通研究』日本商業学会，29(1)，39-52頁。</w:t>
+        <w:t>丁明（2026）「ラストマイル配送における情報品質が顧客満足と再利用意向に与える影響」『流通研究』日本商業学会，29(1)，pp.39-52。</w:t>
       </w:r>
     </w:p>
     <w:p>
@@ -5591,7 +5591,7 @@
           <w:b w:val="0"/>
           <w:sz w:val="24"/>
         </w:rPr>
-        <w:t>長谷川雅行（2023）「ラストマイル配送における最新の動向」『物流問題研究』74，44-50頁。</w:t>
+        <w:t>長谷川雅行（2023）「ラストマイル配送における最新の動向」『物流問題研究』74，pp.44-50。</w:t>
       </w:r>
     </w:p>
     <w:p>
@@ -5605,7 +5605,7 @@
           <w:b w:val="0"/>
           <w:sz w:val="24"/>
         </w:rPr>
-        <w:t>林克彦（2020）「宅配危機からネット通販物流革新へ」『計画行政』日本計画行政学会，43(2)，9-14頁。</w:t>
+        <w:t>林克彦（2020）「宅配危機からネット通販物流革新へ」『計画行政』日本計画行政学会，43(2)，pp.9-14。</w:t>
       </w:r>
     </w:p>
     <w:p>
@@ -5619,7 +5619,7 @@
           <w:b w:val="0"/>
           <w:sz w:val="24"/>
         </w:rPr>
-        <w:t>林克彦（2023）「第1章　ウィズコロナ期における消費者行動とネット通販物流の変化」『消費者行動の変化がネット通販物流に及ぼす影響に関する研究』日交研シリーズA-870，公益社団法人日本交通政策研究会，1-17頁。</w:t>
+        <w:t>林克彦（2023）「第1章　ウィズコロナ期における消費者行動とネット通販物流の変化」『消費者行動の変化がネット通販物流に及ぼす影響に関する研究』日交研シリーズA-870，公益社団法人日本交通政策研究会，pp.1-17。</w:t>
       </w:r>
     </w:p>
     <w:p>

</xml_diff>